<commit_message>
docs(ux): incorporar wireframes de todas las pantallas
Co-authored-by: Copilot <223556219+Copilot@users.noreply.github.com>
</commit_message>
<xml_diff>
--- a/Sprache/Informe_Frontend_Sprache_APA.docx
+++ b/Sprache/Informe_Frontend_Sprache_APA.docx
@@ -8216,13 +8216,7 @@
         <w:rPr/>
       </w:pPr>
       <w:r>
-        <w:rPr>
-          <w:rFonts w:eastAsia="Times New Roman"/>
-          <w:b w:val="false"/>
-          <w:i w:val="false"/>
-          <w:sz w:val="24"/>
-        </w:rPr>
-        <w:t>En este apartado se incorporarán las imágenes de baja fidelidad que representan la distribución, jerarquía y estructura de cada pantalla. Las imágenes serán agregadas por el equipo.</w:t>
+        <w:t>Los wireframes siguientes representan en baja fidelidad la estructura, jerarquía y distribución de las doce entradas del inventario aprobado. Se basan en los componentes implementados y, cuando corresponde, en los requisitos aprobados. Son esquemas de diseño, no capturas de la aplicación ni evidencia de ejecución. El resumen de sesión se representa como estado final del componente SessionSummary dentro de LessonScreen, no como una ruta independiente.</w:t>
       </w:r>
     </w:p>
     <w:p>
@@ -8239,17 +8233,91 @@
     <w:p>
       <w:pPr>
         <w:pStyle w:val="Normal"/>
+        <w:keepLines/>
         <w:widowControl/>
-        <w:rPr/>
+        <w:spacing w:before="60" w:after="80"/>
+        <w:jc w:val="center"/>
+        <w:rPr/>
+      </w:pPr>
+      <w:r>
+        <w:drawing>
+          <wp:inline xmlns:a="http://schemas.openxmlformats.org/drawingml/2006/main">
+            <wp:extent cx="3063240" cy="5445761"/>
+            <wp:docPr id="1" name="Picture 1" descr="Wireframe de baja fidelidad: Inicio / bienvenida." title="Figura 1. Wireframe de Inicio / bienvenida"/>
+            <wp:cNvGraphicFramePr>
+              <a:graphicFrameLocks noChangeAspect="1"/>
+            </wp:cNvGraphicFramePr>
+            <a:graphic>
+              <a:graphicData uri="http://schemas.openxmlformats.org/drawingml/2006/picture">
+                <pic:pic>
+                  <pic:nvPicPr>
+                    <pic:cNvPr id="0" name="WF-01_StartScreen.png"/>
+                    <pic:cNvPicPr/>
+                  </pic:nvPicPr>
+                  <pic:blipFill>
+                    <a:blip r:embed="rId10"/>
+                    <a:stretch>
+                      <a:fillRect/>
+                    </a:stretch>
+                  </pic:blipFill>
+                  <pic:spPr>
+                    <a:xfrm>
+                      <a:off x="0" y="0"/>
+                      <a:ext cx="3063240" cy="5445761"/>
+                    </a:xfrm>
+                    <a:prstGeom prst="rect"/>
+                  </pic:spPr>
+                </pic:pic>
+              </a:graphicData>
+            </a:graphic>
+          </wp:inline>
+        </w:drawing>
+      </w:r>
+    </w:p>
+    <w:p>
+      <w:pPr>
+        <w:keepNext/>
+        <w:spacing w:before="40" w:after="0"/>
+        <w:jc w:val="left"/>
       </w:pPr>
       <w:r>
         <w:rPr>
-          <w:rFonts w:eastAsia="Times New Roman"/>
-          <w:b w:val="false"/>
+          <w:rFonts w:ascii="Arial" w:hAnsi="Arial"/>
+          <w:b/>
+          <w:sz w:val="22"/>
+        </w:rPr>
+        <w:t>Figura 1</w:t>
+        <w:br/>
+      </w:r>
+      <w:r>
+        <w:rPr>
+          <w:rFonts w:ascii="Arial" w:hAnsi="Arial"/>
           <w:i/>
-          <w:sz w:val="24"/>
+          <w:sz w:val="22"/>
         </w:rPr>
-        <w:t>[INSERTAR AQUÍ EL WIREFRAME DE LA PANTALLA: Inicio / bienvenida]</w:t>
+        <w:t>Wireframe de Inicio / bienvenida</w:t>
+      </w:r>
+    </w:p>
+    <w:p>
+      <w:pPr>
+        <w:keepLines/>
+        <w:spacing w:before="0" w:after="160"/>
+        <w:jc w:val="left"/>
+      </w:pPr>
+      <w:r>
+        <w:rPr>
+          <w:rFonts w:ascii="Arial" w:hAnsi="Arial"/>
+          <w:i/>
+          <w:sz w:val="18"/>
+        </w:rPr>
+        <w:t xml:space="preserve">Nota. </w:t>
+      </w:r>
+      <w:r>
+        <w:rPr>
+          <w:rFonts w:ascii="Arial" w:hAnsi="Arial"/>
+          <w:sz w:val="18"/>
+        </w:rPr>
+        <w:t>Elaboración propia basada en la implementación del frontend y los requisitos aprobados. Esquema de baja fidelidad; no constituye una captura de ejecución.</w:t>
       </w:r>
     </w:p>
     <w:p>
@@ -8282,17 +8350,91 @@
     <w:p>
       <w:pPr>
         <w:pStyle w:val="Normal"/>
+        <w:keepLines/>
         <w:widowControl/>
-        <w:rPr/>
+        <w:spacing w:before="60" w:after="80"/>
+        <w:jc w:val="center"/>
+        <w:rPr/>
+      </w:pPr>
+      <w:r>
+        <w:drawing>
+          <wp:inline xmlns:a="http://schemas.openxmlformats.org/drawingml/2006/main">
+            <wp:extent cx="3063240" cy="5445761"/>
+            <wp:docPr id="2" name="Picture 2" descr="Wireframe de baja fidelidad: Registro." title="Figura 2. Wireframe de Registro"/>
+            <wp:cNvGraphicFramePr>
+              <a:graphicFrameLocks noChangeAspect="1"/>
+            </wp:cNvGraphicFramePr>
+            <a:graphic>
+              <a:graphicData uri="http://schemas.openxmlformats.org/drawingml/2006/picture">
+                <pic:pic>
+                  <pic:nvPicPr>
+                    <pic:cNvPr id="0" name="WF-02_RegisterScreen.png"/>
+                    <pic:cNvPicPr/>
+                  </pic:nvPicPr>
+                  <pic:blipFill>
+                    <a:blip r:embed="rId11"/>
+                    <a:stretch>
+                      <a:fillRect/>
+                    </a:stretch>
+                  </pic:blipFill>
+                  <pic:spPr>
+                    <a:xfrm>
+                      <a:off x="0" y="0"/>
+                      <a:ext cx="3063240" cy="5445761"/>
+                    </a:xfrm>
+                    <a:prstGeom prst="rect"/>
+                  </pic:spPr>
+                </pic:pic>
+              </a:graphicData>
+            </a:graphic>
+          </wp:inline>
+        </w:drawing>
+      </w:r>
+    </w:p>
+    <w:p>
+      <w:pPr>
+        <w:keepNext/>
+        <w:spacing w:before="40" w:after="0"/>
+        <w:jc w:val="left"/>
       </w:pPr>
       <w:r>
         <w:rPr>
-          <w:rFonts w:eastAsia="Times New Roman"/>
-          <w:b w:val="false"/>
+          <w:rFonts w:ascii="Arial" w:hAnsi="Arial"/>
+          <w:b/>
+          <w:sz w:val="22"/>
+        </w:rPr>
+        <w:t>Figura 2</w:t>
+        <w:br/>
+      </w:r>
+      <w:r>
+        <w:rPr>
+          <w:rFonts w:ascii="Arial" w:hAnsi="Arial"/>
           <w:i/>
-          <w:sz w:val="24"/>
+          <w:sz w:val="22"/>
         </w:rPr>
-        <w:t>[INSERTAR AQUÍ EL WIREFRAME DE LA PANTALLA: Registro]</w:t>
+        <w:t>Wireframe de Registro</w:t>
+      </w:r>
+    </w:p>
+    <w:p>
+      <w:pPr>
+        <w:keepLines/>
+        <w:spacing w:before="0" w:after="160"/>
+        <w:jc w:val="left"/>
+      </w:pPr>
+      <w:r>
+        <w:rPr>
+          <w:rFonts w:ascii="Arial" w:hAnsi="Arial"/>
+          <w:i/>
+          <w:sz w:val="18"/>
+        </w:rPr>
+        <w:t xml:space="preserve">Nota. </w:t>
+      </w:r>
+      <w:r>
+        <w:rPr>
+          <w:rFonts w:ascii="Arial" w:hAnsi="Arial"/>
+          <w:sz w:val="18"/>
+        </w:rPr>
+        <w:t>Elaboración propia basada en la implementación del frontend y los requisitos aprobados. Esquema de baja fidelidad; no constituye una captura de ejecución.</w:t>
       </w:r>
     </w:p>
     <w:p>
@@ -8325,17 +8467,91 @@
     <w:p>
       <w:pPr>
         <w:pStyle w:val="Normal"/>
+        <w:keepLines/>
         <w:widowControl/>
-        <w:rPr/>
+        <w:spacing w:before="60" w:after="80"/>
+        <w:jc w:val="center"/>
+        <w:rPr/>
+      </w:pPr>
+      <w:r>
+        <w:drawing>
+          <wp:inline xmlns:a="http://schemas.openxmlformats.org/drawingml/2006/main">
+            <wp:extent cx="3063240" cy="5445761"/>
+            <wp:docPr id="3" name="Picture 3" descr="Wireframe de baja fidelidad: Inicio de sesión." title="Figura 3. Wireframe de Inicio de sesión"/>
+            <wp:cNvGraphicFramePr>
+              <a:graphicFrameLocks noChangeAspect="1"/>
+            </wp:cNvGraphicFramePr>
+            <a:graphic>
+              <a:graphicData uri="http://schemas.openxmlformats.org/drawingml/2006/picture">
+                <pic:pic>
+                  <pic:nvPicPr>
+                    <pic:cNvPr id="0" name="WF-03_LoginScreen.png"/>
+                    <pic:cNvPicPr/>
+                  </pic:nvPicPr>
+                  <pic:blipFill>
+                    <a:blip r:embed="rId12"/>
+                    <a:stretch>
+                      <a:fillRect/>
+                    </a:stretch>
+                  </pic:blipFill>
+                  <pic:spPr>
+                    <a:xfrm>
+                      <a:off x="0" y="0"/>
+                      <a:ext cx="3063240" cy="5445761"/>
+                    </a:xfrm>
+                    <a:prstGeom prst="rect"/>
+                  </pic:spPr>
+                </pic:pic>
+              </a:graphicData>
+            </a:graphic>
+          </wp:inline>
+        </w:drawing>
+      </w:r>
+    </w:p>
+    <w:p>
+      <w:pPr>
+        <w:keepNext/>
+        <w:spacing w:before="40" w:after="0"/>
+        <w:jc w:val="left"/>
       </w:pPr>
       <w:r>
         <w:rPr>
-          <w:rFonts w:eastAsia="Times New Roman"/>
-          <w:b w:val="false"/>
+          <w:rFonts w:ascii="Arial" w:hAnsi="Arial"/>
+          <w:b/>
+          <w:sz w:val="22"/>
+        </w:rPr>
+        <w:t>Figura 3</w:t>
+        <w:br/>
+      </w:r>
+      <w:r>
+        <w:rPr>
+          <w:rFonts w:ascii="Arial" w:hAnsi="Arial"/>
           <w:i/>
-          <w:sz w:val="24"/>
+          <w:sz w:val="22"/>
         </w:rPr>
-        <w:t>[INSERTAR AQUÍ EL WIREFRAME DE LA PANTALLA: Inicio de sesión]</w:t>
+        <w:t>Wireframe de Inicio de sesión</w:t>
+      </w:r>
+    </w:p>
+    <w:p>
+      <w:pPr>
+        <w:keepLines/>
+        <w:spacing w:before="0" w:after="160"/>
+        <w:jc w:val="left"/>
+      </w:pPr>
+      <w:r>
+        <w:rPr>
+          <w:rFonts w:ascii="Arial" w:hAnsi="Arial"/>
+          <w:i/>
+          <w:sz w:val="18"/>
+        </w:rPr>
+        <w:t xml:space="preserve">Nota. </w:t>
+      </w:r>
+      <w:r>
+        <w:rPr>
+          <w:rFonts w:ascii="Arial" w:hAnsi="Arial"/>
+          <w:sz w:val="18"/>
+        </w:rPr>
+        <w:t>Elaboración propia basada en la implementación del frontend y los requisitos aprobados. Esquema de baja fidelidad; no constituye una captura de ejecución.</w:t>
       </w:r>
     </w:p>
     <w:p>
@@ -8368,17 +8584,91 @@
     <w:p>
       <w:pPr>
         <w:pStyle w:val="Normal"/>
+        <w:keepLines/>
         <w:widowControl/>
-        <w:rPr/>
+        <w:spacing w:before="60" w:after="80"/>
+        <w:jc w:val="center"/>
+        <w:rPr/>
+      </w:pPr>
+      <w:r>
+        <w:drawing>
+          <wp:inline xmlns:a="http://schemas.openxmlformats.org/drawingml/2006/main">
+            <wp:extent cx="3063240" cy="5445761"/>
+            <wp:docPr id="4" name="Picture 4" descr="Wireframe de baja fidelidad: Inicio." title="Figura 4. Wireframe de Inicio"/>
+            <wp:cNvGraphicFramePr>
+              <a:graphicFrameLocks noChangeAspect="1"/>
+            </wp:cNvGraphicFramePr>
+            <a:graphic>
+              <a:graphicData uri="http://schemas.openxmlformats.org/drawingml/2006/picture">
+                <pic:pic>
+                  <pic:nvPicPr>
+                    <pic:cNvPr id="0" name="WF-04_HomeScreen.png"/>
+                    <pic:cNvPicPr/>
+                  </pic:nvPicPr>
+                  <pic:blipFill>
+                    <a:blip r:embed="rId13"/>
+                    <a:stretch>
+                      <a:fillRect/>
+                    </a:stretch>
+                  </pic:blipFill>
+                  <pic:spPr>
+                    <a:xfrm>
+                      <a:off x="0" y="0"/>
+                      <a:ext cx="3063240" cy="5445761"/>
+                    </a:xfrm>
+                    <a:prstGeom prst="rect"/>
+                  </pic:spPr>
+                </pic:pic>
+              </a:graphicData>
+            </a:graphic>
+          </wp:inline>
+        </w:drawing>
+      </w:r>
+    </w:p>
+    <w:p>
+      <w:pPr>
+        <w:keepNext/>
+        <w:spacing w:before="40" w:after="0"/>
+        <w:jc w:val="left"/>
       </w:pPr>
       <w:r>
         <w:rPr>
-          <w:rFonts w:eastAsia="Times New Roman"/>
-          <w:b w:val="false"/>
+          <w:rFonts w:ascii="Arial" w:hAnsi="Arial"/>
+          <w:b/>
+          <w:sz w:val="22"/>
+        </w:rPr>
+        <w:t>Figura 4</w:t>
+        <w:br/>
+      </w:r>
+      <w:r>
+        <w:rPr>
+          <w:rFonts w:ascii="Arial" w:hAnsi="Arial"/>
           <w:i/>
-          <w:sz w:val="24"/>
+          <w:sz w:val="22"/>
         </w:rPr>
-        <w:t>[INSERTAR AQUÍ EL WIREFRAME DE LA PANTALLA: Inicio]</w:t>
+        <w:t>Wireframe de Inicio</w:t>
+      </w:r>
+    </w:p>
+    <w:p>
+      <w:pPr>
+        <w:keepLines/>
+        <w:spacing w:before="0" w:after="160"/>
+        <w:jc w:val="left"/>
+      </w:pPr>
+      <w:r>
+        <w:rPr>
+          <w:rFonts w:ascii="Arial" w:hAnsi="Arial"/>
+          <w:i/>
+          <w:sz w:val="18"/>
+        </w:rPr>
+        <w:t xml:space="preserve">Nota. </w:t>
+      </w:r>
+      <w:r>
+        <w:rPr>
+          <w:rFonts w:ascii="Arial" w:hAnsi="Arial"/>
+          <w:sz w:val="18"/>
+        </w:rPr>
+        <w:t>Elaboración propia basada en la implementación del frontend y los requisitos aprobados. Esquema de baja fidelidad; no constituye una captura de ejecución.</w:t>
       </w:r>
     </w:p>
     <w:p>
@@ -8411,17 +8701,91 @@
     <w:p>
       <w:pPr>
         <w:pStyle w:val="Normal"/>
+        <w:keepLines/>
         <w:widowControl/>
-        <w:rPr/>
+        <w:spacing w:before="60" w:after="80"/>
+        <w:jc w:val="center"/>
+        <w:rPr/>
+      </w:pPr>
+      <w:r>
+        <w:drawing>
+          <wp:inline xmlns:a="http://schemas.openxmlformats.org/drawingml/2006/main">
+            <wp:extent cx="3063240" cy="5445761"/>
+            <wp:docPr id="5" name="Picture 5" descr="Wireframe de baja fidelidad: Actividades." title="Figura 5. Wireframe de Actividades"/>
+            <wp:cNvGraphicFramePr>
+              <a:graphicFrameLocks noChangeAspect="1"/>
+            </wp:cNvGraphicFramePr>
+            <a:graphic>
+              <a:graphicData uri="http://schemas.openxmlformats.org/drawingml/2006/picture">
+                <pic:pic>
+                  <pic:nvPicPr>
+                    <pic:cNvPr id="0" name="WF-05_ActivitiesScreen.png"/>
+                    <pic:cNvPicPr/>
+                  </pic:nvPicPr>
+                  <pic:blipFill>
+                    <a:blip r:embed="rId14"/>
+                    <a:stretch>
+                      <a:fillRect/>
+                    </a:stretch>
+                  </pic:blipFill>
+                  <pic:spPr>
+                    <a:xfrm>
+                      <a:off x="0" y="0"/>
+                      <a:ext cx="3063240" cy="5445761"/>
+                    </a:xfrm>
+                    <a:prstGeom prst="rect"/>
+                  </pic:spPr>
+                </pic:pic>
+              </a:graphicData>
+            </a:graphic>
+          </wp:inline>
+        </w:drawing>
+      </w:r>
+    </w:p>
+    <w:p>
+      <w:pPr>
+        <w:keepNext/>
+        <w:spacing w:before="40" w:after="0"/>
+        <w:jc w:val="left"/>
       </w:pPr>
       <w:r>
         <w:rPr>
-          <w:rFonts w:eastAsia="Times New Roman"/>
-          <w:b w:val="false"/>
+          <w:rFonts w:ascii="Arial" w:hAnsi="Arial"/>
+          <w:b/>
+          <w:sz w:val="22"/>
+        </w:rPr>
+        <w:t>Figura 5</w:t>
+        <w:br/>
+      </w:r>
+      <w:r>
+        <w:rPr>
+          <w:rFonts w:ascii="Arial" w:hAnsi="Arial"/>
           <w:i/>
-          <w:sz w:val="24"/>
+          <w:sz w:val="22"/>
         </w:rPr>
-        <w:t>[INSERTAR AQUÍ EL WIREFRAME DE LA PANTALLA: Actividades]</w:t>
+        <w:t>Wireframe de Actividades</w:t>
+      </w:r>
+    </w:p>
+    <w:p>
+      <w:pPr>
+        <w:keepLines/>
+        <w:spacing w:before="0" w:after="160"/>
+        <w:jc w:val="left"/>
+      </w:pPr>
+      <w:r>
+        <w:rPr>
+          <w:rFonts w:ascii="Arial" w:hAnsi="Arial"/>
+          <w:i/>
+          <w:sz w:val="18"/>
+        </w:rPr>
+        <w:t xml:space="preserve">Nota. </w:t>
+      </w:r>
+      <w:r>
+        <w:rPr>
+          <w:rFonts w:ascii="Arial" w:hAnsi="Arial"/>
+          <w:sz w:val="18"/>
+        </w:rPr>
+        <w:t>Elaboración propia basada en la implementación del frontend y los requisitos aprobados. Esquema de baja fidelidad; no constituye una captura de ejecución.</w:t>
       </w:r>
     </w:p>
     <w:p>
@@ -8454,17 +8818,91 @@
     <w:p>
       <w:pPr>
         <w:pStyle w:val="Normal"/>
+        <w:keepLines/>
         <w:widowControl/>
-        <w:rPr/>
+        <w:spacing w:before="60" w:after="80"/>
+        <w:jc w:val="center"/>
+        <w:rPr/>
+      </w:pPr>
+      <w:r>
+        <w:drawing>
+          <wp:inline xmlns:a="http://schemas.openxmlformats.org/drawingml/2006/main">
+            <wp:extent cx="3063240" cy="5445761"/>
+            <wp:docPr id="6" name="Picture 6" descr="Wireframe de baja fidelidad: Progreso." title="Figura 6. Wireframe de Progreso"/>
+            <wp:cNvGraphicFramePr>
+              <a:graphicFrameLocks noChangeAspect="1"/>
+            </wp:cNvGraphicFramePr>
+            <a:graphic>
+              <a:graphicData uri="http://schemas.openxmlformats.org/drawingml/2006/picture">
+                <pic:pic>
+                  <pic:nvPicPr>
+                    <pic:cNvPr id="0" name="WF-06_ProgressScreen.png"/>
+                    <pic:cNvPicPr/>
+                  </pic:nvPicPr>
+                  <pic:blipFill>
+                    <a:blip r:embed="rId15"/>
+                    <a:stretch>
+                      <a:fillRect/>
+                    </a:stretch>
+                  </pic:blipFill>
+                  <pic:spPr>
+                    <a:xfrm>
+                      <a:off x="0" y="0"/>
+                      <a:ext cx="3063240" cy="5445761"/>
+                    </a:xfrm>
+                    <a:prstGeom prst="rect"/>
+                  </pic:spPr>
+                </pic:pic>
+              </a:graphicData>
+            </a:graphic>
+          </wp:inline>
+        </w:drawing>
+      </w:r>
+    </w:p>
+    <w:p>
+      <w:pPr>
+        <w:keepNext/>
+        <w:spacing w:before="40" w:after="0"/>
+        <w:jc w:val="left"/>
       </w:pPr>
       <w:r>
         <w:rPr>
-          <w:rFonts w:eastAsia="Times New Roman"/>
-          <w:b w:val="false"/>
+          <w:rFonts w:ascii="Arial" w:hAnsi="Arial"/>
+          <w:b/>
+          <w:sz w:val="22"/>
+        </w:rPr>
+        <w:t>Figura 6</w:t>
+        <w:br/>
+      </w:r>
+      <w:r>
+        <w:rPr>
+          <w:rFonts w:ascii="Arial" w:hAnsi="Arial"/>
           <w:i/>
-          <w:sz w:val="24"/>
+          <w:sz w:val="22"/>
         </w:rPr>
-        <w:t>[INSERTAR AQUÍ EL WIREFRAME DE LA PANTALLA: Progreso]</w:t>
+        <w:t>Wireframe de Progreso</w:t>
+      </w:r>
+    </w:p>
+    <w:p>
+      <w:pPr>
+        <w:keepLines/>
+        <w:spacing w:before="0" w:after="160"/>
+        <w:jc w:val="left"/>
+      </w:pPr>
+      <w:r>
+        <w:rPr>
+          <w:rFonts w:ascii="Arial" w:hAnsi="Arial"/>
+          <w:i/>
+          <w:sz w:val="18"/>
+        </w:rPr>
+        <w:t xml:space="preserve">Nota. </w:t>
+      </w:r>
+      <w:r>
+        <w:rPr>
+          <w:rFonts w:ascii="Arial" w:hAnsi="Arial"/>
+          <w:sz w:val="18"/>
+        </w:rPr>
+        <w:t>Elaboración propia basada en la implementación del frontend y los requisitos aprobados. Esquema de baja fidelidad; no constituye una captura de ejecución.</w:t>
       </w:r>
     </w:p>
     <w:p>
@@ -8497,17 +8935,91 @@
     <w:p>
       <w:pPr>
         <w:pStyle w:val="Normal"/>
+        <w:keepLines/>
         <w:widowControl/>
-        <w:rPr/>
+        <w:spacing w:before="60" w:after="80"/>
+        <w:jc w:val="center"/>
+        <w:rPr/>
+      </w:pPr>
+      <w:r>
+        <w:drawing>
+          <wp:inline xmlns:a="http://schemas.openxmlformats.org/drawingml/2006/main">
+            <wp:extent cx="3063240" cy="5445761"/>
+            <wp:docPr id="7" name="Picture 7" descr="Wireframe de baja fidelidad: Perfil." title="Figura 7. Wireframe de Perfil"/>
+            <wp:cNvGraphicFramePr>
+              <a:graphicFrameLocks noChangeAspect="1"/>
+            </wp:cNvGraphicFramePr>
+            <a:graphic>
+              <a:graphicData uri="http://schemas.openxmlformats.org/drawingml/2006/picture">
+                <pic:pic>
+                  <pic:nvPicPr>
+                    <pic:cNvPr id="0" name="WF-07_ProfileScreen.png"/>
+                    <pic:cNvPicPr/>
+                  </pic:nvPicPr>
+                  <pic:blipFill>
+                    <a:blip r:embed="rId16"/>
+                    <a:stretch>
+                      <a:fillRect/>
+                    </a:stretch>
+                  </pic:blipFill>
+                  <pic:spPr>
+                    <a:xfrm>
+                      <a:off x="0" y="0"/>
+                      <a:ext cx="3063240" cy="5445761"/>
+                    </a:xfrm>
+                    <a:prstGeom prst="rect"/>
+                  </pic:spPr>
+                </pic:pic>
+              </a:graphicData>
+            </a:graphic>
+          </wp:inline>
+        </w:drawing>
+      </w:r>
+    </w:p>
+    <w:p>
+      <w:pPr>
+        <w:keepNext/>
+        <w:spacing w:before="40" w:after="0"/>
+        <w:jc w:val="left"/>
       </w:pPr>
       <w:r>
         <w:rPr>
-          <w:rFonts w:eastAsia="Times New Roman"/>
-          <w:b w:val="false"/>
+          <w:rFonts w:ascii="Arial" w:hAnsi="Arial"/>
+          <w:b/>
+          <w:sz w:val="22"/>
+        </w:rPr>
+        <w:t>Figura 7</w:t>
+        <w:br/>
+      </w:r>
+      <w:r>
+        <w:rPr>
+          <w:rFonts w:ascii="Arial" w:hAnsi="Arial"/>
           <w:i/>
-          <w:sz w:val="24"/>
+          <w:sz w:val="22"/>
         </w:rPr>
-        <w:t>[INSERTAR AQUÍ EL WIREFRAME DE LA PANTALLA: Perfil]</w:t>
+        <w:t>Wireframe de Perfil</w:t>
+      </w:r>
+    </w:p>
+    <w:p>
+      <w:pPr>
+        <w:keepLines/>
+        <w:spacing w:before="0" w:after="160"/>
+        <w:jc w:val="left"/>
+      </w:pPr>
+      <w:r>
+        <w:rPr>
+          <w:rFonts w:ascii="Arial" w:hAnsi="Arial"/>
+          <w:i/>
+          <w:sz w:val="18"/>
+        </w:rPr>
+        <w:t xml:space="preserve">Nota. </w:t>
+      </w:r>
+      <w:r>
+        <w:rPr>
+          <w:rFonts w:ascii="Arial" w:hAnsi="Arial"/>
+          <w:sz w:val="18"/>
+        </w:rPr>
+        <w:t>Elaboración propia basada en la implementación del frontend y los requisitos aprobados. Esquema de baja fidelidad; no constituye una captura de ejecución.</w:t>
       </w:r>
     </w:p>
     <w:p>
@@ -8540,17 +9052,91 @@
     <w:p>
       <w:pPr>
         <w:pStyle w:val="Normal"/>
+        <w:keepLines/>
         <w:widowControl/>
-        <w:rPr/>
+        <w:spacing w:before="60" w:after="80"/>
+        <w:jc w:val="center"/>
+        <w:rPr/>
+      </w:pPr>
+      <w:r>
+        <w:drawing>
+          <wp:inline xmlns:a="http://schemas.openxmlformats.org/drawingml/2006/main">
+            <wp:extent cx="3063240" cy="5445761"/>
+            <wp:docPr id="8" name="Picture 8" descr="Wireframe de baja fidelidad: Lección." title="Figura 8. Wireframe de Lección"/>
+            <wp:cNvGraphicFramePr>
+              <a:graphicFrameLocks noChangeAspect="1"/>
+            </wp:cNvGraphicFramePr>
+            <a:graphic>
+              <a:graphicData uri="http://schemas.openxmlformats.org/drawingml/2006/picture">
+                <pic:pic>
+                  <pic:nvPicPr>
+                    <pic:cNvPr id="0" name="WF-08_LessonScreen.png"/>
+                    <pic:cNvPicPr/>
+                  </pic:nvPicPr>
+                  <pic:blipFill>
+                    <a:blip r:embed="rId17"/>
+                    <a:stretch>
+                      <a:fillRect/>
+                    </a:stretch>
+                  </pic:blipFill>
+                  <pic:spPr>
+                    <a:xfrm>
+                      <a:off x="0" y="0"/>
+                      <a:ext cx="3063240" cy="5445761"/>
+                    </a:xfrm>
+                    <a:prstGeom prst="rect"/>
+                  </pic:spPr>
+                </pic:pic>
+              </a:graphicData>
+            </a:graphic>
+          </wp:inline>
+        </w:drawing>
+      </w:r>
+    </w:p>
+    <w:p>
+      <w:pPr>
+        <w:keepNext/>
+        <w:spacing w:before="40" w:after="0"/>
+        <w:jc w:val="left"/>
       </w:pPr>
       <w:r>
         <w:rPr>
-          <w:rFonts w:eastAsia="Times New Roman"/>
-          <w:b w:val="false"/>
+          <w:rFonts w:ascii="Arial" w:hAnsi="Arial"/>
+          <w:b/>
+          <w:sz w:val="22"/>
+        </w:rPr>
+        <w:t>Figura 8</w:t>
+        <w:br/>
+      </w:r>
+      <w:r>
+        <w:rPr>
+          <w:rFonts w:ascii="Arial" w:hAnsi="Arial"/>
           <w:i/>
-          <w:sz w:val="24"/>
+          <w:sz w:val="22"/>
         </w:rPr>
-        <w:t>[INSERTAR AQUÍ EL WIREFRAME DE LA PANTALLA: Lección]</w:t>
+        <w:t>Wireframe de Lección</w:t>
+      </w:r>
+    </w:p>
+    <w:p>
+      <w:pPr>
+        <w:keepLines/>
+        <w:spacing w:before="0" w:after="160"/>
+        <w:jc w:val="left"/>
+      </w:pPr>
+      <w:r>
+        <w:rPr>
+          <w:rFonts w:ascii="Arial" w:hAnsi="Arial"/>
+          <w:i/>
+          <w:sz w:val="18"/>
+        </w:rPr>
+        <w:t xml:space="preserve">Nota. </w:t>
+      </w:r>
+      <w:r>
+        <w:rPr>
+          <w:rFonts w:ascii="Arial" w:hAnsi="Arial"/>
+          <w:sz w:val="18"/>
+        </w:rPr>
+        <w:t>Elaboración propia basada en la implementación del frontend y los requisitos aprobados. Esquema de baja fidelidad; no constituye una captura de ejecución.</w:t>
       </w:r>
     </w:p>
     <w:p>
@@ -8583,17 +9169,98 @@
     <w:p>
       <w:pPr>
         <w:pStyle w:val="Normal"/>
+        <w:keepLines/>
         <w:widowControl/>
-        <w:rPr/>
+        <w:spacing w:before="60" w:after="80"/>
+        <w:jc w:val="center"/>
+        <w:rPr/>
+      </w:pPr>
+      <w:r>
+        <w:drawing>
+          <wp:inline xmlns:a="http://schemas.openxmlformats.org/drawingml/2006/main">
+            <wp:extent cx="3063240" cy="5445761"/>
+            <wp:docPr id="9" name="Picture 9" descr="Wireframe de baja fidelidad: Resumen de sesión." title="Figura 9. Wireframe de Resumen de sesión (componente final de LessonScreen)"/>
+            <wp:cNvGraphicFramePr>
+              <a:graphicFrameLocks noChangeAspect="1"/>
+            </wp:cNvGraphicFramePr>
+            <a:graphic>
+              <a:graphicData uri="http://schemas.openxmlformats.org/drawingml/2006/picture">
+                <pic:pic>
+                  <pic:nvPicPr>
+                    <pic:cNvPr id="0" name="WF-09_SessionSummary.png"/>
+                    <pic:cNvPicPr/>
+                  </pic:nvPicPr>
+                  <pic:blipFill>
+                    <a:blip r:embed="rId18"/>
+                    <a:stretch>
+                      <a:fillRect/>
+                    </a:stretch>
+                  </pic:blipFill>
+                  <pic:spPr>
+                    <a:xfrm>
+                      <a:off x="0" y="0"/>
+                      <a:ext cx="3063240" cy="5445761"/>
+                    </a:xfrm>
+                    <a:prstGeom prst="rect"/>
+                  </pic:spPr>
+                </pic:pic>
+              </a:graphicData>
+            </a:graphic>
+          </wp:inline>
+        </w:drawing>
+      </w:r>
+    </w:p>
+    <w:p>
+      <w:pPr>
+        <w:keepNext/>
+        <w:spacing w:before="40" w:after="0"/>
+        <w:jc w:val="left"/>
       </w:pPr>
       <w:r>
         <w:rPr>
-          <w:rFonts w:eastAsia="Times New Roman"/>
-          <w:b w:val="false"/>
+          <w:rFonts w:ascii="Arial" w:hAnsi="Arial"/>
+          <w:b/>
+          <w:sz w:val="22"/>
+        </w:rPr>
+        <w:t>Figura 9</w:t>
+        <w:br/>
+      </w:r>
+      <w:r>
+        <w:rPr>
+          <w:rFonts w:ascii="Arial" w:hAnsi="Arial"/>
           <w:i/>
-          <w:sz w:val="24"/>
+          <w:sz w:val="22"/>
         </w:rPr>
-        <w:t>[INSERTAR AQUÍ EL WIREFRAME DE LA PANTALLA: Resumen de sesión]</w:t>
+        <w:t>Wireframe de Resumen de sesión (componente final de LessonScreen)</w:t>
+      </w:r>
+    </w:p>
+    <w:p>
+      <w:pPr>
+        <w:keepLines/>
+        <w:spacing w:before="0" w:after="160"/>
+        <w:jc w:val="left"/>
+      </w:pPr>
+      <w:r>
+        <w:rPr>
+          <w:rFonts w:ascii="Arial" w:hAnsi="Arial"/>
+          <w:i/>
+          <w:sz w:val="18"/>
+        </w:rPr>
+        <w:t xml:space="preserve">Nota. </w:t>
+      </w:r>
+      <w:r>
+        <w:rPr>
+          <w:rFonts w:ascii="Arial" w:hAnsi="Arial"/>
+          <w:sz w:val="18"/>
+        </w:rPr>
+        <w:t>Elaboración propia basada en la implementación del frontend y los requisitos aprobados. Esquema de baja fidelidad; no constituye una captura de ejecución.</w:t>
+      </w:r>
+      <w:r>
+        <w:rPr>
+          <w:rFonts w:ascii="Arial" w:hAnsi="Arial"/>
+          <w:sz w:val="18"/>
+        </w:rPr>
+        <w:t xml:space="preserve"> El componente se muestra en el estado final de LessonScreen; no representa una ruta independiente.</w:t>
       </w:r>
     </w:p>
     <w:p>
@@ -8626,17 +9293,91 @@
     <w:p>
       <w:pPr>
         <w:pStyle w:val="Normal"/>
+        <w:keepLines/>
         <w:widowControl/>
-        <w:rPr/>
+        <w:spacing w:before="60" w:after="80"/>
+        <w:jc w:val="center"/>
+        <w:rPr/>
+      </w:pPr>
+      <w:r>
+        <w:drawing>
+          <wp:inline xmlns:a="http://schemas.openxmlformats.org/drawingml/2006/main">
+            <wp:extent cx="3063240" cy="5445761"/>
+            <wp:docPr id="10" name="Picture 10" descr="Wireframe de baja fidelidad: Lecturas." title="Figura 10. Wireframe de Lecturas"/>
+            <wp:cNvGraphicFramePr>
+              <a:graphicFrameLocks noChangeAspect="1"/>
+            </wp:cNvGraphicFramePr>
+            <a:graphic>
+              <a:graphicData uri="http://schemas.openxmlformats.org/drawingml/2006/picture">
+                <pic:pic>
+                  <pic:nvPicPr>
+                    <pic:cNvPr id="0" name="WF-10_ReadingScreen.png"/>
+                    <pic:cNvPicPr/>
+                  </pic:nvPicPr>
+                  <pic:blipFill>
+                    <a:blip r:embed="rId19"/>
+                    <a:stretch>
+                      <a:fillRect/>
+                    </a:stretch>
+                  </pic:blipFill>
+                  <pic:spPr>
+                    <a:xfrm>
+                      <a:off x="0" y="0"/>
+                      <a:ext cx="3063240" cy="5445761"/>
+                    </a:xfrm>
+                    <a:prstGeom prst="rect"/>
+                  </pic:spPr>
+                </pic:pic>
+              </a:graphicData>
+            </a:graphic>
+          </wp:inline>
+        </w:drawing>
+      </w:r>
+    </w:p>
+    <w:p>
+      <w:pPr>
+        <w:keepNext/>
+        <w:spacing w:before="40" w:after="0"/>
+        <w:jc w:val="left"/>
       </w:pPr>
       <w:r>
         <w:rPr>
-          <w:rFonts w:eastAsia="Times New Roman"/>
-          <w:b w:val="false"/>
+          <w:rFonts w:ascii="Arial" w:hAnsi="Arial"/>
+          <w:b/>
+          <w:sz w:val="22"/>
+        </w:rPr>
+        <w:t>Figura 10</w:t>
+        <w:br/>
+      </w:r>
+      <w:r>
+        <w:rPr>
+          <w:rFonts w:ascii="Arial" w:hAnsi="Arial"/>
           <w:i/>
-          <w:sz w:val="24"/>
+          <w:sz w:val="22"/>
         </w:rPr>
-        <w:t>[INSERTAR AQUÍ EL WIREFRAME DE LA PANTALLA: Lecturas]</w:t>
+        <w:t>Wireframe de Lecturas</w:t>
+      </w:r>
+    </w:p>
+    <w:p>
+      <w:pPr>
+        <w:keepLines/>
+        <w:spacing w:before="0" w:after="160"/>
+        <w:jc w:val="left"/>
+      </w:pPr>
+      <w:r>
+        <w:rPr>
+          <w:rFonts w:ascii="Arial" w:hAnsi="Arial"/>
+          <w:i/>
+          <w:sz w:val="18"/>
+        </w:rPr>
+        <w:t xml:space="preserve">Nota. </w:t>
+      </w:r>
+      <w:r>
+        <w:rPr>
+          <w:rFonts w:ascii="Arial" w:hAnsi="Arial"/>
+          <w:sz w:val="18"/>
+        </w:rPr>
+        <w:t>Elaboración propia basada en la implementación del frontend y los requisitos aprobados. Esquema de baja fidelidad; no constituye una captura de ejecución.</w:t>
       </w:r>
     </w:p>
     <w:p>
@@ -8669,17 +9410,91 @@
     <w:p>
       <w:pPr>
         <w:pStyle w:val="Normal"/>
+        <w:keepLines/>
         <w:widowControl/>
-        <w:rPr/>
+        <w:spacing w:before="60" w:after="80"/>
+        <w:jc w:val="center"/>
+        <w:rPr/>
+      </w:pPr>
+      <w:r>
+        <w:drawing>
+          <wp:inline xmlns:a="http://schemas.openxmlformats.org/drawingml/2006/main">
+            <wp:extent cx="3063240" cy="5445761"/>
+            <wp:docPr id="11" name="Picture 11" descr="Wireframe de baja fidelidad: Teoría." title="Figura 11. Wireframe de Teoría"/>
+            <wp:cNvGraphicFramePr>
+              <a:graphicFrameLocks noChangeAspect="1"/>
+            </wp:cNvGraphicFramePr>
+            <a:graphic>
+              <a:graphicData uri="http://schemas.openxmlformats.org/drawingml/2006/picture">
+                <pic:pic>
+                  <pic:nvPicPr>
+                    <pic:cNvPr id="0" name="WF-11_TheoryScreen.png"/>
+                    <pic:cNvPicPr/>
+                  </pic:nvPicPr>
+                  <pic:blipFill>
+                    <a:blip r:embed="rId20"/>
+                    <a:stretch>
+                      <a:fillRect/>
+                    </a:stretch>
+                  </pic:blipFill>
+                  <pic:spPr>
+                    <a:xfrm>
+                      <a:off x="0" y="0"/>
+                      <a:ext cx="3063240" cy="5445761"/>
+                    </a:xfrm>
+                    <a:prstGeom prst="rect"/>
+                  </pic:spPr>
+                </pic:pic>
+              </a:graphicData>
+            </a:graphic>
+          </wp:inline>
+        </w:drawing>
+      </w:r>
+    </w:p>
+    <w:p>
+      <w:pPr>
+        <w:keepNext/>
+        <w:spacing w:before="40" w:after="0"/>
+        <w:jc w:val="left"/>
       </w:pPr>
       <w:r>
         <w:rPr>
-          <w:rFonts w:eastAsia="Times New Roman"/>
-          <w:b w:val="false"/>
+          <w:rFonts w:ascii="Arial" w:hAnsi="Arial"/>
+          <w:b/>
+          <w:sz w:val="22"/>
+        </w:rPr>
+        <w:t>Figura 11</w:t>
+        <w:br/>
+      </w:r>
+      <w:r>
+        <w:rPr>
+          <w:rFonts w:ascii="Arial" w:hAnsi="Arial"/>
           <w:i/>
-          <w:sz w:val="24"/>
+          <w:sz w:val="22"/>
         </w:rPr>
-        <w:t>[INSERTAR AQUÍ EL WIREFRAME DE LA PANTALLA: Teoría]</w:t>
+        <w:t>Wireframe de Teoría</w:t>
+      </w:r>
+    </w:p>
+    <w:p>
+      <w:pPr>
+        <w:keepLines/>
+        <w:spacing w:before="0" w:after="160"/>
+        <w:jc w:val="left"/>
+      </w:pPr>
+      <w:r>
+        <w:rPr>
+          <w:rFonts w:ascii="Arial" w:hAnsi="Arial"/>
+          <w:i/>
+          <w:sz w:val="18"/>
+        </w:rPr>
+        <w:t xml:space="preserve">Nota. </w:t>
+      </w:r>
+      <w:r>
+        <w:rPr>
+          <w:rFonts w:ascii="Arial" w:hAnsi="Arial"/>
+          <w:sz w:val="18"/>
+        </w:rPr>
+        <w:t>Elaboración propia basada en la implementación del frontend y los requisitos aprobados. Esquema de baja fidelidad; no constituye una captura de ejecución.</w:t>
       </w:r>
     </w:p>
     <w:p>
@@ -8712,17 +9527,91 @@
     <w:p>
       <w:pPr>
         <w:pStyle w:val="Normal"/>
+        <w:keepLines/>
         <w:widowControl/>
-        <w:rPr/>
+        <w:spacing w:before="60" w:after="80"/>
+        <w:jc w:val="center"/>
+        <w:rPr/>
+      </w:pPr>
+      <w:r>
+        <w:drawing>
+          <wp:inline xmlns:a="http://schemas.openxmlformats.org/drawingml/2006/main">
+            <wp:extent cx="3063240" cy="5445761"/>
+            <wp:docPr id="12" name="Picture 12" descr="Wireframe de baja fidelidad: Pronunciación." title="Figura 12. Wireframe de Pronunciación"/>
+            <wp:cNvGraphicFramePr>
+              <a:graphicFrameLocks noChangeAspect="1"/>
+            </wp:cNvGraphicFramePr>
+            <a:graphic>
+              <a:graphicData uri="http://schemas.openxmlformats.org/drawingml/2006/picture">
+                <pic:pic>
+                  <pic:nvPicPr>
+                    <pic:cNvPr id="0" name="WF-12_PronunciationScreen.png"/>
+                    <pic:cNvPicPr/>
+                  </pic:nvPicPr>
+                  <pic:blipFill>
+                    <a:blip r:embed="rId21"/>
+                    <a:stretch>
+                      <a:fillRect/>
+                    </a:stretch>
+                  </pic:blipFill>
+                  <pic:spPr>
+                    <a:xfrm>
+                      <a:off x="0" y="0"/>
+                      <a:ext cx="3063240" cy="5445761"/>
+                    </a:xfrm>
+                    <a:prstGeom prst="rect"/>
+                  </pic:spPr>
+                </pic:pic>
+              </a:graphicData>
+            </a:graphic>
+          </wp:inline>
+        </w:drawing>
+      </w:r>
+    </w:p>
+    <w:p>
+      <w:pPr>
+        <w:keepNext/>
+        <w:spacing w:before="40" w:after="0"/>
+        <w:jc w:val="left"/>
       </w:pPr>
       <w:r>
         <w:rPr>
-          <w:rFonts w:eastAsia="Times New Roman"/>
-          <w:b w:val="false"/>
+          <w:rFonts w:ascii="Arial" w:hAnsi="Arial"/>
+          <w:b/>
+          <w:sz w:val="22"/>
+        </w:rPr>
+        <w:t>Figura 12</w:t>
+        <w:br/>
+      </w:r>
+      <w:r>
+        <w:rPr>
+          <w:rFonts w:ascii="Arial" w:hAnsi="Arial"/>
           <w:i/>
-          <w:sz w:val="24"/>
+          <w:sz w:val="22"/>
         </w:rPr>
-        <w:t>[INSERTAR AQUÍ EL WIREFRAME DE LA PANTALLA: Pronunciación]</w:t>
+        <w:t>Wireframe de Pronunciación</w:t>
+      </w:r>
+    </w:p>
+    <w:p>
+      <w:pPr>
+        <w:keepLines/>
+        <w:spacing w:before="0" w:after="160"/>
+        <w:jc w:val="left"/>
+      </w:pPr>
+      <w:r>
+        <w:rPr>
+          <w:rFonts w:ascii="Arial" w:hAnsi="Arial"/>
+          <w:i/>
+          <w:sz w:val="18"/>
+        </w:rPr>
+        <w:t xml:space="preserve">Nota. </w:t>
+      </w:r>
+      <w:r>
+        <w:rPr>
+          <w:rFonts w:ascii="Arial" w:hAnsi="Arial"/>
+          <w:sz w:val="18"/>
+        </w:rPr>
+        <w:t>Elaboración propia basada en la implementación del frontend y los requisitos aprobados. Esquema de baja fidelidad; no constituye una captura de ejecución.</w:t>
       </w:r>
     </w:p>
     <w:p>

</xml_diff>

<commit_message>
docs(architecture): completar diagramas del frontend
Co-authored-by: Copilot <223556219+Copilot@users.noreply.github.com>
</commit_message>
<xml_diff>
--- a/Sprache/Informe_Frontend_Sprache_APA.docx
+++ b/Sprache/Informe_Frontend_Sprache_APA.docx
@@ -11493,13 +11493,7 @@
         <w:rPr/>
       </w:pPr>
       <w:r>
-        <w:rPr>
-          <w:rFonts w:eastAsia="Times New Roman"/>
-          <w:b w:val="false"/>
-          <w:i w:val="false"/>
-          <w:sz w:val="24"/>
-        </w:rPr>
-        <w:t>La documentación UX/UI indica soporte previsto mediante MotionPreferencesContext para respetar la preferencia de reducir movimiento. También define accessibilityRole, accessibilityLabel, accessibilityHint y accessibilityValue cuando corresponda. Estas son especificaciones de diseño que deben verificarse en la implementación real.</w:t>
+        <w:t>MotionPreferencesProvider consulta AccessibilityInfo y expone la preferencia de movimiento reducido mediante useReduceMotion; RootNavigation y las pantallas que la consumen ajustan animaciones y transiciones. Las etiquetas y propiedades de accesibilidad se describen en el apartado UX/UI y deben verificarse según cada control.</w:t>
       </w:r>
     </w:p>
     <w:p>
@@ -11520,13 +11514,7 @@
         <w:rPr/>
       </w:pPr>
       <w:r>
-        <w:rPr>
-          <w:rFonts w:eastAsia="Times New Roman"/>
-          <w:b w:val="false"/>
-          <w:i w:val="false"/>
-          <w:sz w:val="24"/>
-        </w:rPr>
-        <w:t>La navegación principal se organiza mediante cuatro pestañas inferiores: Inicio, Actividades, Progreso y Perfil. El flujo de acceso se resuelve mediante las pantallas Start, Register y Login. Las pantallas de lectura, teoría, pronunciación, lección y resumen se abren desde las secciones que las ofrecen. La guía indica header oculto, transición fade por defecto y duración de referencia de 180 ms, desactivable cuando el usuario reduce el movimiento.</w:t>
+        <w:t>App.js configura NavigationContainer y un Native Stack condicionado por la sesión: sin usuario muestra Start, Register y Login; con usuario muestra MainApp, Lesson, Lecturas, Teoría y Pronunciación. MainApp contiene el Bottom Tab Navigator con Inicio, Actividades, Progreso y Perfil. Inicio abre Lesson para recomendación, repaso o actividad, y ofrece accesos a Lecturas, Teoría y Pronunciación; Actividades y Progreso también pueden abrir Lesson. Al completar la última pregunta, LessonScreen muestra SessionSummary como componente interno y goBack() devuelve a la pantalla de origen. Cerrar sesión elimina la sesión local y el cambio de user hace que el stack vuelva a Start. SessionSummary no es una ruta independiente y no se identifican rutas pendientes propuestas en el inventario.</w:t>
       </w:r>
     </w:p>
     <w:p>
@@ -11547,233 +11535,178 @@
         <w:rPr/>
       </w:pPr>
       <w:r>
-        <w:rPr>
-          <w:rFonts w:eastAsia="Times New Roman"/>
-          <w:b w:val="false"/>
-          <w:i w:val="false"/>
-          <w:sz w:val="24"/>
-        </w:rPr>
-        <w:t>El siguiente esquema sintetiza el flujo descrito en los archivos de UX/UI y arquitectura:</w:t>
+        <w:t>El diagrama distingue el stack raíz, el contenedor de pestañas y las pantallas registradas. Los nombres de ruta y las transiciones se contrastaron con App.js, MainTabs.js y las acciones de las pantallas; SessionSummary se presenta dentro de LessonScreen, no como una ruta.</w:t>
       </w:r>
     </w:p>
     <w:p>
       <w:pPr>
         <w:pStyle w:val="Normal"/>
+        <w:keepNext/>
         <w:widowControl/>
+        <w:jc w:val="center"/>
+        <w:rPr/>
+      </w:pPr>
+      <w:r>
+        <w:drawing>
+          <wp:inline xmlns:a="http://schemas.openxmlformats.org/drawingml/2006/main">
+            <wp:extent cx="5486400" cy="7475220"/>
+            <wp:docPr id="13" name="Picture 13" descr="Diagrama de navegación implementada con flujo de acceso, cuatro pestañas, rutas de aprendizaje, cierre de sesión y resumen dentro de LessonScreen." title="Navegación del frontend"/>
+            <wp:cNvGraphicFramePr>
+              <a:graphicFrameLocks noChangeAspect="1"/>
+            </wp:cNvGraphicFramePr>
+            <a:graphic>
+              <a:graphicData uri="http://schemas.openxmlformats.org/drawingml/2006/picture">
+                <pic:pic>
+                  <pic:nvPicPr>
+                    <pic:cNvPr id="0" name="diagrama-navegacion-frontend.png"/>
+                    <pic:cNvPicPr/>
+                  </pic:nvPicPr>
+                  <pic:blipFill>
+                    <a:blip r:embed="rId22"/>
+                    <a:stretch>
+                      <a:fillRect/>
+                    </a:stretch>
+                  </pic:blipFill>
+                  <pic:spPr>
+                    <a:xfrm>
+                      <a:off x="0" y="0"/>
+                      <a:ext cx="5486400" cy="7475220"/>
+                    </a:xfrm>
+                    <a:prstGeom prst="rect"/>
+                  </pic:spPr>
+                </pic:pic>
+              </a:graphicData>
+            </a:graphic>
+          </wp:inline>
+        </w:drawing>
+      </w:r>
+    </w:p>
+    <w:p>
+      <w:pPr>
+        <w:pStyle w:val="Normal"/>
+        <w:keepLines/>
+        <w:widowControl/>
+        <w:jc w:val="left"/>
         <w:rPr/>
       </w:pPr>
       <w:r>
         <w:rPr>
-          <w:rFonts w:eastAsia="Times New Roman"/>
-          <w:b w:val="false"/>
-          <w:i w:val="false"/>
-          <w:sz w:val="24"/>
+          <w:b/>
         </w:rPr>
-        <w:t xml:space="preserve">                         ┌────────────────┐</w:t>
+        <w:t>Figura 13</w:t>
+        <w:br/>
       </w:r>
       <w:r>
         <w:rPr>
-          <w:rFonts w:eastAsia="Times New Roman"/>
-          <w:b w:val="false"/>
-          <w:i w:val="false"/>
-          <w:sz w:val="24"/>
+          <w:i/>
+        </w:rPr>
+        <w:t>Navegación del frontend</w:t>
+      </w:r>
+      <w:r>
+        <w:rPr>
+          <w:i/>
         </w:rPr>
         <w:br/>
-        <w:t xml:space="preserve">                         │  StartScreen   │</w:t>
-        <w:br/>
-        <w:t xml:space="preserve">                         └───────┬────────┘</w:t>
-        <w:br/>
-        <w:t xml:space="preserve">                     ┌───────────┴───────────┐</w:t>
-        <w:br/>
-        <w:t xml:space="preserve">                     ▼                       ▼</w:t>
-        <w:br/>
-        <w:t xml:space="preserve">              ┌─────────────┐         ┌─────────────┐</w:t>
-        <w:br/>
-        <w:t xml:space="preserve">              │ Register    │         │ LoginScreen │</w:t>
-        <w:br/>
-        <w:t xml:space="preserve">              └──────┬──────┘         └──────┬──────┘</w:t>
-        <w:br/>
-        <w:t xml:space="preserve">                     └───────────┬───────────┘</w:t>
-        <w:br/>
-        <w:t xml:space="preserve">                                 ▼</w:t>
-        <w:br/>
-        <w:t xml:space="preserve">                          ┌────────────┐</w:t>
-        <w:br/>
-        <w:t xml:space="preserve">                          │  MainTabs  │</w:t>
-        <w:br/>
-        <w:t xml:space="preserve">                          └─────┬──────┘</w:t>
-        <w:br/>
-        <w:t xml:space="preserve">          ┌──────────────┬──────┼──────────────┐</w:t>
-        <w:br/>
-        <w:t xml:space="preserve">          ▼              ▼      ▼              ▼</w:t>
-        <w:br/>
-        <w:t xml:space="preserve">       HomeScreen   Activities Progress      Profile</w:t>
-        <w:br/>
-        <w:t xml:space="preserve">          │              │      │</w:t>
-        <w:br/>
-        <w:t xml:space="preserve">          ├──────────────┘      ├───────────────┐</w:t>
-        <w:br/>
-        <w:t xml:space="preserve">          ▼                     ▼               ▼</w:t>
-        <w:br/>
-        <w:t xml:space="preserve">     LessonScreen         ReadingScreen    TheoryScreen</w:t>
-        <w:br/>
-        <w:t xml:space="preserve">          │                                   </w:t>
-        <w:br/>
-        <w:t xml:space="preserve">          ▼                                   </w:t>
-        <w:br/>
-        <w:t xml:space="preserve">     SessionSummary                  PronunciationScreen</w:t>
-        <w:br/>
-        <w:t xml:space="preserve">          │</w:t>
-        <w:br/>
-        <w:t xml:space="preserve">          └── Volver a la pantalla de origen</w:t>
-        <w:br/>
-        <w:br/>
-        <w:t>ProfileScreen ── Cerrar sesión ──&gt; StartScreen</w:t>
+        <w:t xml:space="preserve">Nota. </w:t>
+      </w:r>
+      <w:r>
+        <w:t>Elaboración propia con base en la navegación y los flujos implementados en el frontend. No se representa una ruta independiente para SessionSummary.</w:t>
       </w:r>
     </w:p>
     <w:p>
       <w:pPr>
+        <w:pStyle w:val="Heading1"/>
+        <w:widowControl/>
+        <w:rPr/>
+      </w:pPr>
+      <w:r>
+        <w:rPr/>
+        <w:t>Diagrama de arquitectura inicial del frontend</w:t>
+      </w:r>
+    </w:p>
+    <w:p>
+      <w:pPr>
         <w:pStyle w:val="Normal"/>
         <w:widowControl/>
         <w:rPr/>
       </w:pPr>
       <w:r>
-        <w:rPr>
-          <w:rFonts w:eastAsia="Times New Roman"/>
-          <w:b w:val="false"/>
-          <w:i w:val="false"/>
-          <w:sz w:val="24"/>
-        </w:rPr>
-        <w:t>Nota: el esquema es una representación documental. Debe verificarse contra el navegador configurado en App.js y los nombres de rutas reales.</w:t>
+        <w:t>El diagrama refleja la composición realmente presente en el frontend: punto de entrada Expo, providers, navegación, pantallas, componentes, contextos, servicios, módulos locales y persistencia. La API externa se muestra únicamente como una dependencia opcional del cliente HTTP.</w:t>
       </w:r>
     </w:p>
     <w:p>
       <w:pPr>
-        <w:pStyle w:val="Heading1"/>
+        <w:pStyle w:val="Normal"/>
+        <w:keepNext/>
         <w:widowControl/>
-        <w:rPr/>
-      </w:pPr>
-      <w:r>
-        <w:rPr/>
-        <w:t>Diagrama de arquitectura inicial del frontend</w:t>
+        <w:jc w:val="center"/>
+        <w:rPr/>
+      </w:pPr>
+      <w:r>
+        <w:drawing>
+          <wp:inline xmlns:a="http://schemas.openxmlformats.org/drawingml/2006/main">
+            <wp:extent cx="5486400" cy="6797040"/>
+            <wp:docPr id="14" name="Picture 14" descr="Diagrama de arquitectura Expo y React Native con navegación, pantallas, componentes reutilizables, contextos, servicios, datos locales, AsyncStorage, capacidades del dispositivo y cliente HTTP opcional." title="Arquitectura inicial del frontend"/>
+            <wp:cNvGraphicFramePr>
+              <a:graphicFrameLocks noChangeAspect="1"/>
+            </wp:cNvGraphicFramePr>
+            <a:graphic>
+              <a:graphicData uri="http://schemas.openxmlformats.org/drawingml/2006/picture">
+                <pic:pic>
+                  <pic:nvPicPr>
+                    <pic:cNvPr id="0" name="diagrama-arquitectura-frontend.png"/>
+                    <pic:cNvPicPr/>
+                  </pic:nvPicPr>
+                  <pic:blipFill>
+                    <a:blip r:embed="rId23"/>
+                    <a:stretch>
+                      <a:fillRect/>
+                    </a:stretch>
+                  </pic:blipFill>
+                  <pic:spPr>
+                    <a:xfrm>
+                      <a:off x="0" y="0"/>
+                      <a:ext cx="5486400" cy="6797040"/>
+                    </a:xfrm>
+                    <a:prstGeom prst="rect"/>
+                  </pic:spPr>
+                </pic:pic>
+              </a:graphicData>
+            </a:graphic>
+          </wp:inline>
+        </w:drawing>
       </w:r>
     </w:p>
     <w:p>
       <w:pPr>
         <w:pStyle w:val="Normal"/>
+        <w:keepLines/>
         <w:widowControl/>
+        <w:jc w:val="left"/>
         <w:rPr/>
       </w:pPr>
       <w:r>
         <w:rPr>
-          <w:rFonts w:eastAsia="Times New Roman"/>
-          <w:b w:val="false"/>
-          <w:i w:val="false"/>
-          <w:sz w:val="24"/>
+          <w:b/>
         </w:rPr>
-        <w:t>La arquitectura se describe por capas para separar la presentación, el estado compartido, las operaciones de aplicación y las fuentes de datos.</w:t>
-      </w:r>
-    </w:p>
-    <w:p>
-      <w:pPr>
-        <w:pStyle w:val="Normal"/>
-        <w:widowControl/>
-        <w:rPr/>
-      </w:pPr>
+        <w:t>Figura 14</w:t>
+        <w:br/>
+      </w:r>
       <w:r>
         <w:rPr>
-          <w:rFonts w:eastAsia="Times New Roman"/>
-          <w:b w:val="false"/>
-          <w:i w:val="false"/>
-          <w:sz w:val="24"/>
+          <w:i/>
         </w:rPr>
-        <w:t>┌────────────────────────────────────────────────────┐</w:t>
+        <w:t>Arquitectura inicial del frontend</w:t>
       </w:r>
       <w:r>
         <w:rPr>
-          <w:rFonts w:eastAsia="Times New Roman"/>
-          <w:b w:val="false"/>
-          <w:i w:val="false"/>
-          <w:sz w:val="24"/>
+          <w:i/>
         </w:rPr>
         <w:br/>
-        <w:t>│ Presentación: React Native / Expo                  │</w:t>
-        <w:br/>
-        <w:t>│ Screens + componentes reutilizables                │</w:t>
-        <w:br/>
-        <w:t>│ Start, Login, Register, MainTabs, Home, Activities, │</w:t>
-        <w:br/>
-        <w:t>│ Progress, Profile, Lesson, Summary, Reading,        │</w:t>
-        <w:br/>
-        <w:t>│ Theory y Pronunciation                              │</w:t>
-        <w:br/>
-        <w:t>└────────────────────────┬───────────────────────────┘</w:t>
-        <w:br/>
-        <w:t xml:space="preserve">                         ▼</w:t>
-        <w:br/>
-        <w:t>┌────────────────────────────────────────────────────┐</w:t>
-        <w:br/>
-        <w:t>│ Estado global / Context                            │</w:t>
-        <w:br/>
-        <w:t>│ AppProvider / AppContext                           │</w:t>
-        <w:br/>
-        <w:t>│ usuario, sesión, progreso, estado de carga         │</w:t>
-        <w:br/>
-        <w:t>│ MotionPreferencesProvider                          │</w:t>
-        <w:br/>
-        <w:t>└────────────────────────┬───────────────────────────┘</w:t>
-        <w:br/>
-        <w:t xml:space="preserve">                         ▼</w:t>
-        <w:br/>
-        <w:t>┌────────────────────────────────────────────────────┐</w:t>
-        <w:br/>
-        <w:t>│ Servicios                                          │</w:t>
-        <w:br/>
-        <w:t>│ autenticación, progreso, lecciones, ruta, logros,  │</w:t>
-        <w:br/>
-        <w:t>│ repetición espaciada, voz, háptica y cliente API   │</w:t>
-        <w:br/>
-        <w:t>└────────────────────────┬───────────────────────────┘</w:t>
-        <w:br/>
-        <w:t xml:space="preserve">                         ▼</w:t>
-        <w:br/>
-        <w:t>┌────────────────────────────────────────────────────┐</w:t>
-        <w:br/>
-        <w:t>│ Datos y persistencia                               │</w:t>
-        <w:br/>
-        <w:t>│ Activities.js, lessons.js, readingLessons.js,      │</w:t>
-        <w:br/>
-        <w:t>│ theoryModules.js, user.js, AsyncStorage            │</w:t>
-        <w:br/>
-        <w:t>└────────────────────────┬───────────────────────────┘</w:t>
-        <w:br/>
-        <w:t xml:space="preserve">                         ▼</w:t>
-        <w:br/>
-        <w:t>┌────────────────────────────────────────────────────┐</w:t>
-        <w:br/>
-        <w:t>│ Integración futura                                 │</w:t>
-        <w:br/>
-        <w:t>│ API REST en Ktor configurada con                   │</w:t>
-        <w:br/>
-        <w:t>│ EXPO_PUBLIC_API_URL                                │</w:t>
-        <w:br/>
-        <w:t>└────────────────────────────────────────────────────┘</w:t>
-      </w:r>
-    </w:p>
-    <w:p>
-      <w:pPr>
-        <w:pStyle w:val="Normal"/>
-        <w:widowControl/>
-        <w:rPr/>
-      </w:pPr>
-      <w:r>
-        <w:rPr>
-          <w:rFonts w:eastAsia="Times New Roman"/>
-          <w:b w:val="false"/>
-          <w:i w:val="false"/>
-          <w:sz w:val="24"/>
-        </w:rPr>
-        <w:t>La capa de servicios permite desacoplar las pantallas de la implementación concreta de los datos. La documentación menciona servicios mock en el diagrama de arquitectura y, en el README, servicios locales junto con apiService.js preparado para Ktor. El estado exacto de cada servicio debe confirmarse revisando el código actual.</w:t>
+        <w:t xml:space="preserve">Nota. </w:t>
+      </w:r>
+      <w:r>
+        <w:t>Elaboración propia a partir del código fuente del frontend y las dependencias declaradas en package.json. La API externa no tiene consumidores detectados en los flujos actuales.</w:t>
       </w:r>
     </w:p>
     <w:p>
@@ -12536,13 +12469,7 @@
         <w:rPr/>
       </w:pPr>
       <w:r>
-        <w:rPr>
-          <w:rFonts w:eastAsia="Times New Roman"/>
-          <w:b w:val="false"/>
-          <w:i w:val="false"/>
-          <w:sz w:val="24"/>
-        </w:rPr>
-        <w:t>El frontend está planteado como una aplicación React Native creada con Expo. App.js actúa como punto de entrada y concentra la composición de proveedores y navegación. Las pantallas se ubican en screens/, mientras que components/ agrupa elementos reutilizables por propósito. theme.js centraliza la paleta y las variables de diseño.</w:t>
+        <w:t>index.js llama a registerRootComponent(App). App.js compone SafeAreaProvider, MotionPreferencesProvider y AppProvider, y renderiza RootNavigation. Este configura NavigationContainer y un Native Stack cuyo grupo inicial depende del usuario cargado por AppContext. MainTabs organiza las cuatro pantallas principales en pestañas inferiores.</w:t>
       </w:r>
     </w:p>
     <w:p>
@@ -12552,13 +12479,7 @@
         <w:rPr/>
       </w:pPr>
       <w:r>
-        <w:rPr>
-          <w:rFonts w:eastAsia="Times New Roman"/>
-          <w:b w:val="false"/>
-          <w:i w:val="false"/>
-          <w:sz w:val="24"/>
-        </w:rPr>
-        <w:t>La arquitectura contempla AppContext para compartir el usuario, el estado de carga, los métodos de autenticación y las operaciones de seguimiento del aprendizaje. MotionPreferencesContext o MotionPreferencesProvider administra la preferencia de reducción de movimiento.</w:t>
+        <w:t>AppContext comparte user, isLoading y acciones de autenticación, perfil y aprendizaje; serializa las actualizaciones del usuario y solicita su persistencia local. MotionPreferencesContext escucha AccessibilityInfo y proporciona el estado de movimiento reducido mediante useReduceMotion. Mientras se restaura la sesión, RootNavigation presenta el estado de carga.</w:t>
       </w:r>
     </w:p>
     <w:p>
@@ -12568,13 +12489,7 @@
         <w:rPr/>
       </w:pPr>
       <w:r>
-        <w:rPr>
-          <w:rFonts w:eastAsia="Times New Roman"/>
-          <w:b w:val="false"/>
-          <w:i w:val="false"/>
-          <w:sz w:val="24"/>
-        </w:rPr>
-        <w:t>La capa services/ encapsula las operaciones de autenticación, progreso, lecciones, repetición espaciada, rutas, logros, síntesis de voz y respuesta háptica. Los módulos de data/ contienen el catálogo de actividades y los contenidos de aprendizaje. AsyncStorage se utiliza como mecanismo de persistencia local según el README y la arquitectura.</w:t>
+        <w:t>Los servicios del frontend incluyen autenticación, perfil, progreso y lecciones; actividad, ruta de aprendizaje, evaluación de nivel, repetición espaciada, logros y recompensas; además de síntesis de voz y retroalimentación háptica. Los módulos data/ aportan usuarios, actividades, lecciones, lecturas y teoría. authService utiliza AsyncStorage para cuentas, sesión y datos del usuario.</w:t>
       </w:r>
     </w:p>
     <w:p>
@@ -12584,13 +12499,7 @@
         <w:rPr/>
       </w:pPr>
       <w:r>
-        <w:rPr>
-          <w:rFonts w:eastAsia="Times New Roman"/>
-          <w:b w:val="false"/>
-          <w:i w:val="false"/>
-          <w:sz w:val="24"/>
-        </w:rPr>
-        <w:t>La documentación también describe un cliente apiService.js configurado mediante EXPO_PUBLIC_API_URL para facilitar una futura conexión con un backend Ktor. Esto no significa que el backend esté conectado o disponible actualmente. La integración debe verificarse mediante configuración, llamadas HTTP y pruebas.</w:t>
+        <w:t>services/apiService.js implementa un cliente HTTP basado en fetch y EXPO_PUBLIC_API_URL. La búsqueda en el frontend no encontró módulos que lo consuman; por tanto, se documenta como integración externa preparada, no como comunicación activa ni como dependencia necesaria para los flujos actuales.</w:t>
       </w:r>
     </w:p>
     <w:p>
@@ -12600,13 +12509,7 @@
         <w:rPr/>
       </w:pPr>
       <w:r>
-        <w:rPr>
-          <w:rFonts w:eastAsia="Times New Roman"/>
-          <w:b w:val="false"/>
-          <w:i w:val="false"/>
-          <w:sz w:val="24"/>
-        </w:rPr>
-        <w:t>Alcance que debe comprobarse en el código: existencia de cada pantalla y servicio, registro de rutas, persistencia después de reiniciar la app, validación de formularios, exactitud del progreso calculado, pruebas unitarias, accesibilidad real y funcionamiento offline. No se presentan estos puntos como resultados comprobados de ejecución.</w:t>
+        <w:t>La navegación, los contextos, los servicios, los módulos de contenido y la persistencia representados se contrastaron con el código fuente del frontend. El diagrama describe relaciones entre módulos; no sustituye pruebas de interacción en dispositivo. La disponibilidad de la API externa queda pendiente de configuración y verificación porque el cliente no está conectado a los flujos de la aplicación.</w:t>
       </w:r>
     </w:p>
     <w:p>

</xml_diff>

<commit_message>
docs(frontend): documentar estructura completa de carpetas
Co-authored-by: Copilot <223556219+Copilot@users.noreply.github.com>
</commit_message>
<xml_diff>
--- a/Sprache/Informe_Frontend_Sprache_APA.docx
+++ b/Sprache/Informe_Frontend_Sprache_APA.docx
@@ -11727,55 +11727,2895 @@
         <w:rPr/>
       </w:pPr>
       <w:r>
-        <w:rPr>
-          <w:rFonts w:eastAsia="Times New Roman"/>
-          <w:b w:val="false"/>
-          <w:i w:val="false"/>
-          <w:sz w:val="24"/>
+        <w:t>Árbol completo generado desde la raíz exacta Sprache/ (121 archivos propios; se excluyen dependencias, cachés y artefactos generados):</w:t>
+      </w:r>
+    </w:p>
+    <w:p>
+      <w:pPr>
+        <w:keepLines w:val="0"/>
+        <w:widowControl w:val="0"/>
+        <w:spacing w:before="0" w:after="0" w:line="240" w:lineRule="auto"/>
+      </w:pPr>
+      <w:r>
+        <w:rPr>
+          <w:rFonts w:ascii="Courier New" w:hAnsi="Courier New" w:eastAsia="Courier New"/>
+          <w:sz w:val="15"/>
         </w:rPr>
         <w:t>Sprache/</w:t>
-        <w:br/>
-        <w:t>├── assets/                   # Imágenes y recursos estáticos</w:t>
-        <w:br/>
+      </w:r>
+    </w:p>
+    <w:p>
+      <w:pPr>
+        <w:keepLines w:val="0"/>
+        <w:widowControl w:val="0"/>
+        <w:spacing w:before="0" w:after="0" w:line="240" w:lineRule="auto"/>
+      </w:pPr>
+      <w:r>
+        <w:rPr>
+          <w:rFonts w:ascii="Courier New" w:hAnsi="Courier New" w:eastAsia="Courier New"/>
+          <w:sz w:val="15"/>
+        </w:rPr>
+        <w:t>├── .claude/</w:t>
+      </w:r>
+    </w:p>
+    <w:p>
+      <w:pPr>
+        <w:keepLines w:val="0"/>
+        <w:widowControl w:val="0"/>
+        <w:spacing w:before="0" w:after="0" w:line="240" w:lineRule="auto"/>
+      </w:pPr>
+      <w:r>
+        <w:rPr>
+          <w:rFonts w:ascii="Courier New" w:hAnsi="Courier New" w:eastAsia="Courier New"/>
+          <w:sz w:val="15"/>
+        </w:rPr>
+        <w:t>│   └── settings.json</w:t>
+      </w:r>
+    </w:p>
+    <w:p>
+      <w:pPr>
+        <w:keepLines w:val="0"/>
+        <w:widowControl w:val="0"/>
+        <w:spacing w:before="0" w:after="0" w:line="240" w:lineRule="auto"/>
+      </w:pPr>
+      <w:r>
+        <w:rPr>
+          <w:rFonts w:ascii="Courier New" w:hAnsi="Courier New" w:eastAsia="Courier New"/>
+          <w:sz w:val="15"/>
+        </w:rPr>
+        <w:t>├── assets/</w:t>
+      </w:r>
+    </w:p>
+    <w:p>
+      <w:pPr>
+        <w:keepLines w:val="0"/>
+        <w:widowControl w:val="0"/>
+        <w:spacing w:before="0" w:after="0" w:line="240" w:lineRule="auto"/>
+      </w:pPr>
+      <w:r>
+        <w:rPr>
+          <w:rFonts w:ascii="Courier New" w:hAnsi="Courier New" w:eastAsia="Courier New"/>
+          <w:sz w:val="15"/>
+        </w:rPr>
+        <w:t>│   ├── android-icon-background.png</w:t>
+      </w:r>
+    </w:p>
+    <w:p>
+      <w:pPr>
+        <w:keepLines w:val="0"/>
+        <w:widowControl w:val="0"/>
+        <w:spacing w:before="0" w:after="0" w:line="240" w:lineRule="auto"/>
+      </w:pPr>
+      <w:r>
+        <w:rPr>
+          <w:rFonts w:ascii="Courier New" w:hAnsi="Courier New" w:eastAsia="Courier New"/>
+          <w:sz w:val="15"/>
+        </w:rPr>
+        <w:t>│   ├── android-icon-foreground.png</w:t>
+      </w:r>
+    </w:p>
+    <w:p>
+      <w:pPr>
+        <w:keepLines w:val="0"/>
+        <w:widowControl w:val="0"/>
+        <w:spacing w:before="0" w:after="0" w:line="240" w:lineRule="auto"/>
+      </w:pPr>
+      <w:r>
+        <w:rPr>
+          <w:rFonts w:ascii="Courier New" w:hAnsi="Courier New" w:eastAsia="Courier New"/>
+          <w:sz w:val="15"/>
+        </w:rPr>
+        <w:t>│   ├── android-icon-monochrome.png</w:t>
+      </w:r>
+    </w:p>
+    <w:p>
+      <w:pPr>
+        <w:keepLines w:val="0"/>
+        <w:widowControl w:val="0"/>
+        <w:spacing w:before="0" w:after="0" w:line="240" w:lineRule="auto"/>
+      </w:pPr>
+      <w:r>
+        <w:rPr>
+          <w:rFonts w:ascii="Courier New" w:hAnsi="Courier New" w:eastAsia="Courier New"/>
+          <w:sz w:val="15"/>
+        </w:rPr>
+        <w:t>│   ├── favicon.png</w:t>
+      </w:r>
+    </w:p>
+    <w:p>
+      <w:pPr>
+        <w:keepLines w:val="0"/>
+        <w:widowControl w:val="0"/>
+        <w:spacing w:before="0" w:after="0" w:line="240" w:lineRule="auto"/>
+      </w:pPr>
+      <w:r>
+        <w:rPr>
+          <w:rFonts w:ascii="Courier New" w:hAnsi="Courier New" w:eastAsia="Courier New"/>
+          <w:sz w:val="15"/>
+        </w:rPr>
+        <w:t>│   ├── icon.png</w:t>
+      </w:r>
+    </w:p>
+    <w:p>
+      <w:pPr>
+        <w:keepLines w:val="0"/>
+        <w:widowControl w:val="0"/>
+        <w:spacing w:before="0" w:after="0" w:line="240" w:lineRule="auto"/>
+      </w:pPr>
+      <w:r>
+        <w:rPr>
+          <w:rFonts w:ascii="Courier New" w:hAnsi="Courier New" w:eastAsia="Courier New"/>
+          <w:sz w:val="15"/>
+        </w:rPr>
+        <w:t>│   ├── splash-icon.png</w:t>
+      </w:r>
+    </w:p>
+    <w:p>
+      <w:pPr>
+        <w:keepLines w:val="0"/>
+        <w:widowControl w:val="0"/>
+        <w:spacing w:before="0" w:after="0" w:line="240" w:lineRule="auto"/>
+      </w:pPr>
+      <w:r>
+        <w:rPr>
+          <w:rFonts w:ascii="Courier New" w:hAnsi="Courier New" w:eastAsia="Courier New"/>
+          <w:sz w:val="15"/>
+        </w:rPr>
+        <w:t>│   └── sprache-logo.png</w:t>
+      </w:r>
+    </w:p>
+    <w:p>
+      <w:pPr>
+        <w:keepLines w:val="0"/>
+        <w:widowControl w:val="0"/>
+        <w:spacing w:before="0" w:after="0" w:line="240" w:lineRule="auto"/>
+      </w:pPr>
+      <w:r>
+        <w:rPr>
+          <w:rFonts w:ascii="Courier New" w:hAnsi="Courier New" w:eastAsia="Courier New"/>
+          <w:sz w:val="15"/>
+        </w:rPr>
         <w:t>├── components/</w:t>
-        <w:br/>
-        <w:t>│   ├── common/               # Componentes genéricos reutilizables</w:t>
-        <w:br/>
-        <w:t>│   ├── home/                 # Componentes de Home</w:t>
-        <w:br/>
-        <w:t>│   ├── learning/              # Componentes de aprendizaje</w:t>
-        <w:br/>
-        <w:t>│   ├── navigation/            # Componentes de navegación</w:t>
-        <w:br/>
-        <w:t>│   └── progress/              # Componentes de progreso</w:t>
-        <w:br/>
-        <w:t>├── context/                  # Contextos y estado compartido</w:t>
-        <w:br/>
+      </w:r>
+    </w:p>
+    <w:p>
+      <w:pPr>
+        <w:keepLines w:val="0"/>
+        <w:widowControl w:val="0"/>
+        <w:spacing w:before="0" w:after="0" w:line="240" w:lineRule="auto"/>
+      </w:pPr>
+      <w:r>
+        <w:rPr>
+          <w:rFonts w:ascii="Courier New" w:hAnsi="Courier New" w:eastAsia="Courier New"/>
+          <w:sz w:val="15"/>
+        </w:rPr>
+        <w:t>│   ├── activities/</w:t>
+      </w:r>
+    </w:p>
+    <w:p>
+      <w:pPr>
+        <w:keepLines w:val="0"/>
+        <w:widowControl w:val="0"/>
+        <w:spacing w:before="0" w:after="0" w:line="240" w:lineRule="auto"/>
+      </w:pPr>
+      <w:r>
+        <w:rPr>
+          <w:rFonts w:ascii="Courier New" w:hAnsi="Courier New" w:eastAsia="Courier New"/>
+          <w:sz w:val="15"/>
+        </w:rPr>
+        <w:t>│   │   ├── ActivityCard.js</w:t>
+      </w:r>
+    </w:p>
+    <w:p>
+      <w:pPr>
+        <w:keepLines w:val="0"/>
+        <w:widowControl w:val="0"/>
+        <w:spacing w:before="0" w:after="0" w:line="240" w:lineRule="auto"/>
+      </w:pPr>
+      <w:r>
+        <w:rPr>
+          <w:rFonts w:ascii="Courier New" w:hAnsi="Courier New" w:eastAsia="Courier New"/>
+          <w:sz w:val="15"/>
+        </w:rPr>
+        <w:t>│   │   ├── ActivityFilter.js</w:t>
+      </w:r>
+    </w:p>
+    <w:p>
+      <w:pPr>
+        <w:keepLines w:val="0"/>
+        <w:widowControl w:val="0"/>
+        <w:spacing w:before="0" w:after="0" w:line="240" w:lineRule="auto"/>
+      </w:pPr>
+      <w:r>
+        <w:rPr>
+          <w:rFonts w:ascii="Courier New" w:hAnsi="Courier New" w:eastAsia="Courier New"/>
+          <w:sz w:val="15"/>
+        </w:rPr>
+        <w:t>│   │   ├── ActivityList.js</w:t>
+      </w:r>
+    </w:p>
+    <w:p>
+      <w:pPr>
+        <w:keepLines w:val="0"/>
+        <w:widowControl w:val="0"/>
+        <w:spacing w:before="0" w:after="0" w:line="240" w:lineRule="auto"/>
+      </w:pPr>
+      <w:r>
+        <w:rPr>
+          <w:rFonts w:ascii="Courier New" w:hAnsi="Courier New" w:eastAsia="Courier New"/>
+          <w:sz w:val="15"/>
+        </w:rPr>
+        <w:t>│   │   └── ActivityProgress.js</w:t>
+      </w:r>
+    </w:p>
+    <w:p>
+      <w:pPr>
+        <w:keepLines w:val="0"/>
+        <w:widowControl w:val="0"/>
+        <w:spacing w:before="0" w:after="0" w:line="240" w:lineRule="auto"/>
+      </w:pPr>
+      <w:r>
+        <w:rPr>
+          <w:rFonts w:ascii="Courier New" w:hAnsi="Courier New" w:eastAsia="Courier New"/>
+          <w:sz w:val="15"/>
+        </w:rPr>
+        <w:t>│   ├── common/</w:t>
+      </w:r>
+    </w:p>
+    <w:p>
+      <w:pPr>
+        <w:keepLines w:val="0"/>
+        <w:widowControl w:val="0"/>
+        <w:spacing w:before="0" w:after="0" w:line="240" w:lineRule="auto"/>
+      </w:pPr>
+      <w:r>
+        <w:rPr>
+          <w:rFonts w:ascii="Courier New" w:hAnsi="Courier New" w:eastAsia="Courier New"/>
+          <w:sz w:val="15"/>
+        </w:rPr>
+        <w:t>│   │   ├── AppButton.js</w:t>
+      </w:r>
+    </w:p>
+    <w:p>
+      <w:pPr>
+        <w:keepLines w:val="0"/>
+        <w:widowControl w:val="0"/>
+        <w:spacing w:before="0" w:after="0" w:line="240" w:lineRule="auto"/>
+      </w:pPr>
+      <w:r>
+        <w:rPr>
+          <w:rFonts w:ascii="Courier New" w:hAnsi="Courier New" w:eastAsia="Courier New"/>
+          <w:sz w:val="15"/>
+        </w:rPr>
+        <w:t>│   │   ├── AppInput.js</w:t>
+      </w:r>
+    </w:p>
+    <w:p>
+      <w:pPr>
+        <w:keepLines w:val="0"/>
+        <w:widowControl w:val="0"/>
+        <w:spacing w:before="0" w:after="0" w:line="240" w:lineRule="auto"/>
+      </w:pPr>
+      <w:r>
+        <w:rPr>
+          <w:rFonts w:ascii="Courier New" w:hAnsi="Courier New" w:eastAsia="Courier New"/>
+          <w:sz w:val="15"/>
+        </w:rPr>
+        <w:t>│   │   ├── BrandLogo.js</w:t>
+      </w:r>
+    </w:p>
+    <w:p>
+      <w:pPr>
+        <w:keepLines w:val="0"/>
+        <w:widowControl w:val="0"/>
+        <w:spacing w:before="0" w:after="0" w:line="240" w:lineRule="auto"/>
+      </w:pPr>
+      <w:r>
+        <w:rPr>
+          <w:rFonts w:ascii="Courier New" w:hAnsi="Courier New" w:eastAsia="Courier New"/>
+          <w:sz w:val="15"/>
+        </w:rPr>
+        <w:t>│   │   ├── EmptyState.js</w:t>
+      </w:r>
+    </w:p>
+    <w:p>
+      <w:pPr>
+        <w:keepLines w:val="0"/>
+        <w:widowControl w:val="0"/>
+        <w:spacing w:before="0" w:after="0" w:line="240" w:lineRule="auto"/>
+      </w:pPr>
+      <w:r>
+        <w:rPr>
+          <w:rFonts w:ascii="Courier New" w:hAnsi="Courier New" w:eastAsia="Courier New"/>
+          <w:sz w:val="15"/>
+        </w:rPr>
+        <w:t>│   │   ├── GoalCompletion.js</w:t>
+      </w:r>
+    </w:p>
+    <w:p>
+      <w:pPr>
+        <w:keepLines w:val="0"/>
+        <w:widowControl w:val="0"/>
+        <w:spacing w:before="0" w:after="0" w:line="240" w:lineRule="auto"/>
+      </w:pPr>
+      <w:r>
+        <w:rPr>
+          <w:rFonts w:ascii="Courier New" w:hAnsi="Courier New" w:eastAsia="Courier New"/>
+          <w:sz w:val="15"/>
+        </w:rPr>
+        <w:t>│   │   ├── Loading.js</w:t>
+      </w:r>
+    </w:p>
+    <w:p>
+      <w:pPr>
+        <w:keepLines w:val="0"/>
+        <w:widowControl w:val="0"/>
+        <w:spacing w:before="0" w:after="0" w:line="240" w:lineRule="auto"/>
+      </w:pPr>
+      <w:r>
+        <w:rPr>
+          <w:rFonts w:ascii="Courier New" w:hAnsi="Courier New" w:eastAsia="Courier New"/>
+          <w:sz w:val="15"/>
+        </w:rPr>
+        <w:t>│   │   ├── MotionPressable.js</w:t>
+      </w:r>
+    </w:p>
+    <w:p>
+      <w:pPr>
+        <w:keepLines w:val="0"/>
+        <w:widowControl w:val="0"/>
+        <w:spacing w:before="0" w:after="0" w:line="240" w:lineRule="auto"/>
+      </w:pPr>
+      <w:r>
+        <w:rPr>
+          <w:rFonts w:ascii="Courier New" w:hAnsi="Courier New" w:eastAsia="Courier New"/>
+          <w:sz w:val="15"/>
+        </w:rPr>
+        <w:t>│   │   ├── ProgressBar.js</w:t>
+      </w:r>
+    </w:p>
+    <w:p>
+      <w:pPr>
+        <w:keepLines w:val="0"/>
+        <w:widowControl w:val="0"/>
+        <w:spacing w:before="0" w:after="0" w:line="240" w:lineRule="auto"/>
+      </w:pPr>
+      <w:r>
+        <w:rPr>
+          <w:rFonts w:ascii="Courier New" w:hAnsi="Courier New" w:eastAsia="Courier New"/>
+          <w:sz w:val="15"/>
+        </w:rPr>
+        <w:t>│   │   └── ScreenHeader.js</w:t>
+      </w:r>
+    </w:p>
+    <w:p>
+      <w:pPr>
+        <w:keepLines w:val="0"/>
+        <w:widowControl w:val="0"/>
+        <w:spacing w:before="0" w:after="0" w:line="240" w:lineRule="auto"/>
+      </w:pPr>
+      <w:r>
+        <w:rPr>
+          <w:rFonts w:ascii="Courier New" w:hAnsi="Courier New" w:eastAsia="Courier New"/>
+          <w:sz w:val="15"/>
+        </w:rPr>
+        <w:t>│   ├── home/</w:t>
+      </w:r>
+    </w:p>
+    <w:p>
+      <w:pPr>
+        <w:keepLines w:val="0"/>
+        <w:widowControl w:val="0"/>
+        <w:spacing w:before="0" w:after="0" w:line="240" w:lineRule="auto"/>
+      </w:pPr>
+      <w:r>
+        <w:rPr>
+          <w:rFonts w:ascii="Courier New" w:hAnsi="Courier New" w:eastAsia="Courier New"/>
+          <w:sz w:val="15"/>
+        </w:rPr>
+        <w:t>│   │   ├── DailyGoalCard.js</w:t>
+      </w:r>
+    </w:p>
+    <w:p>
+      <w:pPr>
+        <w:keepLines w:val="0"/>
+        <w:widowControl w:val="0"/>
+        <w:spacing w:before="0" w:after="0" w:line="240" w:lineRule="auto"/>
+      </w:pPr>
+      <w:r>
+        <w:rPr>
+          <w:rFonts w:ascii="Courier New" w:hAnsi="Courier New" w:eastAsia="Courier New"/>
+          <w:sz w:val="15"/>
+        </w:rPr>
+        <w:t>│   │   ├── RecommendationCard.js</w:t>
+      </w:r>
+    </w:p>
+    <w:p>
+      <w:pPr>
+        <w:keepLines w:val="0"/>
+        <w:widowControl w:val="0"/>
+        <w:spacing w:before="0" w:after="0" w:line="240" w:lineRule="auto"/>
+      </w:pPr>
+      <w:r>
+        <w:rPr>
+          <w:rFonts w:ascii="Courier New" w:hAnsi="Courier New" w:eastAsia="Courier New"/>
+          <w:sz w:val="15"/>
+        </w:rPr>
+        <w:t>│   │   ├── StreakBadge.js</w:t>
+      </w:r>
+    </w:p>
+    <w:p>
+      <w:pPr>
+        <w:keepLines w:val="0"/>
+        <w:widowControl w:val="0"/>
+        <w:spacing w:before="0" w:after="0" w:line="240" w:lineRule="auto"/>
+      </w:pPr>
+      <w:r>
+        <w:rPr>
+          <w:rFonts w:ascii="Courier New" w:hAnsi="Courier New" w:eastAsia="Courier New"/>
+          <w:sz w:val="15"/>
+        </w:rPr>
+        <w:t>│   │   └── WelcomeHeader.js</w:t>
+      </w:r>
+    </w:p>
+    <w:p>
+      <w:pPr>
+        <w:keepLines w:val="0"/>
+        <w:widowControl w:val="0"/>
+        <w:spacing w:before="0" w:after="0" w:line="240" w:lineRule="auto"/>
+      </w:pPr>
+      <w:r>
+        <w:rPr>
+          <w:rFonts w:ascii="Courier New" w:hAnsi="Courier New" w:eastAsia="Courier New"/>
+          <w:sz w:val="15"/>
+        </w:rPr>
+        <w:t>│   ├── learning/</w:t>
+      </w:r>
+    </w:p>
+    <w:p>
+      <w:pPr>
+        <w:keepLines w:val="0"/>
+        <w:widowControl w:val="0"/>
+        <w:spacing w:before="0" w:after="0" w:line="240" w:lineRule="auto"/>
+      </w:pPr>
+      <w:r>
+        <w:rPr>
+          <w:rFonts w:ascii="Courier New" w:hAnsi="Courier New" w:eastAsia="Courier New"/>
+          <w:sz w:val="15"/>
+        </w:rPr>
+        <w:t>│   │   ├── AnswerOption.js</w:t>
+      </w:r>
+    </w:p>
+    <w:p>
+      <w:pPr>
+        <w:keepLines w:val="0"/>
+        <w:widowControl w:val="0"/>
+        <w:spacing w:before="0" w:after="0" w:line="240" w:lineRule="auto"/>
+      </w:pPr>
+      <w:r>
+        <w:rPr>
+          <w:rFonts w:ascii="Courier New" w:hAnsi="Courier New" w:eastAsia="Courier New"/>
+          <w:sz w:val="15"/>
+        </w:rPr>
+        <w:t>│   │   ├── AudioButton.js</w:t>
+      </w:r>
+    </w:p>
+    <w:p>
+      <w:pPr>
+        <w:keepLines w:val="0"/>
+        <w:widowControl w:val="0"/>
+        <w:spacing w:before="0" w:after="0" w:line="240" w:lineRule="auto"/>
+      </w:pPr>
+      <w:r>
+        <w:rPr>
+          <w:rFonts w:ascii="Courier New" w:hAnsi="Courier New" w:eastAsia="Courier New"/>
+          <w:sz w:val="15"/>
+        </w:rPr>
+        <w:t>│   │   ├── CelebrationNotice.js</w:t>
+      </w:r>
+    </w:p>
+    <w:p>
+      <w:pPr>
+        <w:keepLines w:val="0"/>
+        <w:widowControl w:val="0"/>
+        <w:spacing w:before="0" w:after="0" w:line="240" w:lineRule="auto"/>
+      </w:pPr>
+      <w:r>
+        <w:rPr>
+          <w:rFonts w:ascii="Courier New" w:hAnsi="Courier New" w:eastAsia="Courier New"/>
+          <w:sz w:val="15"/>
+        </w:rPr>
+        <w:t>│   │   ├── DictationInput.js</w:t>
+      </w:r>
+    </w:p>
+    <w:p>
+      <w:pPr>
+        <w:keepLines w:val="0"/>
+        <w:widowControl w:val="0"/>
+        <w:spacing w:before="0" w:after="0" w:line="240" w:lineRule="auto"/>
+      </w:pPr>
+      <w:r>
+        <w:rPr>
+          <w:rFonts w:ascii="Courier New" w:hAnsi="Courier New" w:eastAsia="Courier New"/>
+          <w:sz w:val="15"/>
+        </w:rPr>
+        <w:t>│   │   ├── FeedbackMessage.js</w:t>
+      </w:r>
+    </w:p>
+    <w:p>
+      <w:pPr>
+        <w:keepLines w:val="0"/>
+        <w:widowControl w:val="0"/>
+        <w:spacing w:before="0" w:after="0" w:line="240" w:lineRule="auto"/>
+      </w:pPr>
+      <w:r>
+        <w:rPr>
+          <w:rFonts w:ascii="Courier New" w:hAnsi="Courier New" w:eastAsia="Courier New"/>
+          <w:sz w:val="15"/>
+        </w:rPr>
+        <w:t>│   │   ├── FillBlanks.js</w:t>
+      </w:r>
+    </w:p>
+    <w:p>
+      <w:pPr>
+        <w:keepLines w:val="0"/>
+        <w:widowControl w:val="0"/>
+        <w:spacing w:before="0" w:after="0" w:line="240" w:lineRule="auto"/>
+      </w:pPr>
+      <w:r>
+        <w:rPr>
+          <w:rFonts w:ascii="Courier New" w:hAnsi="Courier New" w:eastAsia="Courier New"/>
+          <w:sz w:val="15"/>
+        </w:rPr>
+        <w:t>│   │   ├── GermanAudioButton.js</w:t>
+      </w:r>
+    </w:p>
+    <w:p>
+      <w:pPr>
+        <w:keepLines w:val="0"/>
+        <w:widowControl w:val="0"/>
+        <w:spacing w:before="0" w:after="0" w:line="240" w:lineRule="auto"/>
+      </w:pPr>
+      <w:r>
+        <w:rPr>
+          <w:rFonts w:ascii="Courier New" w:hAnsi="Courier New" w:eastAsia="Courier New"/>
+          <w:sz w:val="15"/>
+        </w:rPr>
+        <w:t>│   │   ├── HintButton.js</w:t>
+      </w:r>
+    </w:p>
+    <w:p>
+      <w:pPr>
+        <w:keepLines w:val="0"/>
+        <w:widowControl w:val="0"/>
+        <w:spacing w:before="0" w:after="0" w:line="240" w:lineRule="auto"/>
+      </w:pPr>
+      <w:r>
+        <w:rPr>
+          <w:rFonts w:ascii="Courier New" w:hAnsi="Courier New" w:eastAsia="Courier New"/>
+          <w:sz w:val="15"/>
+        </w:rPr>
+        <w:t>│   │   ├── LessonHeader.js</w:t>
+      </w:r>
+    </w:p>
+    <w:p>
+      <w:pPr>
+        <w:keepLines w:val="0"/>
+        <w:widowControl w:val="0"/>
+        <w:spacing w:before="0" w:after="0" w:line="240" w:lineRule="auto"/>
+      </w:pPr>
+      <w:r>
+        <w:rPr>
+          <w:rFonts w:ascii="Courier New" w:hAnsi="Courier New" w:eastAsia="Courier New"/>
+          <w:sz w:val="15"/>
+        </w:rPr>
+        <w:t>│   │   ├── LessonProgress.js</w:t>
+      </w:r>
+    </w:p>
+    <w:p>
+      <w:pPr>
+        <w:keepLines w:val="0"/>
+        <w:widowControl w:val="0"/>
+        <w:spacing w:before="0" w:after="0" w:line="240" w:lineRule="auto"/>
+      </w:pPr>
+      <w:r>
+        <w:rPr>
+          <w:rFonts w:ascii="Courier New" w:hAnsi="Courier New" w:eastAsia="Courier New"/>
+          <w:sz w:val="15"/>
+        </w:rPr>
+        <w:t>│   │   ├── ListeningComprehension.js</w:t>
+      </w:r>
+    </w:p>
+    <w:p>
+      <w:pPr>
+        <w:keepLines w:val="0"/>
+        <w:widowControl w:val="0"/>
+        <w:spacing w:before="0" w:after="0" w:line="240" w:lineRule="auto"/>
+      </w:pPr>
+      <w:r>
+        <w:rPr>
+          <w:rFonts w:ascii="Courier New" w:hAnsi="Courier New" w:eastAsia="Courier New"/>
+          <w:sz w:val="15"/>
+        </w:rPr>
+        <w:t>│   │   ├── QuestionCard.js</w:t>
+      </w:r>
+    </w:p>
+    <w:p>
+      <w:pPr>
+        <w:keepLines w:val="0"/>
+        <w:widowControl w:val="0"/>
+        <w:spacing w:before="0" w:after="0" w:line="240" w:lineRule="auto"/>
+      </w:pPr>
+      <w:r>
+        <w:rPr>
+          <w:rFonts w:ascii="Courier New" w:hAnsi="Courier New" w:eastAsia="Courier New"/>
+          <w:sz w:val="15"/>
+        </w:rPr>
+        <w:t>│   │   ├── SessionSummary.js</w:t>
+      </w:r>
+    </w:p>
+    <w:p>
+      <w:pPr>
+        <w:keepLines w:val="0"/>
+        <w:widowControl w:val="0"/>
+        <w:spacing w:before="0" w:after="0" w:line="240" w:lineRule="auto"/>
+      </w:pPr>
+      <w:r>
+        <w:rPr>
+          <w:rFonts w:ascii="Courier New" w:hAnsi="Courier New" w:eastAsia="Courier New"/>
+          <w:sz w:val="15"/>
+        </w:rPr>
+        <w:t>│   │   ├── WordOrder.js</w:t>
+      </w:r>
+    </w:p>
+    <w:p>
+      <w:pPr>
+        <w:keepLines w:val="0"/>
+        <w:widowControl w:val="0"/>
+        <w:spacing w:before="0" w:after="0" w:line="240" w:lineRule="auto"/>
+      </w:pPr>
+      <w:r>
+        <w:rPr>
+          <w:rFonts w:ascii="Courier New" w:hAnsi="Courier New" w:eastAsia="Courier New"/>
+          <w:sz w:val="15"/>
+        </w:rPr>
+        <w:t>│   │   └── WriteResponse.js</w:t>
+      </w:r>
+    </w:p>
+    <w:p>
+      <w:pPr>
+        <w:keepLines w:val="0"/>
+        <w:widowControl w:val="0"/>
+        <w:spacing w:before="0" w:after="0" w:line="240" w:lineRule="auto"/>
+      </w:pPr>
+      <w:r>
+        <w:rPr>
+          <w:rFonts w:ascii="Courier New" w:hAnsi="Courier New" w:eastAsia="Courier New"/>
+          <w:sz w:val="15"/>
+        </w:rPr>
+        <w:t>│   ├── navigation/</w:t>
+      </w:r>
+    </w:p>
+    <w:p>
+      <w:pPr>
+        <w:keepLines w:val="0"/>
+        <w:widowControl w:val="0"/>
+        <w:spacing w:before="0" w:after="0" w:line="240" w:lineRule="auto"/>
+      </w:pPr>
+      <w:r>
+        <w:rPr>
+          <w:rFonts w:ascii="Courier New" w:hAnsi="Courier New" w:eastAsia="Courier New"/>
+          <w:sz w:val="15"/>
+        </w:rPr>
+        <w:t>│   │   └── MainTabs.js</w:t>
+      </w:r>
+    </w:p>
+    <w:p>
+      <w:pPr>
+        <w:keepLines w:val="0"/>
+        <w:widowControl w:val="0"/>
+        <w:spacing w:before="0" w:after="0" w:line="240" w:lineRule="auto"/>
+      </w:pPr>
+      <w:r>
+        <w:rPr>
+          <w:rFonts w:ascii="Courier New" w:hAnsi="Courier New" w:eastAsia="Courier New"/>
+          <w:sz w:val="15"/>
+        </w:rPr>
+        <w:t>│   ├── profile/</w:t>
+      </w:r>
+    </w:p>
+    <w:p>
+      <w:pPr>
+        <w:keepLines w:val="0"/>
+        <w:widowControl w:val="0"/>
+        <w:spacing w:before="0" w:after="0" w:line="240" w:lineRule="auto"/>
+      </w:pPr>
+      <w:r>
+        <w:rPr>
+          <w:rFonts w:ascii="Courier New" w:hAnsi="Courier New" w:eastAsia="Courier New"/>
+          <w:sz w:val="15"/>
+        </w:rPr>
+        <w:t>│   │   ├── GoalCard.js</w:t>
+      </w:r>
+    </w:p>
+    <w:p>
+      <w:pPr>
+        <w:keepLines w:val="0"/>
+        <w:widowControl w:val="0"/>
+        <w:spacing w:before="0" w:after="0" w:line="240" w:lineRule="auto"/>
+      </w:pPr>
+      <w:r>
+        <w:rPr>
+          <w:rFonts w:ascii="Courier New" w:hAnsi="Courier New" w:eastAsia="Courier New"/>
+          <w:sz w:val="15"/>
+        </w:rPr>
+        <w:t>│   │   ├── MascotAvatar.js</w:t>
+      </w:r>
+    </w:p>
+    <w:p>
+      <w:pPr>
+        <w:keepLines w:val="0"/>
+        <w:widowControl w:val="0"/>
+        <w:spacing w:before="0" w:after="0" w:line="240" w:lineRule="auto"/>
+      </w:pPr>
+      <w:r>
+        <w:rPr>
+          <w:rFonts w:ascii="Courier New" w:hAnsi="Courier New" w:eastAsia="Courier New"/>
+          <w:sz w:val="15"/>
+        </w:rPr>
+        <w:t>│   │   ├── MascotCustomization.js</w:t>
+      </w:r>
+    </w:p>
+    <w:p>
+      <w:pPr>
+        <w:keepLines w:val="0"/>
+        <w:widowControl w:val="0"/>
+        <w:spacing w:before="0" w:after="0" w:line="240" w:lineRule="auto"/>
+      </w:pPr>
+      <w:r>
+        <w:rPr>
+          <w:rFonts w:ascii="Courier New" w:hAnsi="Courier New" w:eastAsia="Courier New"/>
+          <w:sz w:val="15"/>
+        </w:rPr>
+        <w:t>│   │   ├── ProfileHeader.js</w:t>
+      </w:r>
+    </w:p>
+    <w:p>
+      <w:pPr>
+        <w:keepLines w:val="0"/>
+        <w:widowControl w:val="0"/>
+        <w:spacing w:before="0" w:after="0" w:line="240" w:lineRule="auto"/>
+      </w:pPr>
+      <w:r>
+        <w:rPr>
+          <w:rFonts w:ascii="Courier New" w:hAnsi="Courier New" w:eastAsia="Courier New"/>
+          <w:sz w:val="15"/>
+        </w:rPr>
+        <w:t>│   │   ├── ProfileStats.js</w:t>
+      </w:r>
+    </w:p>
+    <w:p>
+      <w:pPr>
+        <w:keepLines w:val="0"/>
+        <w:widowControl w:val="0"/>
+        <w:spacing w:before="0" w:after="0" w:line="240" w:lineRule="auto"/>
+      </w:pPr>
+      <w:r>
+        <w:rPr>
+          <w:rFonts w:ascii="Courier New" w:hAnsi="Courier New" w:eastAsia="Courier New"/>
+          <w:sz w:val="15"/>
+        </w:rPr>
+        <w:t>│   │   ├── SettingsRow.js</w:t>
+      </w:r>
+    </w:p>
+    <w:p>
+      <w:pPr>
+        <w:keepLines w:val="0"/>
+        <w:widowControl w:val="0"/>
+        <w:spacing w:before="0" w:after="0" w:line="240" w:lineRule="auto"/>
+      </w:pPr>
+      <w:r>
+        <w:rPr>
+          <w:rFonts w:ascii="Courier New" w:hAnsi="Courier New" w:eastAsia="Courier New"/>
+          <w:sz w:val="15"/>
+        </w:rPr>
+        <w:t>│   │   ├── SettingsSection.js</w:t>
+      </w:r>
+    </w:p>
+    <w:p>
+      <w:pPr>
+        <w:keepLines w:val="0"/>
+        <w:widowControl w:val="0"/>
+        <w:spacing w:before="0" w:after="0" w:line="240" w:lineRule="auto"/>
+      </w:pPr>
+      <w:r>
+        <w:rPr>
+          <w:rFonts w:ascii="Courier New" w:hAnsi="Courier New" w:eastAsia="Courier New"/>
+          <w:sz w:val="15"/>
+        </w:rPr>
+        <w:t>│   │   └── SettingsSwitchRow.js</w:t>
+      </w:r>
+    </w:p>
+    <w:p>
+      <w:pPr>
+        <w:keepLines w:val="0"/>
+        <w:widowControl w:val="0"/>
+        <w:spacing w:before="0" w:after="0" w:line="240" w:lineRule="auto"/>
+      </w:pPr>
+      <w:r>
+        <w:rPr>
+          <w:rFonts w:ascii="Courier New" w:hAnsi="Courier New" w:eastAsia="Courier New"/>
+          <w:sz w:val="15"/>
+        </w:rPr>
+        <w:t>│   └── progress/</w:t>
+      </w:r>
+    </w:p>
+    <w:p>
+      <w:pPr>
+        <w:keepLines w:val="0"/>
+        <w:widowControl w:val="0"/>
+        <w:spacing w:before="0" w:after="0" w:line="240" w:lineRule="auto"/>
+      </w:pPr>
+      <w:r>
+        <w:rPr>
+          <w:rFonts w:ascii="Courier New" w:hAnsi="Courier New" w:eastAsia="Courier New"/>
+          <w:sz w:val="15"/>
+        </w:rPr>
+        <w:t>│       ├── AchievementPanel.js</w:t>
+      </w:r>
+    </w:p>
+    <w:p>
+      <w:pPr>
+        <w:keepLines w:val="0"/>
+        <w:widowControl w:val="0"/>
+        <w:spacing w:before="0" w:after="0" w:line="240" w:lineRule="auto"/>
+      </w:pPr>
+      <w:r>
+        <w:rPr>
+          <w:rFonts w:ascii="Courier New" w:hAnsi="Courier New" w:eastAsia="Courier New"/>
+          <w:sz w:val="15"/>
+        </w:rPr>
+        <w:t>│       ├── LearningPath.js</w:t>
+      </w:r>
+    </w:p>
+    <w:p>
+      <w:pPr>
+        <w:keepLines w:val="0"/>
+        <w:widowControl w:val="0"/>
+        <w:spacing w:before="0" w:after="0" w:line="240" w:lineRule="auto"/>
+      </w:pPr>
+      <w:r>
+        <w:rPr>
+          <w:rFonts w:ascii="Courier New" w:hAnsi="Courier New" w:eastAsia="Courier New"/>
+          <w:sz w:val="15"/>
+        </w:rPr>
+        <w:t>│       ├── LevelProgressCard.js</w:t>
+      </w:r>
+    </w:p>
+    <w:p>
+      <w:pPr>
+        <w:keepLines w:val="0"/>
+        <w:widowControl w:val="0"/>
+        <w:spacing w:before="0" w:after="0" w:line="240" w:lineRule="auto"/>
+      </w:pPr>
+      <w:r>
+        <w:rPr>
+          <w:rFonts w:ascii="Courier New" w:hAnsi="Courier New" w:eastAsia="Courier New"/>
+          <w:sz w:val="15"/>
+        </w:rPr>
+        <w:t>│       ├── ProgressStat.js</w:t>
+      </w:r>
+    </w:p>
+    <w:p>
+      <w:pPr>
+        <w:keepLines w:val="0"/>
+        <w:widowControl w:val="0"/>
+        <w:spacing w:before="0" w:after="0" w:line="240" w:lineRule="auto"/>
+      </w:pPr>
+      <w:r>
+        <w:rPr>
+          <w:rFonts w:ascii="Courier New" w:hAnsi="Courier New" w:eastAsia="Courier New"/>
+          <w:sz w:val="15"/>
+        </w:rPr>
+        <w:t>│       ├── StreakCalendar.js</w:t>
+      </w:r>
+    </w:p>
+    <w:p>
+      <w:pPr>
+        <w:keepLines w:val="0"/>
+        <w:widowControl w:val="0"/>
+        <w:spacing w:before="0" w:after="0" w:line="240" w:lineRule="auto"/>
+      </w:pPr>
+      <w:r>
+        <w:rPr>
+          <w:rFonts w:ascii="Courier New" w:hAnsi="Courier New" w:eastAsia="Courier New"/>
+          <w:sz w:val="15"/>
+        </w:rPr>
+        <w:t>│       └── WeeklyActivity.js</w:t>
+      </w:r>
+    </w:p>
+    <w:p>
+      <w:pPr>
+        <w:keepLines w:val="0"/>
+        <w:widowControl w:val="0"/>
+        <w:spacing w:before="0" w:after="0" w:line="240" w:lineRule="auto"/>
+      </w:pPr>
+      <w:r>
+        <w:rPr>
+          <w:rFonts w:ascii="Courier New" w:hAnsi="Courier New" w:eastAsia="Courier New"/>
+          <w:sz w:val="15"/>
+        </w:rPr>
+        <w:t>├── context/</w:t>
+      </w:r>
+    </w:p>
+    <w:p>
+      <w:pPr>
+        <w:keepLines w:val="0"/>
+        <w:widowControl w:val="0"/>
+        <w:spacing w:before="0" w:after="0" w:line="240" w:lineRule="auto"/>
+      </w:pPr>
+      <w:r>
+        <w:rPr>
+          <w:rFonts w:ascii="Courier New" w:hAnsi="Courier New" w:eastAsia="Courier New"/>
+          <w:sz w:val="15"/>
+        </w:rPr>
+        <w:t>│   ├── AppContext.js</w:t>
+      </w:r>
+    </w:p>
+    <w:p>
+      <w:pPr>
+        <w:keepLines w:val="0"/>
+        <w:widowControl w:val="0"/>
+        <w:spacing w:before="0" w:after="0" w:line="240" w:lineRule="auto"/>
+      </w:pPr>
+      <w:r>
+        <w:rPr>
+          <w:rFonts w:ascii="Courier New" w:hAnsi="Courier New" w:eastAsia="Courier New"/>
+          <w:sz w:val="15"/>
+        </w:rPr>
+        <w:t>│   └── MotionPreferencesContext.js</w:t>
+      </w:r>
+    </w:p>
+    <w:p>
+      <w:pPr>
+        <w:keepLines w:val="0"/>
+        <w:widowControl w:val="0"/>
+        <w:spacing w:before="0" w:after="0" w:line="240" w:lineRule="auto"/>
+      </w:pPr>
+      <w:r>
+        <w:rPr>
+          <w:rFonts w:ascii="Courier New" w:hAnsi="Courier New" w:eastAsia="Courier New"/>
+          <w:sz w:val="15"/>
+        </w:rPr>
         <w:t>├── data/</w:t>
-        <w:br/>
-        <w:t>│   ├── Activities.js         # Catálogo de actividades</w:t>
-        <w:br/>
-        <w:t>│   ├── lessons.js            # Lecciones y preguntas</w:t>
-        <w:br/>
-        <w:t>│   ├── readingLessons.js     # Contenido de lectura</w:t>
-        <w:br/>
-        <w:t>│   ├── theoryModules.js      # Módulos teóricos</w:t>
-        <w:br/>
-        <w:t>│   └── user.js               # Estructura/datos de usuario</w:t>
-        <w:br/>
-        <w:t>├── screens/                  # Pantallas</w:t>
-        <w:br/>
-        <w:t>├── services/                 # Servicios y cliente HTTP</w:t>
-        <w:br/>
-        <w:t>├── tests/                    # Pruebas automatizadas</w:t>
-        <w:br/>
-        <w:t>├── App.js                    # Entrada y configuración principal</w:t>
-        <w:br/>
-        <w:t>├── package.json              # Dependencias y scripts</w:t>
-        <w:br/>
-        <w:t>└── theme.js                  # Tokens del sistema de diseño</w:t>
-      </w:r>
-    </w:p>
+      </w:r>
+    </w:p>
+    <w:p>
+      <w:pPr>
+        <w:keepLines w:val="0"/>
+        <w:widowControl w:val="0"/>
+        <w:spacing w:before="0" w:after="0" w:line="240" w:lineRule="auto"/>
+      </w:pPr>
+      <w:r>
+        <w:rPr>
+          <w:rFonts w:ascii="Courier New" w:hAnsi="Courier New" w:eastAsia="Courier New"/>
+          <w:sz w:val="15"/>
+        </w:rPr>
+        <w:t>│   ├── Activities.js</w:t>
+      </w:r>
+    </w:p>
+    <w:p>
+      <w:pPr>
+        <w:keepLines w:val="0"/>
+        <w:widowControl w:val="0"/>
+        <w:spacing w:before="0" w:after="0" w:line="240" w:lineRule="auto"/>
+      </w:pPr>
+      <w:r>
+        <w:rPr>
+          <w:rFonts w:ascii="Courier New" w:hAnsi="Courier New" w:eastAsia="Courier New"/>
+          <w:sz w:val="15"/>
+        </w:rPr>
+        <w:t>│   ├── lessons.js</w:t>
+      </w:r>
+    </w:p>
+    <w:p>
+      <w:pPr>
+        <w:keepLines w:val="0"/>
+        <w:widowControl w:val="0"/>
+        <w:spacing w:before="0" w:after="0" w:line="240" w:lineRule="auto"/>
+      </w:pPr>
+      <w:r>
+        <w:rPr>
+          <w:rFonts w:ascii="Courier New" w:hAnsi="Courier New" w:eastAsia="Courier New"/>
+          <w:sz w:val="15"/>
+        </w:rPr>
+        <w:t>│   ├── readingLessons.js</w:t>
+      </w:r>
+    </w:p>
+    <w:p>
+      <w:pPr>
+        <w:keepLines w:val="0"/>
+        <w:widowControl w:val="0"/>
+        <w:spacing w:before="0" w:after="0" w:line="240" w:lineRule="auto"/>
+      </w:pPr>
+      <w:r>
+        <w:rPr>
+          <w:rFonts w:ascii="Courier New" w:hAnsi="Courier New" w:eastAsia="Courier New"/>
+          <w:sz w:val="15"/>
+        </w:rPr>
+        <w:t>│   ├── theoryModules.js</w:t>
+      </w:r>
+    </w:p>
+    <w:p>
+      <w:pPr>
+        <w:keepLines w:val="0"/>
+        <w:widowControl w:val="0"/>
+        <w:spacing w:before="0" w:after="0" w:line="240" w:lineRule="auto"/>
+      </w:pPr>
+      <w:r>
+        <w:rPr>
+          <w:rFonts w:ascii="Courier New" w:hAnsi="Courier New" w:eastAsia="Courier New"/>
+          <w:sz w:val="15"/>
+        </w:rPr>
+        <w:t>│   └── user.js</w:t>
+      </w:r>
+    </w:p>
+    <w:p>
+      <w:pPr>
+        <w:keepLines w:val="0"/>
+        <w:widowControl w:val="0"/>
+        <w:spacing w:before="0" w:after="0" w:line="240" w:lineRule="auto"/>
+      </w:pPr>
+      <w:r>
+        <w:rPr>
+          <w:rFonts w:ascii="Courier New" w:hAnsi="Courier New" w:eastAsia="Courier New"/>
+          <w:sz w:val="15"/>
+        </w:rPr>
+        <w:t>├── docs/</w:t>
+      </w:r>
+    </w:p>
+    <w:p>
+      <w:pPr>
+        <w:keepLines w:val="0"/>
+        <w:widowControl w:val="0"/>
+        <w:spacing w:before="0" w:after="0" w:line="240" w:lineRule="auto"/>
+      </w:pPr>
+      <w:r>
+        <w:rPr>
+          <w:rFonts w:ascii="Courier New" w:hAnsi="Courier New" w:eastAsia="Courier New"/>
+          <w:sz w:val="15"/>
+        </w:rPr>
+        <w:t>│   └── visual/</w:t>
+      </w:r>
+    </w:p>
+    <w:p>
+      <w:pPr>
+        <w:keepLines w:val="0"/>
+        <w:widowControl w:val="0"/>
+        <w:spacing w:before="0" w:after="0" w:line="240" w:lineRule="auto"/>
+      </w:pPr>
+      <w:r>
+        <w:rPr>
+          <w:rFonts w:ascii="Courier New" w:hAnsi="Courier New" w:eastAsia="Courier New"/>
+          <w:sz w:val="15"/>
+        </w:rPr>
+        <w:t>│       ├── architecture/</w:t>
+      </w:r>
+    </w:p>
+    <w:p>
+      <w:pPr>
+        <w:keepLines w:val="0"/>
+        <w:widowControl w:val="0"/>
+        <w:spacing w:before="0" w:after="0" w:line="240" w:lineRule="auto"/>
+      </w:pPr>
+      <w:r>
+        <w:rPr>
+          <w:rFonts w:ascii="Courier New" w:hAnsi="Courier New" w:eastAsia="Courier New"/>
+          <w:sz w:val="15"/>
+        </w:rPr>
+        <w:t>│       │   ├── diagrama-arquitectura-frontend.png</w:t>
+      </w:r>
+    </w:p>
+    <w:p>
+      <w:pPr>
+        <w:keepLines w:val="0"/>
+        <w:widowControl w:val="0"/>
+        <w:spacing w:before="0" w:after="0" w:line="240" w:lineRule="auto"/>
+      </w:pPr>
+      <w:r>
+        <w:rPr>
+          <w:rFonts w:ascii="Courier New" w:hAnsi="Courier New" w:eastAsia="Courier New"/>
+          <w:sz w:val="15"/>
+        </w:rPr>
+        <w:t>│       │   ├── diagrama-arquitectura-frontend.svg</w:t>
+      </w:r>
+    </w:p>
+    <w:p>
+      <w:pPr>
+        <w:keepLines w:val="0"/>
+        <w:widowControl w:val="0"/>
+        <w:spacing w:before="0" w:after="0" w:line="240" w:lineRule="auto"/>
+      </w:pPr>
+      <w:r>
+        <w:rPr>
+          <w:rFonts w:ascii="Courier New" w:hAnsi="Courier New" w:eastAsia="Courier New"/>
+          <w:sz w:val="15"/>
+        </w:rPr>
+        <w:t>│       │   ├── diagrama-navegacion-frontend.png</w:t>
+      </w:r>
+    </w:p>
+    <w:p>
+      <w:pPr>
+        <w:keepLines w:val="0"/>
+        <w:widowControl w:val="0"/>
+        <w:spacing w:before="0" w:after="0" w:line="240" w:lineRule="auto"/>
+      </w:pPr>
+      <w:r>
+        <w:rPr>
+          <w:rFonts w:ascii="Courier New" w:hAnsi="Courier New" w:eastAsia="Courier New"/>
+          <w:sz w:val="15"/>
+        </w:rPr>
+        <w:t>│       │   └── diagrama-navegacion-frontend.svg</w:t>
+      </w:r>
+    </w:p>
+    <w:p>
+      <w:pPr>
+        <w:keepLines w:val="0"/>
+        <w:widowControl w:val="0"/>
+        <w:spacing w:before="0" w:after="0" w:line="240" w:lineRule="auto"/>
+      </w:pPr>
+      <w:r>
+        <w:rPr>
+          <w:rFonts w:ascii="Courier New" w:hAnsi="Courier New" w:eastAsia="Courier New"/>
+          <w:sz w:val="15"/>
+        </w:rPr>
+        <w:t>│       └── wireframes/</w:t>
+      </w:r>
+    </w:p>
+    <w:p>
+      <w:pPr>
+        <w:keepLines w:val="0"/>
+        <w:widowControl w:val="0"/>
+        <w:spacing w:before="0" w:after="0" w:line="240" w:lineRule="auto"/>
+      </w:pPr>
+      <w:r>
+        <w:rPr>
+          <w:rFonts w:ascii="Courier New" w:hAnsi="Courier New" w:eastAsia="Courier New"/>
+          <w:sz w:val="15"/>
+        </w:rPr>
+        <w:t>│           ├── WF-01_StartScreen.png</w:t>
+      </w:r>
+    </w:p>
+    <w:p>
+      <w:pPr>
+        <w:keepLines w:val="0"/>
+        <w:widowControl w:val="0"/>
+        <w:spacing w:before="0" w:after="0" w:line="240" w:lineRule="auto"/>
+      </w:pPr>
+      <w:r>
+        <w:rPr>
+          <w:rFonts w:ascii="Courier New" w:hAnsi="Courier New" w:eastAsia="Courier New"/>
+          <w:sz w:val="15"/>
+        </w:rPr>
+        <w:t>│           ├── WF-02_RegisterScreen.png</w:t>
+      </w:r>
+    </w:p>
+    <w:p>
+      <w:pPr>
+        <w:keepLines w:val="0"/>
+        <w:widowControl w:val="0"/>
+        <w:spacing w:before="0" w:after="0" w:line="240" w:lineRule="auto"/>
+      </w:pPr>
+      <w:r>
+        <w:rPr>
+          <w:rFonts w:ascii="Courier New" w:hAnsi="Courier New" w:eastAsia="Courier New"/>
+          <w:sz w:val="15"/>
+        </w:rPr>
+        <w:t>│           ├── WF-03_LoginScreen.png</w:t>
+      </w:r>
+    </w:p>
+    <w:p>
+      <w:pPr>
+        <w:keepLines w:val="0"/>
+        <w:widowControl w:val="0"/>
+        <w:spacing w:before="0" w:after="0" w:line="240" w:lineRule="auto"/>
+      </w:pPr>
+      <w:r>
+        <w:rPr>
+          <w:rFonts w:ascii="Courier New" w:hAnsi="Courier New" w:eastAsia="Courier New"/>
+          <w:sz w:val="15"/>
+        </w:rPr>
+        <w:t>│           ├── WF-04_HomeScreen.png</w:t>
+      </w:r>
+    </w:p>
+    <w:p>
+      <w:pPr>
+        <w:keepLines w:val="0"/>
+        <w:widowControl w:val="0"/>
+        <w:spacing w:before="0" w:after="0" w:line="240" w:lineRule="auto"/>
+      </w:pPr>
+      <w:r>
+        <w:rPr>
+          <w:rFonts w:ascii="Courier New" w:hAnsi="Courier New" w:eastAsia="Courier New"/>
+          <w:sz w:val="15"/>
+        </w:rPr>
+        <w:t>│           ├── WF-05_ActivitiesScreen.png</w:t>
+      </w:r>
+    </w:p>
+    <w:p>
+      <w:pPr>
+        <w:keepLines w:val="0"/>
+        <w:widowControl w:val="0"/>
+        <w:spacing w:before="0" w:after="0" w:line="240" w:lineRule="auto"/>
+      </w:pPr>
+      <w:r>
+        <w:rPr>
+          <w:rFonts w:ascii="Courier New" w:hAnsi="Courier New" w:eastAsia="Courier New"/>
+          <w:sz w:val="15"/>
+        </w:rPr>
+        <w:t>│           ├── WF-06_ProgressScreen.png</w:t>
+      </w:r>
+    </w:p>
+    <w:p>
+      <w:pPr>
+        <w:keepLines w:val="0"/>
+        <w:widowControl w:val="0"/>
+        <w:spacing w:before="0" w:after="0" w:line="240" w:lineRule="auto"/>
+      </w:pPr>
+      <w:r>
+        <w:rPr>
+          <w:rFonts w:ascii="Courier New" w:hAnsi="Courier New" w:eastAsia="Courier New"/>
+          <w:sz w:val="15"/>
+        </w:rPr>
+        <w:t>│           ├── WF-07_ProfileScreen.png</w:t>
+      </w:r>
+    </w:p>
+    <w:p>
+      <w:pPr>
+        <w:keepLines w:val="0"/>
+        <w:widowControl w:val="0"/>
+        <w:spacing w:before="0" w:after="0" w:line="240" w:lineRule="auto"/>
+      </w:pPr>
+      <w:r>
+        <w:rPr>
+          <w:rFonts w:ascii="Courier New" w:hAnsi="Courier New" w:eastAsia="Courier New"/>
+          <w:sz w:val="15"/>
+        </w:rPr>
+        <w:t>│           ├── WF-08_LessonScreen.png</w:t>
+      </w:r>
+    </w:p>
+    <w:p>
+      <w:pPr>
+        <w:keepLines w:val="0"/>
+        <w:widowControl w:val="0"/>
+        <w:spacing w:before="0" w:after="0" w:line="240" w:lineRule="auto"/>
+      </w:pPr>
+      <w:r>
+        <w:rPr>
+          <w:rFonts w:ascii="Courier New" w:hAnsi="Courier New" w:eastAsia="Courier New"/>
+          <w:sz w:val="15"/>
+        </w:rPr>
+        <w:t>│           ├── WF-09_SessionSummary.png</w:t>
+      </w:r>
+    </w:p>
+    <w:p>
+      <w:pPr>
+        <w:keepLines w:val="0"/>
+        <w:widowControl w:val="0"/>
+        <w:spacing w:before="0" w:after="0" w:line="240" w:lineRule="auto"/>
+      </w:pPr>
+      <w:r>
+        <w:rPr>
+          <w:rFonts w:ascii="Courier New" w:hAnsi="Courier New" w:eastAsia="Courier New"/>
+          <w:sz w:val="15"/>
+        </w:rPr>
+        <w:t>│           ├── WF-10_ReadingScreen.png</w:t>
+      </w:r>
+    </w:p>
+    <w:p>
+      <w:pPr>
+        <w:keepLines w:val="0"/>
+        <w:widowControl w:val="0"/>
+        <w:spacing w:before="0" w:after="0" w:line="240" w:lineRule="auto"/>
+      </w:pPr>
+      <w:r>
+        <w:rPr>
+          <w:rFonts w:ascii="Courier New" w:hAnsi="Courier New" w:eastAsia="Courier New"/>
+          <w:sz w:val="15"/>
+        </w:rPr>
+        <w:t>│           ├── WF-11_TheoryScreen.png</w:t>
+      </w:r>
+    </w:p>
+    <w:p>
+      <w:pPr>
+        <w:keepLines w:val="0"/>
+        <w:widowControl w:val="0"/>
+        <w:spacing w:before="0" w:after="0" w:line="240" w:lineRule="auto"/>
+      </w:pPr>
+      <w:r>
+        <w:rPr>
+          <w:rFonts w:ascii="Courier New" w:hAnsi="Courier New" w:eastAsia="Courier New"/>
+          <w:sz w:val="15"/>
+        </w:rPr>
+        <w:t>│           └── WF-12_PronunciationScreen.png</w:t>
+      </w:r>
+    </w:p>
+    <w:p>
+      <w:pPr>
+        <w:keepLines w:val="0"/>
+        <w:widowControl w:val="0"/>
+        <w:spacing w:before="0" w:after="0" w:line="240" w:lineRule="auto"/>
+      </w:pPr>
+      <w:r>
+        <w:rPr>
+          <w:rFonts w:ascii="Courier New" w:hAnsi="Courier New" w:eastAsia="Courier New"/>
+          <w:sz w:val="15"/>
+        </w:rPr>
+        <w:t>├── imagenes/</w:t>
+      </w:r>
+    </w:p>
+    <w:p>
+      <w:pPr>
+        <w:keepLines w:val="0"/>
+        <w:widowControl w:val="0"/>
+        <w:spacing w:before="0" w:after="0" w:line="240" w:lineRule="auto"/>
+      </w:pPr>
+      <w:r>
+        <w:rPr>
+          <w:rFonts w:ascii="Courier New" w:hAnsi="Courier New" w:eastAsia="Courier New"/>
+          <w:sz w:val="15"/>
+        </w:rPr>
+        <w:t>│   └── logo.jpeg</w:t>
+      </w:r>
+    </w:p>
+    <w:p>
+      <w:pPr>
+        <w:keepLines w:val="0"/>
+        <w:widowControl w:val="0"/>
+        <w:spacing w:before="0" w:after="0" w:line="240" w:lineRule="auto"/>
+      </w:pPr>
+      <w:r>
+        <w:rPr>
+          <w:rFonts w:ascii="Courier New" w:hAnsi="Courier New" w:eastAsia="Courier New"/>
+          <w:sz w:val="15"/>
+        </w:rPr>
+        <w:t>├── screens/</w:t>
+      </w:r>
+    </w:p>
+    <w:p>
+      <w:pPr>
+        <w:keepLines w:val="0"/>
+        <w:widowControl w:val="0"/>
+        <w:spacing w:before="0" w:after="0" w:line="240" w:lineRule="auto"/>
+      </w:pPr>
+      <w:r>
+        <w:rPr>
+          <w:rFonts w:ascii="Courier New" w:hAnsi="Courier New" w:eastAsia="Courier New"/>
+          <w:sz w:val="15"/>
+        </w:rPr>
+        <w:t>│   ├── ActivitiesScreen.js</w:t>
+      </w:r>
+    </w:p>
+    <w:p>
+      <w:pPr>
+        <w:keepLines w:val="0"/>
+        <w:widowControl w:val="0"/>
+        <w:spacing w:before="0" w:after="0" w:line="240" w:lineRule="auto"/>
+      </w:pPr>
+      <w:r>
+        <w:rPr>
+          <w:rFonts w:ascii="Courier New" w:hAnsi="Courier New" w:eastAsia="Courier New"/>
+          <w:sz w:val="15"/>
+        </w:rPr>
+        <w:t>│   ├── HomeScreen.js</w:t>
+      </w:r>
+    </w:p>
+    <w:p>
+      <w:pPr>
+        <w:keepLines w:val="0"/>
+        <w:widowControl w:val="0"/>
+        <w:spacing w:before="0" w:after="0" w:line="240" w:lineRule="auto"/>
+      </w:pPr>
+      <w:r>
+        <w:rPr>
+          <w:rFonts w:ascii="Courier New" w:hAnsi="Courier New" w:eastAsia="Courier New"/>
+          <w:sz w:val="15"/>
+        </w:rPr>
+        <w:t>│   ├── LessonScreen.js</w:t>
+      </w:r>
+    </w:p>
+    <w:p>
+      <w:pPr>
+        <w:keepLines w:val="0"/>
+        <w:widowControl w:val="0"/>
+        <w:spacing w:before="0" w:after="0" w:line="240" w:lineRule="auto"/>
+      </w:pPr>
+      <w:r>
+        <w:rPr>
+          <w:rFonts w:ascii="Courier New" w:hAnsi="Courier New" w:eastAsia="Courier New"/>
+          <w:sz w:val="15"/>
+        </w:rPr>
+        <w:t>│   ├── LoginScreen.js</w:t>
+      </w:r>
+    </w:p>
+    <w:p>
+      <w:pPr>
+        <w:keepLines w:val="0"/>
+        <w:widowControl w:val="0"/>
+        <w:spacing w:before="0" w:after="0" w:line="240" w:lineRule="auto"/>
+      </w:pPr>
+      <w:r>
+        <w:rPr>
+          <w:rFonts w:ascii="Courier New" w:hAnsi="Courier New" w:eastAsia="Courier New"/>
+          <w:sz w:val="15"/>
+        </w:rPr>
+        <w:t>│   ├── ProfileScreen.js</w:t>
+      </w:r>
+    </w:p>
+    <w:p>
+      <w:pPr>
+        <w:keepLines w:val="0"/>
+        <w:widowControl w:val="0"/>
+        <w:spacing w:before="0" w:after="0" w:line="240" w:lineRule="auto"/>
+      </w:pPr>
+      <w:r>
+        <w:rPr>
+          <w:rFonts w:ascii="Courier New" w:hAnsi="Courier New" w:eastAsia="Courier New"/>
+          <w:sz w:val="15"/>
+        </w:rPr>
+        <w:t>│   ├── ProgressScreen.js</w:t>
+      </w:r>
+    </w:p>
+    <w:p>
+      <w:pPr>
+        <w:keepLines w:val="0"/>
+        <w:widowControl w:val="0"/>
+        <w:spacing w:before="0" w:after="0" w:line="240" w:lineRule="auto"/>
+      </w:pPr>
+      <w:r>
+        <w:rPr>
+          <w:rFonts w:ascii="Courier New" w:hAnsi="Courier New" w:eastAsia="Courier New"/>
+          <w:sz w:val="15"/>
+        </w:rPr>
+        <w:t>│   ├── PronunciationScreen.js</w:t>
+      </w:r>
+    </w:p>
+    <w:p>
+      <w:pPr>
+        <w:keepLines w:val="0"/>
+        <w:widowControl w:val="0"/>
+        <w:spacing w:before="0" w:after="0" w:line="240" w:lineRule="auto"/>
+      </w:pPr>
+      <w:r>
+        <w:rPr>
+          <w:rFonts w:ascii="Courier New" w:hAnsi="Courier New" w:eastAsia="Courier New"/>
+          <w:sz w:val="15"/>
+        </w:rPr>
+        <w:t>│   ├── ReadingScreen.js</w:t>
+      </w:r>
+    </w:p>
+    <w:p>
+      <w:pPr>
+        <w:keepLines w:val="0"/>
+        <w:widowControl w:val="0"/>
+        <w:spacing w:before="0" w:after="0" w:line="240" w:lineRule="auto"/>
+      </w:pPr>
+      <w:r>
+        <w:rPr>
+          <w:rFonts w:ascii="Courier New" w:hAnsi="Courier New" w:eastAsia="Courier New"/>
+          <w:sz w:val="15"/>
+        </w:rPr>
+        <w:t>│   ├── RegisterScreen.js</w:t>
+      </w:r>
+    </w:p>
+    <w:p>
+      <w:pPr>
+        <w:keepLines w:val="0"/>
+        <w:widowControl w:val="0"/>
+        <w:spacing w:before="0" w:after="0" w:line="240" w:lineRule="auto"/>
+      </w:pPr>
+      <w:r>
+        <w:rPr>
+          <w:rFonts w:ascii="Courier New" w:hAnsi="Courier New" w:eastAsia="Courier New"/>
+          <w:sz w:val="15"/>
+        </w:rPr>
+        <w:t>│   ├── StartScreen.js</w:t>
+      </w:r>
+    </w:p>
+    <w:p>
+      <w:pPr>
+        <w:keepLines w:val="0"/>
+        <w:widowControl w:val="0"/>
+        <w:spacing w:before="0" w:after="0" w:line="240" w:lineRule="auto"/>
+      </w:pPr>
+      <w:r>
+        <w:rPr>
+          <w:rFonts w:ascii="Courier New" w:hAnsi="Courier New" w:eastAsia="Courier New"/>
+          <w:sz w:val="15"/>
+        </w:rPr>
+        <w:t>│   └── TheoryScreen.js</w:t>
+      </w:r>
+    </w:p>
+    <w:p>
+      <w:pPr>
+        <w:keepLines w:val="0"/>
+        <w:widowControl w:val="0"/>
+        <w:spacing w:before="0" w:after="0" w:line="240" w:lineRule="auto"/>
+      </w:pPr>
+      <w:r>
+        <w:rPr>
+          <w:rFonts w:ascii="Courier New" w:hAnsi="Courier New" w:eastAsia="Courier New"/>
+          <w:sz w:val="15"/>
+        </w:rPr>
+        <w:t>├── services/</w:t>
+      </w:r>
+    </w:p>
+    <w:p>
+      <w:pPr>
+        <w:keepLines w:val="0"/>
+        <w:widowControl w:val="0"/>
+        <w:spacing w:before="0" w:after="0" w:line="240" w:lineRule="auto"/>
+      </w:pPr>
+      <w:r>
+        <w:rPr>
+          <w:rFonts w:ascii="Courier New" w:hAnsi="Courier New" w:eastAsia="Courier New"/>
+          <w:sz w:val="15"/>
+        </w:rPr>
+        <w:t>│   ├── achievementService.js</w:t>
+      </w:r>
+    </w:p>
+    <w:p>
+      <w:pPr>
+        <w:keepLines w:val="0"/>
+        <w:widowControl w:val="0"/>
+        <w:spacing w:before="0" w:after="0" w:line="240" w:lineRule="auto"/>
+      </w:pPr>
+      <w:r>
+        <w:rPr>
+          <w:rFonts w:ascii="Courier New" w:hAnsi="Courier New" w:eastAsia="Courier New"/>
+          <w:sz w:val="15"/>
+        </w:rPr>
+        <w:t>│   ├── activityService.js</w:t>
+      </w:r>
+    </w:p>
+    <w:p>
+      <w:pPr>
+        <w:keepLines w:val="0"/>
+        <w:widowControl w:val="0"/>
+        <w:spacing w:before="0" w:after="0" w:line="240" w:lineRule="auto"/>
+      </w:pPr>
+      <w:r>
+        <w:rPr>
+          <w:rFonts w:ascii="Courier New" w:hAnsi="Courier New" w:eastAsia="Courier New"/>
+          <w:sz w:val="15"/>
+        </w:rPr>
+        <w:t>│   ├── apiService.js</w:t>
+      </w:r>
+    </w:p>
+    <w:p>
+      <w:pPr>
+        <w:keepLines w:val="0"/>
+        <w:widowControl w:val="0"/>
+        <w:spacing w:before="0" w:after="0" w:line="240" w:lineRule="auto"/>
+      </w:pPr>
+      <w:r>
+        <w:rPr>
+          <w:rFonts w:ascii="Courier New" w:hAnsi="Courier New" w:eastAsia="Courier New"/>
+          <w:sz w:val="15"/>
+        </w:rPr>
+        <w:t>│   ├── authService.js</w:t>
+      </w:r>
+    </w:p>
+    <w:p>
+      <w:pPr>
+        <w:keepLines w:val="0"/>
+        <w:widowControl w:val="0"/>
+        <w:spacing w:before="0" w:after="0" w:line="240" w:lineRule="auto"/>
+      </w:pPr>
+      <w:r>
+        <w:rPr>
+          <w:rFonts w:ascii="Courier New" w:hAnsi="Courier New" w:eastAsia="Courier New"/>
+          <w:sz w:val="15"/>
+        </w:rPr>
+        <w:t>│   ├── authServiceCore.js</w:t>
+      </w:r>
+    </w:p>
+    <w:p>
+      <w:pPr>
+        <w:keepLines w:val="0"/>
+        <w:widowControl w:val="0"/>
+        <w:spacing w:before="0" w:after="0" w:line="240" w:lineRule="auto"/>
+      </w:pPr>
+      <w:r>
+        <w:rPr>
+          <w:rFonts w:ascii="Courier New" w:hAnsi="Courier New" w:eastAsia="Courier New"/>
+          <w:sz w:val="15"/>
+        </w:rPr>
+        <w:t>│   ├── germanVoiceService.js</w:t>
+      </w:r>
+    </w:p>
+    <w:p>
+      <w:pPr>
+        <w:keepLines w:val="0"/>
+        <w:widowControl w:val="0"/>
+        <w:spacing w:before="0" w:after="0" w:line="240" w:lineRule="auto"/>
+      </w:pPr>
+      <w:r>
+        <w:rPr>
+          <w:rFonts w:ascii="Courier New" w:hAnsi="Courier New" w:eastAsia="Courier New"/>
+          <w:sz w:val="15"/>
+        </w:rPr>
+        <w:t>│   ├── hapticFeedback.js</w:t>
+      </w:r>
+    </w:p>
+    <w:p>
+      <w:pPr>
+        <w:keepLines w:val="0"/>
+        <w:widowControl w:val="0"/>
+        <w:spacing w:before="0" w:after="0" w:line="240" w:lineRule="auto"/>
+      </w:pPr>
+      <w:r>
+        <w:rPr>
+          <w:rFonts w:ascii="Courier New" w:hAnsi="Courier New" w:eastAsia="Courier New"/>
+          <w:sz w:val="15"/>
+        </w:rPr>
+        <w:t>│   ├── learningPathService.js</w:t>
+      </w:r>
+    </w:p>
+    <w:p>
+      <w:pPr>
+        <w:keepLines w:val="0"/>
+        <w:widowControl w:val="0"/>
+        <w:spacing w:before="0" w:after="0" w:line="240" w:lineRule="auto"/>
+      </w:pPr>
+      <w:r>
+        <w:rPr>
+          <w:rFonts w:ascii="Courier New" w:hAnsi="Courier New" w:eastAsia="Courier New"/>
+          <w:sz w:val="15"/>
+        </w:rPr>
+        <w:t>│   ├── learningProgressService.js</w:t>
+      </w:r>
+    </w:p>
+    <w:p>
+      <w:pPr>
+        <w:keepLines w:val="0"/>
+        <w:widowControl w:val="0"/>
+        <w:spacing w:before="0" w:after="0" w:line="240" w:lineRule="auto"/>
+      </w:pPr>
+      <w:r>
+        <w:rPr>
+          <w:rFonts w:ascii="Courier New" w:hAnsi="Courier New" w:eastAsia="Courier New"/>
+          <w:sz w:val="15"/>
+        </w:rPr>
+        <w:t>│   ├── lessonProgressService.js</w:t>
+      </w:r>
+    </w:p>
+    <w:p>
+      <w:pPr>
+        <w:keepLines w:val="0"/>
+        <w:widowControl w:val="0"/>
+        <w:spacing w:before="0" w:after="0" w:line="240" w:lineRule="auto"/>
+      </w:pPr>
+      <w:r>
+        <w:rPr>
+          <w:rFonts w:ascii="Courier New" w:hAnsi="Courier New" w:eastAsia="Courier New"/>
+          <w:sz w:val="15"/>
+        </w:rPr>
+        <w:t>│   ├── lessonService.js</w:t>
+      </w:r>
+    </w:p>
+    <w:p>
+      <w:pPr>
+        <w:keepLines w:val="0"/>
+        <w:widowControl w:val="0"/>
+        <w:spacing w:before="0" w:after="0" w:line="240" w:lineRule="auto"/>
+      </w:pPr>
+      <w:r>
+        <w:rPr>
+          <w:rFonts w:ascii="Courier New" w:hAnsi="Courier New" w:eastAsia="Courier New"/>
+          <w:sz w:val="15"/>
+        </w:rPr>
+        <w:t>│   ├── mascotRewardsService.js</w:t>
+      </w:r>
+    </w:p>
+    <w:p>
+      <w:pPr>
+        <w:keepLines w:val="0"/>
+        <w:widowControl w:val="0"/>
+        <w:spacing w:before="0" w:after="0" w:line="240" w:lineRule="auto"/>
+      </w:pPr>
+      <w:r>
+        <w:rPr>
+          <w:rFonts w:ascii="Courier New" w:hAnsi="Courier New" w:eastAsia="Courier New"/>
+          <w:sz w:val="15"/>
+        </w:rPr>
+        <w:t>│   ├── placementAssessmentService.js</w:t>
+      </w:r>
+    </w:p>
+    <w:p>
+      <w:pPr>
+        <w:keepLines w:val="0"/>
+        <w:widowControl w:val="0"/>
+        <w:spacing w:before="0" w:after="0" w:line="240" w:lineRule="auto"/>
+      </w:pPr>
+      <w:r>
+        <w:rPr>
+          <w:rFonts w:ascii="Courier New" w:hAnsi="Courier New" w:eastAsia="Courier New"/>
+          <w:sz w:val="15"/>
+        </w:rPr>
+        <w:t>│   ├── profileService.js</w:t>
+      </w:r>
+    </w:p>
+    <w:p>
+      <w:pPr>
+        <w:keepLines w:val="0"/>
+        <w:widowControl w:val="0"/>
+        <w:spacing w:before="0" w:after="0" w:line="240" w:lineRule="auto"/>
+      </w:pPr>
+      <w:r>
+        <w:rPr>
+          <w:rFonts w:ascii="Courier New" w:hAnsi="Courier New" w:eastAsia="Courier New"/>
+          <w:sz w:val="15"/>
+        </w:rPr>
+        <w:t>│   ├── progressService.js</w:t>
+      </w:r>
+    </w:p>
+    <w:p>
+      <w:pPr>
+        <w:keepLines w:val="0"/>
+        <w:widowControl w:val="0"/>
+        <w:spacing w:before="0" w:after="0" w:line="240" w:lineRule="auto"/>
+      </w:pPr>
+      <w:r>
+        <w:rPr>
+          <w:rFonts w:ascii="Courier New" w:hAnsi="Courier New" w:eastAsia="Courier New"/>
+          <w:sz w:val="15"/>
+        </w:rPr>
+        <w:t>│   └── spacedRepetitionService.js</w:t>
+      </w:r>
+    </w:p>
+    <w:p>
+      <w:pPr>
+        <w:keepLines w:val="0"/>
+        <w:widowControl w:val="0"/>
+        <w:spacing w:before="0" w:after="0" w:line="240" w:lineRule="auto"/>
+      </w:pPr>
+      <w:r>
+        <w:rPr>
+          <w:rFonts w:ascii="Courier New" w:hAnsi="Courier New" w:eastAsia="Courier New"/>
+          <w:sz w:val="15"/>
+        </w:rPr>
+        <w:t>├── tests/</w:t>
+      </w:r>
+    </w:p>
+    <w:p>
+      <w:pPr>
+        <w:keepLines w:val="0"/>
+        <w:widowControl w:val="0"/>
+        <w:spacing w:before="0" w:after="0" w:line="240" w:lineRule="auto"/>
+      </w:pPr>
+      <w:r>
+        <w:rPr>
+          <w:rFonts w:ascii="Courier New" w:hAnsi="Courier New" w:eastAsia="Courier New"/>
+          <w:sz w:val="15"/>
+        </w:rPr>
+        <w:t>│   ├── critical-flows.test.mjs</w:t>
+      </w:r>
+    </w:p>
+    <w:p>
+      <w:pPr>
+        <w:keepLines w:val="0"/>
+        <w:widowControl w:val="0"/>
+        <w:spacing w:before="0" w:after="0" w:line="240" w:lineRule="auto"/>
+      </w:pPr>
+      <w:r>
+        <w:rPr>
+          <w:rFonts w:ascii="Courier New" w:hAnsi="Courier New" w:eastAsia="Courier New"/>
+          <w:sz w:val="15"/>
+        </w:rPr>
+        <w:t>│   └── progress.test.mjs</w:t>
+      </w:r>
+    </w:p>
+    <w:p>
+      <w:pPr>
+        <w:keepLines w:val="0"/>
+        <w:widowControl w:val="0"/>
+        <w:spacing w:before="0" w:after="0" w:line="240" w:lineRule="auto"/>
+      </w:pPr>
+      <w:r>
+        <w:rPr>
+          <w:rFonts w:ascii="Courier New" w:hAnsi="Courier New" w:eastAsia="Courier New"/>
+          <w:sz w:val="15"/>
+        </w:rPr>
+        <w:t>├── .gitignore</w:t>
+      </w:r>
+    </w:p>
+    <w:p>
+      <w:pPr>
+        <w:keepLines w:val="0"/>
+        <w:widowControl w:val="0"/>
+        <w:spacing w:before="0" w:after="0" w:line="240" w:lineRule="auto"/>
+      </w:pPr>
+      <w:r>
+        <w:rPr>
+          <w:rFonts w:ascii="Courier New" w:hAnsi="Courier New" w:eastAsia="Courier New"/>
+          <w:sz w:val="15"/>
+        </w:rPr>
+        <w:t>├── AGENTS.md</w:t>
+      </w:r>
+    </w:p>
+    <w:p>
+      <w:pPr>
+        <w:keepLines w:val="0"/>
+        <w:widowControl w:val="0"/>
+        <w:spacing w:before="0" w:after="0" w:line="240" w:lineRule="auto"/>
+      </w:pPr>
+      <w:r>
+        <w:rPr>
+          <w:rFonts w:ascii="Courier New" w:hAnsi="Courier New" w:eastAsia="Courier New"/>
+          <w:sz w:val="15"/>
+        </w:rPr>
+        <w:t>├── App.js</w:t>
+      </w:r>
+    </w:p>
+    <w:p>
+      <w:pPr>
+        <w:keepLines w:val="0"/>
+        <w:widowControl w:val="0"/>
+        <w:spacing w:before="0" w:after="0" w:line="240" w:lineRule="auto"/>
+      </w:pPr>
+      <w:r>
+        <w:rPr>
+          <w:rFonts w:ascii="Courier New" w:hAnsi="Courier New" w:eastAsia="Courier New"/>
+          <w:sz w:val="15"/>
+        </w:rPr>
+        <w:t>├── app.json</w:t>
+      </w:r>
+    </w:p>
+    <w:p>
+      <w:pPr>
+        <w:keepLines w:val="0"/>
+        <w:widowControl w:val="0"/>
+        <w:spacing w:before="0" w:after="0" w:line="240" w:lineRule="auto"/>
+      </w:pPr>
+      <w:r>
+        <w:rPr>
+          <w:rFonts w:ascii="Courier New" w:hAnsi="Courier New" w:eastAsia="Courier New"/>
+          <w:sz w:val="15"/>
+        </w:rPr>
+        <w:t>├── CLAUDE.md</w:t>
+      </w:r>
+    </w:p>
+    <w:p>
+      <w:pPr>
+        <w:keepLines w:val="0"/>
+        <w:widowControl w:val="0"/>
+        <w:spacing w:before="0" w:after="0" w:line="240" w:lineRule="auto"/>
+      </w:pPr>
+      <w:r>
+        <w:rPr>
+          <w:rFonts w:ascii="Courier New" w:hAnsi="Courier New" w:eastAsia="Courier New"/>
+          <w:sz w:val="15"/>
+        </w:rPr>
+        <w:t>├── DESIGN_SYSTEM.md</w:t>
+      </w:r>
+    </w:p>
+    <w:p>
+      <w:pPr>
+        <w:keepLines w:val="0"/>
+        <w:widowControl w:val="0"/>
+        <w:spacing w:before="0" w:after="0" w:line="240" w:lineRule="auto"/>
+      </w:pPr>
+      <w:r>
+        <w:rPr>
+          <w:rFonts w:ascii="Courier New" w:hAnsi="Courier New" w:eastAsia="Courier New"/>
+          <w:sz w:val="15"/>
+        </w:rPr>
+        <w:t>├── DIAGNOSTICO_AUDITORIA_FRONTEND.md</w:t>
+      </w:r>
+    </w:p>
+    <w:p>
+      <w:pPr>
+        <w:keepLines w:val="0"/>
+        <w:widowControl w:val="0"/>
+        <w:spacing w:before="0" w:after="0" w:line="240" w:lineRule="auto"/>
+      </w:pPr>
+      <w:r>
+        <w:rPr>
+          <w:rFonts w:ascii="Courier New" w:hAnsi="Courier New" w:eastAsia="Courier New"/>
+          <w:sz w:val="15"/>
+        </w:rPr>
+        <w:t>├── index.js</w:t>
+      </w:r>
+    </w:p>
+    <w:p>
+      <w:pPr>
+        <w:keepLines w:val="0"/>
+        <w:widowControl w:val="0"/>
+        <w:spacing w:before="0" w:after="0" w:line="240" w:lineRule="auto"/>
+      </w:pPr>
+      <w:r>
+        <w:rPr>
+          <w:rFonts w:ascii="Courier New" w:hAnsi="Courier New" w:eastAsia="Courier New"/>
+          <w:sz w:val="15"/>
+        </w:rPr>
+        <w:t>├── Informe_Frontend_Sprache_APA.docx</w:t>
+      </w:r>
+    </w:p>
+    <w:p>
+      <w:pPr>
+        <w:keepLines w:val="0"/>
+        <w:widowControl w:val="0"/>
+        <w:spacing w:before="0" w:after="0" w:line="240" w:lineRule="auto"/>
+      </w:pPr>
+      <w:r>
+        <w:rPr>
+          <w:rFonts w:ascii="Courier New" w:hAnsi="Courier New" w:eastAsia="Courier New"/>
+          <w:sz w:val="15"/>
+        </w:rPr>
+        <w:t>├── LICENSE</w:t>
+      </w:r>
+    </w:p>
+    <w:p>
+      <w:pPr>
+        <w:keepLines w:val="0"/>
+        <w:widowControl w:val="0"/>
+        <w:spacing w:before="0" w:after="0" w:line="240" w:lineRule="auto"/>
+      </w:pPr>
+      <w:r>
+        <w:rPr>
+          <w:rFonts w:ascii="Courier New" w:hAnsi="Courier New" w:eastAsia="Courier New"/>
+          <w:sz w:val="15"/>
+        </w:rPr>
+        <w:t>├── package-lock.json</w:t>
+      </w:r>
+    </w:p>
+    <w:p>
+      <w:pPr>
+        <w:keepLines w:val="0"/>
+        <w:widowControl w:val="0"/>
+        <w:spacing w:before="0" w:after="0" w:line="240" w:lineRule="auto"/>
+      </w:pPr>
+      <w:r>
+        <w:rPr>
+          <w:rFonts w:ascii="Courier New" w:hAnsi="Courier New" w:eastAsia="Courier New"/>
+          <w:sz w:val="15"/>
+        </w:rPr>
+        <w:t>├── package.json</w:t>
+      </w:r>
+    </w:p>
+    <w:p>
+      <w:pPr>
+        <w:keepLines w:val="0"/>
+        <w:widowControl w:val="0"/>
+        <w:spacing w:before="0" w:after="0" w:line="240" w:lineRule="auto"/>
+      </w:pPr>
+      <w:r>
+        <w:rPr>
+          <w:rFonts w:ascii="Courier New" w:hAnsi="Courier New" w:eastAsia="Courier New"/>
+          <w:sz w:val="15"/>
+        </w:rPr>
+        <w:t>└── theme.js</w:t>
+      </w:r>
+    </w:p>
+    <w:p>
+      <w:pPr>
+        <w:pStyle w:val="Heading2"/>
+      </w:pPr>
+      <w:r>
+        <w:t>Responsabilidades de los directorios principales</w:t>
+      </w:r>
+    </w:p>
+    <w:tbl>
+      <w:tblPr>
+        <w:tblStyle w:val="TableGrid"/>
+        <w:tblW w:type="auto" w:w="0"/>
+        <w:jc w:val="center"/>
+        <w:tblLayout w:type="fixed"/>
+        <w:tblLook w:firstColumn="1" w:firstRow="1" w:lastColumn="0" w:lastRow="0" w:noHBand="0" w:noVBand="1" w:val="04A0"/>
+      </w:tblPr>
+      <w:tblGrid>
+        <w:gridCol w:w="4680"/>
+        <w:gridCol w:w="4680"/>
+      </w:tblGrid>
+      <w:tr>
+        <w:tc>
+          <w:tcPr>
+            <w:tcW w:type="dxa" w:w="2304"/>
+            <w:shd w:fill="D9EAF7"/>
+          </w:tcPr>
+          <w:p>
+            <w:r>
+              <w:rPr>
+                <w:b/>
+                <w:sz w:val="18"/>
+              </w:rPr>
+              <w:t>Directorio</w:t>
+            </w:r>
+          </w:p>
+        </w:tc>
+        <w:tc>
+          <w:tcPr>
+            <w:tcW w:type="dxa" w:w="7056"/>
+            <w:shd w:fill="D9EAF7"/>
+          </w:tcPr>
+          <w:p>
+            <w:r>
+              <w:rPr>
+                <w:b/>
+                <w:sz w:val="18"/>
+              </w:rPr>
+              <w:t>Responsabilidad comprobada</w:t>
+            </w:r>
+          </w:p>
+        </w:tc>
+      </w:tr>
+      <w:tr>
+        <w:tc>
+          <w:tcPr>
+            <w:tcW w:type="dxa" w:w="2304"/>
+            <w:vAlign w:val="center"/>
+          </w:tcPr>
+          <w:p>
+            <w:pPr>
+              <w:spacing w:after="40"/>
+            </w:pPr>
+            <w:r>
+              <w:rPr>
+                <w:sz w:val="17"/>
+              </w:rPr>
+              <w:t>assets/</w:t>
+            </w:r>
+          </w:p>
+        </w:tc>
+        <w:tc>
+          <w:tcPr>
+            <w:tcW w:type="dxa" w:w="7056"/>
+            <w:vAlign w:val="center"/>
+          </w:tcPr>
+          <w:p>
+            <w:pPr>
+              <w:spacing w:after="40"/>
+            </w:pPr>
+            <w:r>
+              <w:rPr>
+                <w:sz w:val="17"/>
+              </w:rPr>
+              <w:t>Iconos, imágenes de marca, favicon y recursos de splash utilizados por Expo.</w:t>
+            </w:r>
+          </w:p>
+        </w:tc>
+      </w:tr>
+      <w:tr>
+        <w:tc>
+          <w:tcPr>
+            <w:tcW w:type="dxa" w:w="2304"/>
+            <w:vAlign w:val="center"/>
+          </w:tcPr>
+          <w:p>
+            <w:pPr>
+              <w:spacing w:after="40"/>
+            </w:pPr>
+            <w:r>
+              <w:rPr>
+                <w:sz w:val="17"/>
+              </w:rPr>
+              <w:t>components/</w:t>
+            </w:r>
+          </w:p>
+        </w:tc>
+        <w:tc>
+          <w:tcPr>
+            <w:tcW w:type="dxa" w:w="7056"/>
+            <w:vAlign w:val="center"/>
+          </w:tcPr>
+          <w:p>
+            <w:pPr>
+              <w:spacing w:after="40"/>
+            </w:pPr>
+            <w:r>
+              <w:rPr>
+                <w:sz w:val="17"/>
+              </w:rPr>
+              <w:t>Componentes reutilizables agrupados en activities, common, home, learning, navigation, profile y progress.</w:t>
+            </w:r>
+          </w:p>
+        </w:tc>
+      </w:tr>
+      <w:tr>
+        <w:tc>
+          <w:tcPr>
+            <w:tcW w:type="dxa" w:w="2304"/>
+            <w:vAlign w:val="center"/>
+          </w:tcPr>
+          <w:p>
+            <w:pPr>
+              <w:spacing w:after="40"/>
+            </w:pPr>
+            <w:r>
+              <w:rPr>
+                <w:sz w:val="17"/>
+              </w:rPr>
+              <w:t>context/</w:t>
+            </w:r>
+          </w:p>
+        </w:tc>
+        <w:tc>
+          <w:tcPr>
+            <w:tcW w:type="dxa" w:w="7056"/>
+            <w:vAlign w:val="center"/>
+          </w:tcPr>
+          <w:p>
+            <w:pPr>
+              <w:spacing w:after="40"/>
+            </w:pPr>
+            <w:r>
+              <w:rPr>
+                <w:sz w:val="17"/>
+              </w:rPr>
+              <w:t>Estado compartido de la aplicación y preferencia de movimiento reducido.</w:t>
+            </w:r>
+          </w:p>
+        </w:tc>
+      </w:tr>
+      <w:tr>
+        <w:tc>
+          <w:tcPr>
+            <w:tcW w:type="dxa" w:w="2304"/>
+            <w:vAlign w:val="center"/>
+          </w:tcPr>
+          <w:p>
+            <w:pPr>
+              <w:spacing w:after="40"/>
+            </w:pPr>
+            <w:r>
+              <w:rPr>
+                <w:sz w:val="17"/>
+              </w:rPr>
+              <w:t>data/</w:t>
+            </w:r>
+          </w:p>
+        </w:tc>
+        <w:tc>
+          <w:tcPr>
+            <w:tcW w:type="dxa" w:w="7056"/>
+            <w:vAlign w:val="center"/>
+          </w:tcPr>
+          <w:p>
+            <w:pPr>
+              <w:spacing w:after="40"/>
+            </w:pPr>
+            <w:r>
+              <w:rPr>
+                <w:sz w:val="17"/>
+              </w:rPr>
+              <w:t>Perfil base, catálogo de actividades, lecciones, lecturas y módulos de teoría.</w:t>
+            </w:r>
+          </w:p>
+        </w:tc>
+      </w:tr>
+      <w:tr>
+        <w:tc>
+          <w:tcPr>
+            <w:tcW w:type="dxa" w:w="2304"/>
+            <w:vAlign w:val="center"/>
+          </w:tcPr>
+          <w:p>
+            <w:pPr>
+              <w:spacing w:after="40"/>
+            </w:pPr>
+            <w:r>
+              <w:rPr>
+                <w:sz w:val="17"/>
+              </w:rPr>
+              <w:t>docs/visual/architecture/</w:t>
+            </w:r>
+          </w:p>
+        </w:tc>
+        <w:tc>
+          <w:tcPr>
+            <w:tcW w:type="dxa" w:w="7056"/>
+            <w:vAlign w:val="center"/>
+          </w:tcPr>
+          <w:p>
+            <w:pPr>
+              <w:spacing w:after="40"/>
+            </w:pPr>
+            <w:r>
+              <w:rPr>
+                <w:sz w:val="17"/>
+              </w:rPr>
+              <w:t>Fuentes SVG e imágenes PNG de los diagramas de navegación y arquitectura frontend.</w:t>
+            </w:r>
+          </w:p>
+        </w:tc>
+      </w:tr>
+      <w:tr>
+        <w:tc>
+          <w:tcPr>
+            <w:tcW w:type="dxa" w:w="2304"/>
+            <w:vAlign w:val="center"/>
+          </w:tcPr>
+          <w:p>
+            <w:pPr>
+              <w:spacing w:after="40"/>
+            </w:pPr>
+            <w:r>
+              <w:rPr>
+                <w:sz w:val="17"/>
+              </w:rPr>
+              <w:t>docs/visual/wireframes/</w:t>
+            </w:r>
+          </w:p>
+        </w:tc>
+        <w:tc>
+          <w:tcPr>
+            <w:tcW w:type="dxa" w:w="7056"/>
+            <w:vAlign w:val="center"/>
+          </w:tcPr>
+          <w:p>
+            <w:pPr>
+              <w:spacing w:after="40"/>
+            </w:pPr>
+            <w:r>
+              <w:rPr>
+                <w:sz w:val="17"/>
+              </w:rPr>
+              <w:t>Doce wireframes aprobados, identificados por pantalla.</w:t>
+            </w:r>
+          </w:p>
+        </w:tc>
+      </w:tr>
+      <w:tr>
+        <w:tc>
+          <w:tcPr>
+            <w:tcW w:type="dxa" w:w="2304"/>
+            <w:vAlign w:val="center"/>
+          </w:tcPr>
+          <w:p>
+            <w:pPr>
+              <w:spacing w:after="40"/>
+            </w:pPr>
+            <w:r>
+              <w:rPr>
+                <w:sz w:val="17"/>
+              </w:rPr>
+              <w:t>imagenes/</w:t>
+            </w:r>
+          </w:p>
+        </w:tc>
+        <w:tc>
+          <w:tcPr>
+            <w:tcW w:type="dxa" w:w="7056"/>
+            <w:vAlign w:val="center"/>
+          </w:tcPr>
+          <w:p>
+            <w:pPr>
+              <w:spacing w:after="40"/>
+            </w:pPr>
+            <w:r>
+              <w:rPr>
+                <w:sz w:val="17"/>
+              </w:rPr>
+              <w:t>Recurso de logotipo del proyecto conservado en la raíz del frontend.</w:t>
+            </w:r>
+          </w:p>
+        </w:tc>
+      </w:tr>
+      <w:tr>
+        <w:tc>
+          <w:tcPr>
+            <w:tcW w:type="dxa" w:w="2304"/>
+            <w:vAlign w:val="center"/>
+          </w:tcPr>
+          <w:p>
+            <w:pPr>
+              <w:spacing w:after="40"/>
+            </w:pPr>
+            <w:r>
+              <w:rPr>
+                <w:sz w:val="17"/>
+              </w:rPr>
+              <w:t>screens/</w:t>
+            </w:r>
+          </w:p>
+        </w:tc>
+        <w:tc>
+          <w:tcPr>
+            <w:tcW w:type="dxa" w:w="7056"/>
+            <w:vAlign w:val="center"/>
+          </w:tcPr>
+          <w:p>
+            <w:pPr>
+              <w:spacing w:after="40"/>
+            </w:pPr>
+            <w:r>
+              <w:rPr>
+                <w:sz w:val="17"/>
+              </w:rPr>
+              <w:t>Pantallas de acceso, pestañas principales y contenidos de aprendizaje.</w:t>
+            </w:r>
+          </w:p>
+        </w:tc>
+      </w:tr>
+      <w:tr>
+        <w:tc>
+          <w:tcPr>
+            <w:tcW w:type="dxa" w:w="2304"/>
+            <w:vAlign w:val="center"/>
+          </w:tcPr>
+          <w:p>
+            <w:pPr>
+              <w:spacing w:after="40"/>
+            </w:pPr>
+            <w:r>
+              <w:rPr>
+                <w:sz w:val="17"/>
+              </w:rPr>
+              <w:t>services/</w:t>
+            </w:r>
+          </w:p>
+        </w:tc>
+        <w:tc>
+          <w:tcPr>
+            <w:tcW w:type="dxa" w:w="7056"/>
+            <w:vAlign w:val="center"/>
+          </w:tcPr>
+          <w:p>
+            <w:pPr>
+              <w:spacing w:after="40"/>
+            </w:pPr>
+            <w:r>
+              <w:rPr>
+                <w:sz w:val="17"/>
+              </w:rPr>
+              <w:t>Autenticación, perfil, progreso, lecciones, evaluación, ruta, repaso, logros, voz, háptica y cliente HTTP.</w:t>
+            </w:r>
+          </w:p>
+        </w:tc>
+      </w:tr>
+      <w:tr>
+        <w:tc>
+          <w:tcPr>
+            <w:tcW w:type="dxa" w:w="2304"/>
+            <w:vAlign w:val="center"/>
+          </w:tcPr>
+          <w:p>
+            <w:pPr>
+              <w:spacing w:after="40"/>
+            </w:pPr>
+            <w:r>
+              <w:rPr>
+                <w:sz w:val="17"/>
+              </w:rPr>
+              <w:t>tests/</w:t>
+            </w:r>
+          </w:p>
+        </w:tc>
+        <w:tc>
+          <w:tcPr>
+            <w:tcW w:type="dxa" w:w="7056"/>
+            <w:vAlign w:val="center"/>
+          </w:tcPr>
+          <w:p>
+            <w:pPr>
+              <w:spacing w:after="40"/>
+            </w:pPr>
+            <w:r>
+              <w:rPr>
+                <w:sz w:val="17"/>
+              </w:rPr>
+              <w:t>Pruebas automatizadas de flujos críticos y cálculos de progreso.</w:t>
+            </w:r>
+          </w:p>
+        </w:tc>
+      </w:tr>
+    </w:tbl>
+    <w:p>
+      <w:pPr>
+        <w:pStyle w:val="Heading2"/>
+      </w:pPr>
+      <w:r>
+        <w:t>Archivos de configuración y documentación importantes</w:t>
+      </w:r>
+    </w:p>
+    <w:tbl>
+      <w:tblPr>
+        <w:tblStyle w:val="TableGrid"/>
+        <w:tblW w:type="auto" w:w="0"/>
+        <w:jc w:val="center"/>
+        <w:tblLayout w:type="fixed"/>
+        <w:tblLook w:firstColumn="1" w:firstRow="1" w:lastColumn="0" w:lastRow="0" w:noHBand="0" w:noVBand="1" w:val="04A0"/>
+      </w:tblPr>
+      <w:tblGrid>
+        <w:gridCol w:w="4680"/>
+        <w:gridCol w:w="4680"/>
+      </w:tblGrid>
+      <w:tr>
+        <w:tc>
+          <w:tcPr>
+            <w:tcW w:type="dxa" w:w="2880"/>
+            <w:shd w:fill="D9EAF7"/>
+          </w:tcPr>
+          <w:p>
+            <w:r>
+              <w:rPr>
+                <w:b/>
+                <w:sz w:val="18"/>
+              </w:rPr>
+              <w:t>Archivo</w:t>
+            </w:r>
+          </w:p>
+        </w:tc>
+        <w:tc>
+          <w:tcPr>
+            <w:tcW w:type="dxa" w:w="6480"/>
+            <w:shd w:fill="D9EAF7"/>
+          </w:tcPr>
+          <w:p>
+            <w:r>
+              <w:rPr>
+                <w:b/>
+                <w:sz w:val="18"/>
+              </w:rPr>
+              <w:t>Propósito comprobado</w:t>
+            </w:r>
+          </w:p>
+        </w:tc>
+      </w:tr>
+      <w:tr>
+        <w:tc>
+          <w:tcPr>
+            <w:tcW w:type="dxa" w:w="2880"/>
+            <w:vAlign w:val="center"/>
+          </w:tcPr>
+          <w:p>
+            <w:pPr>
+              <w:spacing w:after="40"/>
+            </w:pPr>
+            <w:r>
+              <w:rPr>
+                <w:sz w:val="17"/>
+              </w:rPr>
+              <w:t>index.js</w:t>
+            </w:r>
+          </w:p>
+        </w:tc>
+        <w:tc>
+          <w:tcPr>
+            <w:tcW w:type="dxa" w:w="6480"/>
+            <w:vAlign w:val="center"/>
+          </w:tcPr>
+          <w:p>
+            <w:pPr>
+              <w:spacing w:after="40"/>
+            </w:pPr>
+            <w:r>
+              <w:rPr>
+                <w:sz w:val="17"/>
+              </w:rPr>
+              <w:t>Punto de entrada Expo; registra App mediante registerRootComponent.</w:t>
+            </w:r>
+          </w:p>
+        </w:tc>
+      </w:tr>
+      <w:tr>
+        <w:tc>
+          <w:tcPr>
+            <w:tcW w:type="dxa" w:w="2880"/>
+            <w:vAlign w:val="center"/>
+          </w:tcPr>
+          <w:p>
+            <w:pPr>
+              <w:spacing w:after="40"/>
+            </w:pPr>
+            <w:r>
+              <w:rPr>
+                <w:sz w:val="17"/>
+              </w:rPr>
+              <w:t>App.js</w:t>
+            </w:r>
+          </w:p>
+        </w:tc>
+        <w:tc>
+          <w:tcPr>
+            <w:tcW w:type="dxa" w:w="6480"/>
+            <w:vAlign w:val="center"/>
+          </w:tcPr>
+          <w:p>
+            <w:pPr>
+              <w:spacing w:after="40"/>
+            </w:pPr>
+            <w:r>
+              <w:rPr>
+                <w:sz w:val="17"/>
+              </w:rPr>
+              <w:t>Compone providers y RootNavigation; define las rutas raíz condicionadas por la sesión.</w:t>
+            </w:r>
+          </w:p>
+        </w:tc>
+      </w:tr>
+      <w:tr>
+        <w:tc>
+          <w:tcPr>
+            <w:tcW w:type="dxa" w:w="2880"/>
+            <w:vAlign w:val="center"/>
+          </w:tcPr>
+          <w:p>
+            <w:pPr>
+              <w:spacing w:after="40"/>
+            </w:pPr>
+            <w:r>
+              <w:rPr>
+                <w:sz w:val="17"/>
+              </w:rPr>
+              <w:t>app.json</w:t>
+            </w:r>
+          </w:p>
+        </w:tc>
+        <w:tc>
+          <w:tcPr>
+            <w:tcW w:type="dxa" w:w="6480"/>
+            <w:vAlign w:val="center"/>
+          </w:tcPr>
+          <w:p>
+            <w:pPr>
+              <w:spacing w:after="40"/>
+            </w:pPr>
+            <w:r>
+              <w:rPr>
+                <w:sz w:val="17"/>
+              </w:rPr>
+              <w:t>Identidad, orientación, iconos, splash, plugins y opciones de plataformas Expo.</w:t>
+            </w:r>
+          </w:p>
+        </w:tc>
+      </w:tr>
+      <w:tr>
+        <w:tc>
+          <w:tcPr>
+            <w:tcW w:type="dxa" w:w="2880"/>
+            <w:vAlign w:val="center"/>
+          </w:tcPr>
+          <w:p>
+            <w:pPr>
+              <w:spacing w:after="40"/>
+            </w:pPr>
+            <w:r>
+              <w:rPr>
+                <w:sz w:val="17"/>
+              </w:rPr>
+              <w:t>package.json</w:t>
+            </w:r>
+          </w:p>
+        </w:tc>
+        <w:tc>
+          <w:tcPr>
+            <w:tcW w:type="dxa" w:w="6480"/>
+            <w:vAlign w:val="center"/>
+          </w:tcPr>
+          <w:p>
+            <w:pPr>
+              <w:spacing w:after="40"/>
+            </w:pPr>
+            <w:r>
+              <w:rPr>
+                <w:sz w:val="17"/>
+              </w:rPr>
+              <w:t>Nombre, punto de entrada, scripts y dependencias declaradas.</w:t>
+            </w:r>
+          </w:p>
+        </w:tc>
+      </w:tr>
+      <w:tr>
+        <w:tc>
+          <w:tcPr>
+            <w:tcW w:type="dxa" w:w="2880"/>
+            <w:vAlign w:val="center"/>
+          </w:tcPr>
+          <w:p>
+            <w:pPr>
+              <w:spacing w:after="40"/>
+            </w:pPr>
+            <w:r>
+              <w:rPr>
+                <w:sz w:val="17"/>
+              </w:rPr>
+              <w:t>package-lock.json</w:t>
+            </w:r>
+          </w:p>
+        </w:tc>
+        <w:tc>
+          <w:tcPr>
+            <w:tcW w:type="dxa" w:w="6480"/>
+            <w:vAlign w:val="center"/>
+          </w:tcPr>
+          <w:p>
+            <w:pPr>
+              <w:spacing w:after="40"/>
+            </w:pPr>
+            <w:r>
+              <w:rPr>
+                <w:sz w:val="17"/>
+              </w:rPr>
+              <w:t>Versiones de dependencias resueltas para instalaciones reproducibles con npm.</w:t>
+            </w:r>
+          </w:p>
+        </w:tc>
+      </w:tr>
+      <w:tr>
+        <w:tc>
+          <w:tcPr>
+            <w:tcW w:type="dxa" w:w="2880"/>
+            <w:vAlign w:val="center"/>
+          </w:tcPr>
+          <w:p>
+            <w:pPr>
+              <w:spacing w:after="40"/>
+            </w:pPr>
+            <w:r>
+              <w:rPr>
+                <w:sz w:val="17"/>
+              </w:rPr>
+              <w:t>.gitignore</w:t>
+            </w:r>
+          </w:p>
+        </w:tc>
+        <w:tc>
+          <w:tcPr>
+            <w:tcW w:type="dxa" w:w="6480"/>
+            <w:vAlign w:val="center"/>
+          </w:tcPr>
+          <w:p>
+            <w:pPr>
+              <w:spacing w:after="40"/>
+            </w:pPr>
+            <w:r>
+              <w:rPr>
+                <w:sz w:val="17"/>
+              </w:rPr>
+              <w:t>Exclusiones para dependencias, cachés, artefactos nativos/build y archivos locales indicados.</w:t>
+            </w:r>
+          </w:p>
+        </w:tc>
+      </w:tr>
+      <w:tr>
+        <w:tc>
+          <w:tcPr>
+            <w:tcW w:type="dxa" w:w="2880"/>
+            <w:vAlign w:val="center"/>
+          </w:tcPr>
+          <w:p>
+            <w:pPr>
+              <w:spacing w:after="40"/>
+            </w:pPr>
+            <w:r>
+              <w:rPr>
+                <w:sz w:val="17"/>
+              </w:rPr>
+              <w:t>theme.js</w:t>
+            </w:r>
+          </w:p>
+        </w:tc>
+        <w:tc>
+          <w:tcPr>
+            <w:tcW w:type="dxa" w:w="6480"/>
+            <w:vAlign w:val="center"/>
+          </w:tcPr>
+          <w:p>
+            <w:pPr>
+              <w:spacing w:after="40"/>
+            </w:pPr>
+            <w:r>
+              <w:rPr>
+                <w:sz w:val="17"/>
+              </w:rPr>
+              <w:t>Tokens compartidos de color, tipografía, espaciado y estilos.</w:t>
+            </w:r>
+          </w:p>
+        </w:tc>
+      </w:tr>
+      <w:tr>
+        <w:tc>
+          <w:tcPr>
+            <w:tcW w:type="dxa" w:w="2880"/>
+            <w:vAlign w:val="center"/>
+          </w:tcPr>
+          <w:p>
+            <w:pPr>
+              <w:spacing w:after="40"/>
+            </w:pPr>
+            <w:r>
+              <w:rPr>
+                <w:sz w:val="17"/>
+              </w:rPr>
+              <w:t>DESIGN_SYSTEM.md</w:t>
+            </w:r>
+          </w:p>
+        </w:tc>
+        <w:tc>
+          <w:tcPr>
+            <w:tcW w:type="dxa" w:w="6480"/>
+            <w:vAlign w:val="center"/>
+          </w:tcPr>
+          <w:p>
+            <w:pPr>
+              <w:spacing w:after="40"/>
+            </w:pPr>
+            <w:r>
+              <w:rPr>
+                <w:sz w:val="17"/>
+              </w:rPr>
+              <w:t>Guía de diseño y patrones visuales del frontend.</w:t>
+            </w:r>
+          </w:p>
+        </w:tc>
+      </w:tr>
+      <w:tr>
+        <w:tc>
+          <w:tcPr>
+            <w:tcW w:type="dxa" w:w="2880"/>
+            <w:vAlign w:val="center"/>
+          </w:tcPr>
+          <w:p>
+            <w:pPr>
+              <w:spacing w:after="40"/>
+            </w:pPr>
+            <w:r>
+              <w:rPr>
+                <w:sz w:val="17"/>
+              </w:rPr>
+              <w:t>AGENTS.md, CLAUDE.md y .claude/settings.json</w:t>
+            </w:r>
+          </w:p>
+        </w:tc>
+        <w:tc>
+          <w:tcPr>
+            <w:tcW w:type="dxa" w:w="6480"/>
+            <w:vAlign w:val="center"/>
+          </w:tcPr>
+          <w:p>
+            <w:pPr>
+              <w:spacing w:after="40"/>
+            </w:pPr>
+            <w:r>
+              <w:rPr>
+                <w:sz w:val="17"/>
+              </w:rPr>
+              <w:t>Instrucciones/configuración para herramientas de asistencia; no configuran la ejecución de la app.</w:t>
+            </w:r>
+          </w:p>
+        </w:tc>
+      </w:tr>
+      <w:tr>
+        <w:tc>
+          <w:tcPr>
+            <w:tcW w:type="dxa" w:w="2880"/>
+            <w:vAlign w:val="center"/>
+          </w:tcPr>
+          <w:p>
+            <w:pPr>
+              <w:spacing w:after="40"/>
+            </w:pPr>
+            <w:r>
+              <w:rPr>
+                <w:sz w:val="17"/>
+              </w:rPr>
+              <w:t>DIAGNOSTICO_AUDITORIA_FRONTEND.md</w:t>
+            </w:r>
+          </w:p>
+        </w:tc>
+        <w:tc>
+          <w:tcPr>
+            <w:tcW w:type="dxa" w:w="6480"/>
+            <w:vAlign w:val="center"/>
+          </w:tcPr>
+          <w:p>
+            <w:pPr>
+              <w:spacing w:after="40"/>
+            </w:pPr>
+            <w:r>
+              <w:rPr>
+                <w:sz w:val="17"/>
+              </w:rPr>
+              <w:t>Hallazgos de la auditoría del frontend y base del inventario documentado.</w:t>
+            </w:r>
+          </w:p>
+        </w:tc>
+      </w:tr>
+      <w:tr>
+        <w:tc>
+          <w:tcPr>
+            <w:tcW w:type="dxa" w:w="2880"/>
+            <w:vAlign w:val="center"/>
+          </w:tcPr>
+          <w:p>
+            <w:pPr>
+              <w:spacing w:after="40"/>
+            </w:pPr>
+            <w:r>
+              <w:rPr>
+                <w:sz w:val="17"/>
+              </w:rPr>
+              <w:t>Informe_Frontend_Sprache_APA.docx</w:t>
+            </w:r>
+          </w:p>
+        </w:tc>
+        <w:tc>
+          <w:tcPr>
+            <w:tcW w:type="dxa" w:w="6480"/>
+            <w:vAlign w:val="center"/>
+          </w:tcPr>
+          <w:p>
+            <w:pPr>
+              <w:spacing w:after="40"/>
+            </w:pPr>
+            <w:r>
+              <w:rPr>
+                <w:sz w:val="17"/>
+              </w:rPr>
+              <w:t>Informe técnico del frontend con requisitos, inventario, wireframes y diagramas.</w:t>
+            </w:r>
+          </w:p>
+        </w:tc>
+      </w:tr>
+      <w:tr>
+        <w:tc>
+          <w:tcPr>
+            <w:tcW w:type="dxa" w:w="2880"/>
+            <w:vAlign w:val="center"/>
+          </w:tcPr>
+          <w:p>
+            <w:pPr>
+              <w:spacing w:after="40"/>
+            </w:pPr>
+            <w:r>
+              <w:rPr>
+                <w:sz w:val="17"/>
+              </w:rPr>
+              <w:t>LICENSE</w:t>
+            </w:r>
+          </w:p>
+        </w:tc>
+        <w:tc>
+          <w:tcPr>
+            <w:tcW w:type="dxa" w:w="6480"/>
+            <w:vAlign w:val="center"/>
+          </w:tcPr>
+          <w:p>
+            <w:pPr>
+              <w:spacing w:after="40"/>
+            </w:pPr>
+            <w:r>
+              <w:rPr>
+                <w:sz w:val="17"/>
+              </w:rPr>
+              <w:t>Licencia incluida en la raíz del frontend.</w:t>
+            </w:r>
+          </w:p>
+        </w:tc>
+      </w:tr>
+    </w:tbl>
     <w:p>
       <w:pPr>
         <w:pStyle w:val="Heading2"/>
@@ -11783,8 +14623,7 @@
         <w:rPr/>
       </w:pPr>
       <w:r>
-        <w:rPr/>
-        <w:t>Servicios mencionados en el README</w:t>
+        <w:t>Servicios del frontend</w:t>
       </w:r>
     </w:p>
     <w:tbl>
@@ -12415,27 +15254,11 @@
             <w:tcBorders/>
           </w:tcPr>
           <w:p>
-            <w:pPr>
-              <w:pStyle w:val="Normal"/>
-              <w:widowControl/>
-              <w:spacing w:lineRule="auto" w:line="240" w:before="0" w:after="0"/>
-              <w:jc w:val="start"/>
-              <w:rPr>
-                <w:rFonts w:cs=""/>
-                <w:kern w:val="0"/>
-                <w:szCs w:val="22"/>
-                <w:lang w:val="en-US" w:eastAsia="en-US" w:bidi="ar-SA"/>
-              </w:rPr>
-            </w:pPr>
-            <w:r>
-              <w:rPr>
-                <w:rFonts w:cs=""/>
-                <w:kern w:val="0"/>
-                <w:sz w:val="20"/>
-                <w:szCs w:val="22"/>
-                <w:lang w:val="en-US" w:eastAsia="en-US" w:bidi="ar-SA"/>
-              </w:rPr>
-              <w:t>Cliente HTTP preparado para la futura API Ktor.</w:t>
+            <w:r>
+              <w:rPr>
+                <w:sz w:val="17"/>
+              </w:rPr>
+              <w:t>Cliente HTTP configurable mediante EXPO_PUBLIC_API_URL; no se encontraron consumidores en los flujos actuales.</w:t>
             </w:r>
           </w:p>
         </w:tc>

</xml_diff>

<commit_message>
feat(frontend): completar flujos pendientes y documentar implementación
Co-authored-by: Copilot <223556219+Copilot@users.noreply.github.com>
</commit_message>
<xml_diff>
--- a/Sprache/Informe_Frontend_Sprache_APA.docx
+++ b/Sprache/Informe_Frontend_Sprache_APA.docx
@@ -14649,7 +14649,7 @@
         <w:trPr/>
         <w:tc>
           <w:tcPr>
-            <w:tcW w:w="4680" w:type="dxa"/>
+            <w:tcW w:w="2376" w:type="dxa"/>
             <w:tcBorders/>
             <w:vAlign w:val="center"/>
           </w:tcPr>
@@ -14681,7 +14681,7 @@
         </w:tc>
         <w:tc>
           <w:tcPr>
-            <w:tcW w:w="4680" w:type="dxa"/>
+            <w:tcW w:w="6984" w:type="dxa"/>
             <w:tcBorders/>
             <w:vAlign w:val="center"/>
           </w:tcPr>
@@ -14713,552 +14713,577 @@
         </w:tc>
       </w:tr>
       <w:tr>
-        <w:trPr/>
-        <w:tc>
-          <w:tcPr>
-            <w:tcW w:w="4680" w:type="dxa"/>
-            <w:tcBorders/>
-          </w:tcPr>
-          <w:p>
-            <w:pPr>
-              <w:pStyle w:val="Normal"/>
-              <w:widowControl/>
-              <w:spacing w:lineRule="auto" w:line="240" w:before="0" w:after="0"/>
-              <w:jc w:val="start"/>
-              <w:rPr>
-                <w:rFonts w:cs=""/>
-                <w:kern w:val="0"/>
-                <w:szCs w:val="22"/>
-                <w:lang w:val="en-US" w:eastAsia="en-US" w:bidi="ar-SA"/>
-              </w:rPr>
-            </w:pPr>
-            <w:r>
-              <w:rPr>
-                <w:rFonts w:cs=""/>
-                <w:kern w:val="0"/>
-                <w:sz w:val="20"/>
-                <w:szCs w:val="22"/>
-                <w:lang w:val="en-US" w:eastAsia="en-US" w:bidi="ar-SA"/>
-              </w:rPr>
-              <w:t>authService.js</w:t>
-            </w:r>
-          </w:p>
-        </w:tc>
-        <w:tc>
-          <w:tcPr>
-            <w:tcW w:w="4680" w:type="dxa"/>
-            <w:tcBorders/>
-          </w:tcPr>
-          <w:p>
-            <w:pPr>
-              <w:pStyle w:val="Normal"/>
-              <w:widowControl/>
-              <w:spacing w:lineRule="auto" w:line="240" w:before="0" w:after="0"/>
-              <w:jc w:val="start"/>
-              <w:rPr>
-                <w:rFonts w:cs=""/>
-                <w:kern w:val="0"/>
-                <w:szCs w:val="22"/>
-                <w:lang w:val="en-US" w:eastAsia="en-US" w:bidi="ar-SA"/>
-              </w:rPr>
-            </w:pPr>
-            <w:r>
-              <w:rPr>
-                <w:rFonts w:cs=""/>
-                <w:kern w:val="0"/>
-                <w:sz w:val="20"/>
-                <w:szCs w:val="22"/>
-                <w:lang w:val="en-US" w:eastAsia="en-US" w:bidi="ar-SA"/>
-              </w:rPr>
-              <w:t>Gestión de sesión y credenciales locales.</w:t>
+        <w:tc>
+          <w:tcPr>
+            <w:tcW w:type="dxa" w:w="2376"/>
+            <w:vAlign w:val="center"/>
+          </w:tcPr>
+          <w:p>
+            <w:pPr>
+              <w:spacing w:after="40"/>
+            </w:pPr>
+            <w:r>
+              <w:rPr>
+                <w:sz w:val="17"/>
+              </w:rPr>
+              <w:t>achievementService.js</w:t>
+            </w:r>
+          </w:p>
+        </w:tc>
+        <w:tc>
+          <w:tcPr>
+            <w:tcW w:type="dxa" w:w="6984"/>
+            <w:vAlign w:val="center"/>
+          </w:tcPr>
+          <w:p>
+            <w:pPr>
+              <w:spacing w:after="40"/>
+            </w:pPr>
+            <w:r>
+              <w:rPr>
+                <w:sz w:val="17"/>
+              </w:rPr>
+              <w:t>Insignias, experiencia, retos semanales y nuevos avisos. Depende de progressService.</w:t>
             </w:r>
           </w:p>
         </w:tc>
       </w:tr>
       <w:tr>
-        <w:trPr/>
-        <w:tc>
-          <w:tcPr>
-            <w:tcW w:w="4680" w:type="dxa"/>
-            <w:tcBorders/>
-          </w:tcPr>
-          <w:p>
-            <w:pPr>
-              <w:pStyle w:val="Normal"/>
-              <w:widowControl/>
-              <w:spacing w:lineRule="auto" w:line="240" w:before="0" w:after="0"/>
-              <w:jc w:val="start"/>
-              <w:rPr>
-                <w:rFonts w:cs=""/>
-                <w:kern w:val="0"/>
-                <w:szCs w:val="22"/>
-                <w:lang w:val="en-US" w:eastAsia="en-US" w:bidi="ar-SA"/>
-              </w:rPr>
-            </w:pPr>
-            <w:r>
-              <w:rPr>
-                <w:rFonts w:cs=""/>
-                <w:kern w:val="0"/>
-                <w:sz w:val="20"/>
-                <w:szCs w:val="22"/>
-                <w:lang w:val="en-US" w:eastAsia="en-US" w:bidi="ar-SA"/>
-              </w:rPr>
-              <w:t>progressService.js</w:t>
-            </w:r>
-          </w:p>
-        </w:tc>
-        <w:tc>
-          <w:tcPr>
-            <w:tcW w:w="4680" w:type="dxa"/>
-            <w:tcBorders/>
-          </w:tcPr>
-          <w:p>
-            <w:pPr>
-              <w:pStyle w:val="Normal"/>
-              <w:widowControl/>
-              <w:spacing w:lineRule="auto" w:line="240" w:before="0" w:after="0"/>
-              <w:jc w:val="start"/>
-              <w:rPr>
-                <w:rFonts w:cs=""/>
-                <w:kern w:val="0"/>
-                <w:szCs w:val="22"/>
-                <w:lang w:val="en-US" w:eastAsia="en-US" w:bidi="ar-SA"/>
-              </w:rPr>
-            </w:pPr>
-            <w:r>
-              <w:rPr>
-                <w:rFonts w:cs=""/>
-                <w:kern w:val="0"/>
-                <w:sz w:val="20"/>
-                <w:szCs w:val="22"/>
-                <w:lang w:val="en-US" w:eastAsia="en-US" w:bidi="ar-SA"/>
-              </w:rPr>
-              <w:t>Cálculo de progreso, racha y estadísticas.</w:t>
+        <w:tc>
+          <w:tcPr>
+            <w:tcW w:type="dxa" w:w="2376"/>
+            <w:vAlign w:val="center"/>
+          </w:tcPr>
+          <w:p>
+            <w:pPr>
+              <w:spacing w:after="40"/>
+            </w:pPr>
+            <w:r>
+              <w:rPr>
+                <w:sz w:val="17"/>
+              </w:rPr>
+              <w:t>activityService.js</w:t>
+            </w:r>
+          </w:p>
+        </w:tc>
+        <w:tc>
+          <w:tcPr>
+            <w:tcW w:type="dxa" w:w="6984"/>
+            <w:vAlign w:val="center"/>
+          </w:tcPr>
+          <w:p>
+            <w:pPr>
+              <w:spacing w:after="40"/>
+            </w:pPr>
+            <w:r>
+              <w:rPr>
+                <w:sz w:val="17"/>
+              </w:rPr>
+              <w:t>Consulta, filtra y recomienda actividades del catálogo local. Depende de data/Activities.js.</w:t>
             </w:r>
           </w:p>
         </w:tc>
       </w:tr>
       <w:tr>
-        <w:trPr/>
-        <w:tc>
-          <w:tcPr>
-            <w:tcW w:w="4680" w:type="dxa"/>
-            <w:tcBorders/>
-          </w:tcPr>
-          <w:p>
-            <w:pPr>
-              <w:pStyle w:val="Normal"/>
-              <w:widowControl/>
-              <w:spacing w:lineRule="auto" w:line="240" w:before="0" w:after="0"/>
-              <w:jc w:val="start"/>
-              <w:rPr>
-                <w:rFonts w:cs=""/>
-                <w:kern w:val="0"/>
-                <w:szCs w:val="22"/>
-                <w:lang w:val="en-US" w:eastAsia="en-US" w:bidi="ar-SA"/>
-              </w:rPr>
-            </w:pPr>
-            <w:r>
-              <w:rPr>
-                <w:rFonts w:cs=""/>
-                <w:kern w:val="0"/>
-                <w:sz w:val="20"/>
-                <w:szCs w:val="22"/>
-                <w:lang w:val="en-US" w:eastAsia="en-US" w:bidi="ar-SA"/>
-              </w:rPr>
-              <w:t>lessonService.js</w:t>
-            </w:r>
-          </w:p>
-        </w:tc>
-        <w:tc>
-          <w:tcPr>
-            <w:tcW w:w="4680" w:type="dxa"/>
-            <w:tcBorders/>
-          </w:tcPr>
-          <w:p>
-            <w:pPr>
-              <w:pStyle w:val="Normal"/>
-              <w:widowControl/>
-              <w:spacing w:lineRule="auto" w:line="240" w:before="0" w:after="0"/>
-              <w:jc w:val="start"/>
-              <w:rPr>
-                <w:rFonts w:cs=""/>
-                <w:kern w:val="0"/>
-                <w:szCs w:val="22"/>
-                <w:lang w:val="en-US" w:eastAsia="en-US" w:bidi="ar-SA"/>
-              </w:rPr>
-            </w:pPr>
-            <w:r>
-              <w:rPr>
-                <w:rFonts w:cs=""/>
-                <w:kern w:val="0"/>
-                <w:sz w:val="20"/>
-                <w:szCs w:val="22"/>
-                <w:lang w:val="en-US" w:eastAsia="en-US" w:bidi="ar-SA"/>
-              </w:rPr>
-              <w:t>Búsqueda de lecciones y generación de repasos.</w:t>
+        <w:tc>
+          <w:tcPr>
+            <w:tcW w:type="dxa" w:w="2376"/>
+            <w:vAlign w:val="center"/>
+          </w:tcPr>
+          <w:p>
+            <w:pPr>
+              <w:spacing w:after="40"/>
+            </w:pPr>
+            <w:r>
+              <w:rPr>
+                <w:sz w:val="17"/>
+              </w:rPr>
+              <w:t>apiService.js</w:t>
+            </w:r>
+          </w:p>
+        </w:tc>
+        <w:tc>
+          <w:tcPr>
+            <w:tcW w:type="dxa" w:w="6984"/>
+            <w:vAlign w:val="center"/>
+          </w:tcPr>
+          <w:p>
+            <w:pPr>
+              <w:spacing w:after="40"/>
+            </w:pPr>
+            <w:r>
+              <w:rPr>
+                <w:sz w:val="17"/>
+              </w:rPr>
+              <w:t>Cliente GET/POST/PUT basado en fetch y EXPO_PUBLIC_API_URL; no se encontraron consumidores en los flujos actuales.</w:t>
             </w:r>
           </w:p>
         </w:tc>
       </w:tr>
       <w:tr>
-        <w:trPr/>
-        <w:tc>
-          <w:tcPr>
-            <w:tcW w:w="4680" w:type="dxa"/>
-            <w:tcBorders/>
-          </w:tcPr>
-          <w:p>
-            <w:pPr>
-              <w:pStyle w:val="Normal"/>
-              <w:widowControl/>
-              <w:spacing w:lineRule="auto" w:line="240" w:before="0" w:after="0"/>
-              <w:jc w:val="start"/>
-              <w:rPr>
-                <w:rFonts w:cs=""/>
-                <w:kern w:val="0"/>
-                <w:szCs w:val="22"/>
-                <w:lang w:val="en-US" w:eastAsia="en-US" w:bidi="ar-SA"/>
-              </w:rPr>
-            </w:pPr>
-            <w:r>
-              <w:rPr>
-                <w:rFonts w:cs=""/>
-                <w:kern w:val="0"/>
-                <w:sz w:val="20"/>
-                <w:szCs w:val="22"/>
-                <w:lang w:val="en-US" w:eastAsia="en-US" w:bidi="ar-SA"/>
-              </w:rPr>
-              <w:t>spacedRepetitionService.js</w:t>
-            </w:r>
-          </w:p>
-        </w:tc>
-        <w:tc>
-          <w:tcPr>
-            <w:tcW w:w="4680" w:type="dxa"/>
-            <w:tcBorders/>
-          </w:tcPr>
-          <w:p>
-            <w:pPr>
-              <w:pStyle w:val="Normal"/>
-              <w:widowControl/>
-              <w:spacing w:lineRule="auto" w:line="240" w:before="0" w:after="0"/>
-              <w:jc w:val="start"/>
-              <w:rPr>
-                <w:rFonts w:cs=""/>
-                <w:kern w:val="0"/>
-                <w:szCs w:val="22"/>
-                <w:lang w:val="en-US" w:eastAsia="en-US" w:bidi="ar-SA"/>
-              </w:rPr>
-            </w:pPr>
-            <w:r>
-              <w:rPr>
-                <w:rFonts w:cs=""/>
-                <w:kern w:val="0"/>
-                <w:sz w:val="20"/>
-                <w:szCs w:val="22"/>
-                <w:lang w:val="en-US" w:eastAsia="en-US" w:bidi="ar-SA"/>
-              </w:rPr>
-              <w:t>Cálculo de repetición espaciada.</w:t>
+        <w:tc>
+          <w:tcPr>
+            <w:tcW w:type="dxa" w:w="2376"/>
+            <w:vAlign w:val="center"/>
+          </w:tcPr>
+          <w:p>
+            <w:pPr>
+              <w:spacing w:after="40"/>
+            </w:pPr>
+            <w:r>
+              <w:rPr>
+                <w:sz w:val="17"/>
+              </w:rPr>
+              <w:t>authServiceCore.js</w:t>
+            </w:r>
+          </w:p>
+        </w:tc>
+        <w:tc>
+          <w:tcPr>
+            <w:tcW w:type="dxa" w:w="6984"/>
+            <w:vAlign w:val="center"/>
+          </w:tcPr>
+          <w:p>
+            <w:pPr>
+              <w:spacing w:after="40"/>
+            </w:pPr>
+            <w:r>
+              <w:rPr>
+                <w:sz w:val="17"/>
+              </w:rPr>
+              <w:t>Registro, login, restauración, cambios y logout mediante storage/crypto inyectados. Depende de data/user.js, progressService y mascotRewardsService.</w:t>
             </w:r>
           </w:p>
         </w:tc>
       </w:tr>
       <w:tr>
-        <w:trPr/>
-        <w:tc>
-          <w:tcPr>
-            <w:tcW w:w="4680" w:type="dxa"/>
-            <w:tcBorders/>
-          </w:tcPr>
-          <w:p>
-            <w:pPr>
-              <w:pStyle w:val="Normal"/>
-              <w:widowControl/>
-              <w:spacing w:lineRule="auto" w:line="240" w:before="0" w:after="0"/>
-              <w:jc w:val="start"/>
-              <w:rPr>
-                <w:rFonts w:cs=""/>
-                <w:kern w:val="0"/>
-                <w:szCs w:val="22"/>
-                <w:lang w:val="en-US" w:eastAsia="en-US" w:bidi="ar-SA"/>
-              </w:rPr>
-            </w:pPr>
-            <w:r>
-              <w:rPr>
-                <w:rFonts w:cs=""/>
-                <w:kern w:val="0"/>
-                <w:sz w:val="20"/>
-                <w:szCs w:val="22"/>
-                <w:lang w:val="en-US" w:eastAsia="en-US" w:bidi="ar-SA"/>
-              </w:rPr>
-              <w:t>learningPathService.js</w:t>
-            </w:r>
-          </w:p>
-        </w:tc>
-        <w:tc>
-          <w:tcPr>
-            <w:tcW w:w="4680" w:type="dxa"/>
-            <w:tcBorders/>
-          </w:tcPr>
-          <w:p>
-            <w:pPr>
-              <w:pStyle w:val="Normal"/>
-              <w:widowControl/>
-              <w:spacing w:lineRule="auto" w:line="240" w:before="0" w:after="0"/>
-              <w:jc w:val="start"/>
-              <w:rPr>
-                <w:rFonts w:cs=""/>
-                <w:kern w:val="0"/>
-                <w:szCs w:val="22"/>
-                <w:lang w:val="en-US" w:eastAsia="en-US" w:bidi="ar-SA"/>
-              </w:rPr>
-            </w:pPr>
-            <w:r>
-              <w:rPr>
-                <w:rFonts w:cs=""/>
-                <w:kern w:val="0"/>
-                <w:sz w:val="20"/>
-                <w:szCs w:val="22"/>
-                <w:lang w:val="en-US" w:eastAsia="en-US" w:bidi="ar-SA"/>
-              </w:rPr>
-              <w:t>Rutas de aprendizaje por nivel A1–B2.</w:t>
+        <w:tc>
+          <w:tcPr>
+            <w:tcW w:type="dxa" w:w="2376"/>
+            <w:vAlign w:val="center"/>
+          </w:tcPr>
+          <w:p>
+            <w:pPr>
+              <w:spacing w:after="40"/>
+            </w:pPr>
+            <w:r>
+              <w:rPr>
+                <w:sz w:val="17"/>
+              </w:rPr>
+              <w:t>authService.js</w:t>
+            </w:r>
+          </w:p>
+        </w:tc>
+        <w:tc>
+          <w:tcPr>
+            <w:tcW w:type="dxa" w:w="6984"/>
+            <w:vAlign w:val="center"/>
+          </w:tcPr>
+          <w:p>
+            <w:pPr>
+              <w:spacing w:after="40"/>
+            </w:pPr>
+            <w:r>
+              <w:rPr>
+                <w:sz w:val="17"/>
+              </w:rPr>
+              <w:t>Adaptador de autenticación que inyecta AsyncStorage y Expo Crypto a authServiceCore.</w:t>
             </w:r>
           </w:p>
         </w:tc>
       </w:tr>
       <w:tr>
-        <w:trPr/>
-        <w:tc>
-          <w:tcPr>
-            <w:tcW w:w="4680" w:type="dxa"/>
-            <w:tcBorders/>
-          </w:tcPr>
-          <w:p>
-            <w:pPr>
-              <w:pStyle w:val="Normal"/>
-              <w:widowControl/>
-              <w:spacing w:lineRule="auto" w:line="240" w:before="0" w:after="0"/>
-              <w:jc w:val="start"/>
-              <w:rPr>
-                <w:rFonts w:cs=""/>
-                <w:kern w:val="0"/>
-                <w:szCs w:val="22"/>
-                <w:lang w:val="en-US" w:eastAsia="en-US" w:bidi="ar-SA"/>
-              </w:rPr>
-            </w:pPr>
-            <w:r>
-              <w:rPr>
-                <w:rFonts w:cs=""/>
-                <w:kern w:val="0"/>
-                <w:sz w:val="20"/>
-                <w:szCs w:val="22"/>
-                <w:lang w:val="en-US" w:eastAsia="en-US" w:bidi="ar-SA"/>
-              </w:rPr>
-              <w:t>achievementService.js</w:t>
-            </w:r>
-          </w:p>
-        </w:tc>
-        <w:tc>
-          <w:tcPr>
-            <w:tcW w:w="4680" w:type="dxa"/>
-            <w:tcBorders/>
-          </w:tcPr>
-          <w:p>
-            <w:pPr>
-              <w:pStyle w:val="Normal"/>
-              <w:widowControl/>
-              <w:spacing w:lineRule="auto" w:line="240" w:before="0" w:after="0"/>
-              <w:jc w:val="start"/>
-              <w:rPr>
-                <w:rFonts w:cs=""/>
-                <w:kern w:val="0"/>
-                <w:szCs w:val="22"/>
-                <w:lang w:val="en-US" w:eastAsia="en-US" w:bidi="ar-SA"/>
-              </w:rPr>
-            </w:pPr>
-            <w:r>
-              <w:rPr>
-                <w:rFonts w:cs=""/>
-                <w:kern w:val="0"/>
-                <w:sz w:val="20"/>
-                <w:szCs w:val="22"/>
-                <w:lang w:val="en-US" w:eastAsia="en-US" w:bidi="ar-SA"/>
-              </w:rPr>
-              <w:t>Logros e insignias.</w:t>
+        <w:tc>
+          <w:tcPr>
+            <w:tcW w:type="dxa" w:w="2376"/>
+            <w:vAlign w:val="center"/>
+          </w:tcPr>
+          <w:p>
+            <w:pPr>
+              <w:spacing w:after="40"/>
+            </w:pPr>
+            <w:r>
+              <w:rPr>
+                <w:sz w:val="17"/>
+              </w:rPr>
+              <w:t>germanVoiceService.js</w:t>
+            </w:r>
+          </w:p>
+        </w:tc>
+        <w:tc>
+          <w:tcPr>
+            <w:tcW w:type="dxa" w:w="6984"/>
+            <w:vAlign w:val="center"/>
+          </w:tcPr>
+          <w:p>
+            <w:pPr>
+              <w:spacing w:after="40"/>
+            </w:pPr>
+            <w:r>
+              <w:rPr>
+                <w:sz w:val="17"/>
+              </w:rPr>
+              <w:t>Busca una voz de-DE. Depende de expo-speech; el dispositivo debe ofrecer una voz compatible.</w:t>
             </w:r>
           </w:p>
         </w:tc>
       </w:tr>
       <w:tr>
-        <w:trPr/>
-        <w:tc>
-          <w:tcPr>
-            <w:tcW w:w="4680" w:type="dxa"/>
-            <w:tcBorders/>
-          </w:tcPr>
-          <w:p>
-            <w:pPr>
-              <w:pStyle w:val="Normal"/>
-              <w:widowControl/>
-              <w:spacing w:lineRule="auto" w:line="240" w:before="0" w:after="0"/>
-              <w:jc w:val="start"/>
-              <w:rPr>
-                <w:rFonts w:cs=""/>
-                <w:kern w:val="0"/>
-                <w:szCs w:val="22"/>
-                <w:lang w:val="en-US" w:eastAsia="en-US" w:bidi="ar-SA"/>
-              </w:rPr>
-            </w:pPr>
-            <w:r>
-              <w:rPr>
-                <w:rFonts w:cs=""/>
-                <w:kern w:val="0"/>
-                <w:sz w:val="20"/>
-                <w:szCs w:val="22"/>
-                <w:lang w:val="en-US" w:eastAsia="en-US" w:bidi="ar-SA"/>
-              </w:rPr>
-              <w:t>germanVoiceService.js</w:t>
-            </w:r>
-          </w:p>
-        </w:tc>
-        <w:tc>
-          <w:tcPr>
-            <w:tcW w:w="4680" w:type="dxa"/>
-            <w:tcBorders/>
-          </w:tcPr>
-          <w:p>
-            <w:pPr>
-              <w:pStyle w:val="Normal"/>
-              <w:widowControl/>
-              <w:spacing w:lineRule="auto" w:line="240" w:before="0" w:after="0"/>
-              <w:jc w:val="start"/>
-              <w:rPr>
-                <w:rFonts w:cs=""/>
-                <w:kern w:val="0"/>
-                <w:szCs w:val="22"/>
-                <w:lang w:val="en-US" w:eastAsia="en-US" w:bidi="ar-SA"/>
-              </w:rPr>
-            </w:pPr>
-            <w:r>
-              <w:rPr>
-                <w:rFonts w:cs=""/>
-                <w:kern w:val="0"/>
-                <w:sz w:val="20"/>
-                <w:szCs w:val="22"/>
-                <w:lang w:val="en-US" w:eastAsia="en-US" w:bidi="ar-SA"/>
-              </w:rPr>
-              <w:t>Síntesis de voz alemana con expo-speech.</w:t>
+        <w:tc>
+          <w:tcPr>
+            <w:tcW w:type="dxa" w:w="2376"/>
+            <w:vAlign w:val="center"/>
+          </w:tcPr>
+          <w:p>
+            <w:pPr>
+              <w:spacing w:after="40"/>
+            </w:pPr>
+            <w:r>
+              <w:rPr>
+                <w:sz w:val="17"/>
+              </w:rPr>
+              <w:t>hapticFeedback.js</w:t>
+            </w:r>
+          </w:p>
+        </w:tc>
+        <w:tc>
+          <w:tcPr>
+            <w:tcW w:type="dxa" w:w="6984"/>
+            <w:vAlign w:val="center"/>
+          </w:tcPr>
+          <w:p>
+            <w:pPr>
+              <w:spacing w:after="40"/>
+            </w:pPr>
+            <w:r>
+              <w:rPr>
+                <w:sz w:val="17"/>
+              </w:rPr>
+              <w:t>Emite feedback si está habilitado y la plataforma es iOS/Android. Depende de expo-haptics y Platform de React Native.</w:t>
             </w:r>
           </w:p>
         </w:tc>
       </w:tr>
       <w:tr>
-        <w:trPr/>
-        <w:tc>
-          <w:tcPr>
-            <w:tcW w:w="4680" w:type="dxa"/>
-            <w:tcBorders/>
-          </w:tcPr>
-          <w:p>
-            <w:pPr>
-              <w:pStyle w:val="Normal"/>
-              <w:widowControl/>
-              <w:spacing w:lineRule="auto" w:line="240" w:before="0" w:after="0"/>
-              <w:jc w:val="start"/>
-              <w:rPr>
-                <w:rFonts w:cs=""/>
-                <w:kern w:val="0"/>
-                <w:szCs w:val="22"/>
-                <w:lang w:val="en-US" w:eastAsia="en-US" w:bidi="ar-SA"/>
-              </w:rPr>
-            </w:pPr>
-            <w:r>
-              <w:rPr>
-                <w:rFonts w:cs=""/>
-                <w:kern w:val="0"/>
-                <w:sz w:val="20"/>
-                <w:szCs w:val="22"/>
-                <w:lang w:val="en-US" w:eastAsia="en-US" w:bidi="ar-SA"/>
-              </w:rPr>
-              <w:t>hapticFeedback.js</w:t>
-            </w:r>
-          </w:p>
-        </w:tc>
-        <w:tc>
-          <w:tcPr>
-            <w:tcW w:w="4680" w:type="dxa"/>
-            <w:tcBorders/>
-          </w:tcPr>
-          <w:p>
-            <w:pPr>
-              <w:pStyle w:val="Normal"/>
-              <w:widowControl/>
-              <w:spacing w:lineRule="auto" w:line="240" w:before="0" w:after="0"/>
-              <w:jc w:val="start"/>
-              <w:rPr>
-                <w:rFonts w:cs=""/>
-                <w:kern w:val="0"/>
-                <w:szCs w:val="22"/>
-                <w:lang w:val="en-US" w:eastAsia="en-US" w:bidi="ar-SA"/>
-              </w:rPr>
-            </w:pPr>
-            <w:r>
-              <w:rPr>
-                <w:rFonts w:cs=""/>
-                <w:kern w:val="0"/>
-                <w:sz w:val="20"/>
-                <w:szCs w:val="22"/>
-                <w:lang w:val="en-US" w:eastAsia="en-US" w:bidi="ar-SA"/>
-              </w:rPr>
-              <w:t>Retroalimentación táctil con expo-haptics.</w:t>
+        <w:tc>
+          <w:tcPr>
+            <w:tcW w:type="dxa" w:w="2376"/>
+            <w:vAlign w:val="center"/>
+          </w:tcPr>
+          <w:p>
+            <w:pPr>
+              <w:spacing w:after="40"/>
+            </w:pPr>
+            <w:r>
+              <w:rPr>
+                <w:sz w:val="17"/>
+              </w:rPr>
+              <w:t>learningPathService.js</w:t>
+            </w:r>
+          </w:p>
+        </w:tc>
+        <w:tc>
+          <w:tcPr>
+            <w:tcW w:type="dxa" w:w="6984"/>
+            <w:vAlign w:val="center"/>
+          </w:tcPr>
+          <w:p>
+            <w:pPr>
+              <w:spacing w:after="40"/>
+            </w:pPr>
+            <w:r>
+              <w:rPr>
+                <w:sz w:val="17"/>
+              </w:rPr>
+              <w:t>Construye la ruta y niveles disponibles. Depende del catálogo local data/Activities.js.</w:t>
             </w:r>
           </w:p>
         </w:tc>
       </w:tr>
       <w:tr>
-        <w:trPr/>
-        <w:tc>
-          <w:tcPr>
-            <w:tcW w:w="4680" w:type="dxa"/>
-            <w:tcBorders/>
-          </w:tcPr>
-          <w:p>
-            <w:pPr>
-              <w:pStyle w:val="Normal"/>
-              <w:widowControl/>
-              <w:spacing w:lineRule="auto" w:line="240" w:before="0" w:after="0"/>
-              <w:jc w:val="start"/>
-              <w:rPr>
-                <w:rFonts w:cs=""/>
-                <w:kern w:val="0"/>
-                <w:szCs w:val="22"/>
-                <w:lang w:val="en-US" w:eastAsia="en-US" w:bidi="ar-SA"/>
-              </w:rPr>
-            </w:pPr>
-            <w:r>
-              <w:rPr>
-                <w:rFonts w:cs=""/>
-                <w:kern w:val="0"/>
-                <w:sz w:val="20"/>
-                <w:szCs w:val="22"/>
-                <w:lang w:val="en-US" w:eastAsia="en-US" w:bidi="ar-SA"/>
-              </w:rPr>
-              <w:t>apiService.js</w:t>
-            </w:r>
-          </w:p>
-        </w:tc>
-        <w:tc>
-          <w:tcPr>
-            <w:tcW w:w="4680" w:type="dxa"/>
-            <w:tcBorders/>
-          </w:tcPr>
-          <w:p>
+        <w:tc>
+          <w:tcPr>
+            <w:tcW w:type="dxa" w:w="2376"/>
+            <w:vAlign w:val="center"/>
+          </w:tcPr>
+          <w:p>
+            <w:pPr>
+              <w:spacing w:after="40"/>
+            </w:pPr>
             <w:r>
               <w:rPr>
                 <w:sz w:val="17"/>
               </w:rPr>
-              <w:t>Cliente HTTP configurable mediante EXPO_PUBLIC_API_URL; no se encontraron consumidores en los flujos actuales.</w:t>
+              <w:t>learningProgressService.js</w:t>
+            </w:r>
+          </w:p>
+        </w:tc>
+        <w:tc>
+          <w:tcPr>
+            <w:tcW w:type="dxa" w:w="6984"/>
+            <w:vAlign w:val="center"/>
+          </w:tcPr>
+          <w:p>
+            <w:pPr>
+              <w:spacing w:after="40"/>
+            </w:pPr>
+            <w:r>
+              <w:rPr>
+                <w:sz w:val="17"/>
+              </w:rPr>
+              <w:t>Fusiona progreso de lecturas, teoría y pronunciación; no importa otros módulos.</w:t>
+            </w:r>
+          </w:p>
+        </w:tc>
+      </w:tr>
+      <w:tr>
+        <w:tc>
+          <w:tcPr>
+            <w:tcW w:type="dxa" w:w="2376"/>
+            <w:vAlign w:val="center"/>
+          </w:tcPr>
+          <w:p>
+            <w:pPr>
+              <w:spacing w:after="40"/>
+            </w:pPr>
+            <w:r>
+              <w:rPr>
+                <w:sz w:val="17"/>
+              </w:rPr>
+              <w:t>lessonProgressService.js</w:t>
+            </w:r>
+          </w:p>
+        </w:tc>
+        <w:tc>
+          <w:tcPr>
+            <w:tcW w:type="dxa" w:w="6984"/>
+            <w:vAlign w:val="center"/>
+          </w:tcPr>
+          <w:p>
+            <w:pPr>
+              <w:spacing w:after="40"/>
+            </w:pPr>
+            <w:r>
+              <w:rPr>
+                <w:sz w:val="17"/>
+              </w:rPr>
+              <w:t>Valida respuestas, construye resultados, actualiza errores y calcula el resumen; no importa otros módulos.</w:t>
+            </w:r>
+          </w:p>
+        </w:tc>
+      </w:tr>
+      <w:tr>
+        <w:tc>
+          <w:tcPr>
+            <w:tcW w:type="dxa" w:w="2376"/>
+            <w:vAlign w:val="center"/>
+          </w:tcPr>
+          <w:p>
+            <w:pPr>
+              <w:spacing w:after="40"/>
+            </w:pPr>
+            <w:r>
+              <w:rPr>
+                <w:sz w:val="17"/>
+              </w:rPr>
+              <w:t>lessonService.js</w:t>
+            </w:r>
+          </w:p>
+        </w:tc>
+        <w:tc>
+          <w:tcPr>
+            <w:tcW w:type="dxa" w:w="6984"/>
+            <w:vAlign w:val="center"/>
+          </w:tcPr>
+          <w:p>
+            <w:pPr>
+              <w:spacing w:after="40"/>
+            </w:pPr>
+            <w:r>
+              <w:rPr>
+                <w:sz w:val="17"/>
+              </w:rPr>
+              <w:t>Busca lecciones y genera repasos. Depende de data/lessons.js y spacedRepetitionService.</w:t>
+            </w:r>
+          </w:p>
+        </w:tc>
+      </w:tr>
+      <w:tr>
+        <w:tc>
+          <w:tcPr>
+            <w:tcW w:type="dxa" w:w="2376"/>
+            <w:vAlign w:val="center"/>
+          </w:tcPr>
+          <w:p>
+            <w:pPr>
+              <w:spacing w:after="40"/>
+            </w:pPr>
+            <w:r>
+              <w:rPr>
+                <w:sz w:val="17"/>
+              </w:rPr>
+              <w:t>mascotRewardsService.js</w:t>
+            </w:r>
+          </w:p>
+        </w:tc>
+        <w:tc>
+          <w:tcPr>
+            <w:tcW w:type="dxa" w:w="6984"/>
+            <w:vAlign w:val="center"/>
+          </w:tcPr>
+          <w:p>
+            <w:pPr>
+              <w:spacing w:after="40"/>
+            </w:pPr>
+            <w:r>
+              <w:rPr>
+                <w:sz w:val="17"/>
+              </w:rPr>
+              <w:t>Calcula progreso/desbloqueos y valida accesorios; no importa otros módulos.</w:t>
+            </w:r>
+          </w:p>
+        </w:tc>
+      </w:tr>
+      <w:tr>
+        <w:tc>
+          <w:tcPr>
+            <w:tcW w:type="dxa" w:w="2376"/>
+            <w:vAlign w:val="center"/>
+          </w:tcPr>
+          <w:p>
+            <w:pPr>
+              <w:spacing w:after="40"/>
+            </w:pPr>
+            <w:r>
+              <w:rPr>
+                <w:sz w:val="17"/>
+              </w:rPr>
+              <w:t>placementAssessmentService.js</w:t>
+            </w:r>
+          </w:p>
+        </w:tc>
+        <w:tc>
+          <w:tcPr>
+            <w:tcW w:type="dxa" w:w="6984"/>
+            <w:vAlign w:val="center"/>
+          </w:tcPr>
+          <w:p>
+            <w:pPr>
+              <w:spacing w:after="40"/>
+            </w:pPr>
+            <w:r>
+              <w:rPr>
+                <w:sz w:val="17"/>
+              </w:rPr>
+              <w:t>Evalúa o permite omitir el nivel inicial; lógica local sin imports.</w:t>
+            </w:r>
+          </w:p>
+        </w:tc>
+      </w:tr>
+      <w:tr>
+        <w:tc>
+          <w:tcPr>
+            <w:tcW w:type="dxa" w:w="2376"/>
+            <w:vAlign w:val="center"/>
+          </w:tcPr>
+          <w:p>
+            <w:pPr>
+              <w:spacing w:after="40"/>
+            </w:pPr>
+            <w:r>
+              <w:rPr>
+                <w:sz w:val="17"/>
+              </w:rPr>
+              <w:t>profileService.js</w:t>
+            </w:r>
+          </w:p>
+        </w:tc>
+        <w:tc>
+          <w:tcPr>
+            <w:tcW w:type="dxa" w:w="6984"/>
+            <w:vAlign w:val="center"/>
+          </w:tcPr>
+          <w:p>
+            <w:pPr>
+              <w:spacing w:after="40"/>
+            </w:pPr>
+            <w:r>
+              <w:rPr>
+                <w:sz w:val="17"/>
+              </w:rPr>
+              <w:t>Aplica cambios de perfil y preferencias; lógica local sin imports.</w:t>
+            </w:r>
+          </w:p>
+        </w:tc>
+      </w:tr>
+      <w:tr>
+        <w:tc>
+          <w:tcPr>
+            <w:tcW w:type="dxa" w:w="2376"/>
+            <w:vAlign w:val="center"/>
+          </w:tcPr>
+          <w:p>
+            <w:pPr>
+              <w:spacing w:after="40"/>
+            </w:pPr>
+            <w:r>
+              <w:rPr>
+                <w:sz w:val="17"/>
+              </w:rPr>
+              <w:t>progressService.js</w:t>
+            </w:r>
+          </w:p>
+        </w:tc>
+        <w:tc>
+          <w:tcPr>
+            <w:tcW w:type="dxa" w:w="6984"/>
+            <w:vAlign w:val="center"/>
+          </w:tcPr>
+          <w:p>
+            <w:pPr>
+              <w:spacing w:after="40"/>
+            </w:pPr>
+            <w:r>
+              <w:rPr>
+                <w:sz w:val="17"/>
+              </w:rPr>
+              <w:t>Deriva métricas y registra/reinicia sesiones. Depende de spacedRepetitionService y mascotRewardsService.</w:t>
+            </w:r>
+          </w:p>
+        </w:tc>
+      </w:tr>
+      <w:tr>
+        <w:tc>
+          <w:tcPr>
+            <w:tcW w:type="dxa" w:w="2376"/>
+            <w:vAlign w:val="center"/>
+          </w:tcPr>
+          <w:p>
+            <w:pPr>
+              <w:spacing w:after="40"/>
+            </w:pPr>
+            <w:r>
+              <w:rPr>
+                <w:sz w:val="17"/>
+              </w:rPr>
+              <w:t>spacedRepetitionService.js</w:t>
+            </w:r>
+          </w:p>
+        </w:tc>
+        <w:tc>
+          <w:tcPr>
+            <w:tcW w:type="dxa" w:w="6984"/>
+            <w:vAlign w:val="center"/>
+          </w:tcPr>
+          <w:p>
+            <w:pPr>
+              <w:spacing w:after="40"/>
+            </w:pPr>
+            <w:r>
+              <w:rPr>
+                <w:sz w:val="17"/>
+              </w:rPr>
+              <w:t>Calcula intervalos y palabras vencidas; lógica local sin imports.</w:t>
             </w:r>
           </w:p>
         </w:tc>
@@ -15292,7 +15317,7 @@
         <w:rPr/>
       </w:pPr>
       <w:r>
-        <w:t>index.js llama a registerRootComponent(App). App.js compone SafeAreaProvider, MotionPreferencesProvider y AppProvider, y renderiza RootNavigation. Este configura NavigationContainer y un Native Stack cuyo grupo inicial depende del usuario cargado por AppContext. MainTabs organiza las cuatro pantallas principales en pestañas inferiores.</w:t>
+        <w:t>Punto de entrada y navegación. package.json declara index.js como entrada y este registra App mediante registerRootComponent de Expo. App.js compone SafeAreaProvider, MotionPreferencesProvider y AppProvider; RootNavigation muestra carga mientras AppContext restaura la sesión. Después monta NavigationContainer con Native Stack: Start/Register/Login para invitado o MainApp/Lesson/Lecturas/Teoría/Pronunciación para usuario autenticado. MainTabs implementa cuatro pestañas: Inicio, Actividades, Progreso y Perfil.</w:t>
       </w:r>
     </w:p>
     <w:p>
@@ -15302,7 +15327,7 @@
         <w:rPr/>
       </w:pPr>
       <w:r>
-        <w:t>AppContext comparte user, isLoading y acciones de autenticación, perfil y aprendizaje; serializa las actualizaciones del usuario y solicita su persistencia local. MotionPreferencesContext escucha AccessibilityInfo y proporciona el estado de movimiento reducido mediante useReduceMotion. Mientras se restaura la sesión, RootNavigation presenta el estado de carga.</w:t>
+        <w:t>Pantallas y composición. StartScreen ofrece acceso a registro e inicio de sesión; RegisterScreen recoge perfil, evaluación opcional, motivación y meta; LoginScreen autentica la cuenta local. HomeScreen muestra meta, recomendación y accesos a contenidos; ActivitiesScreen filtra actividades; ProgressScreen presenta métricas y ruta; ProfileScreen edita datos, meta, preferencias y mascota, y permite cerrar sesión. LessonScreen procesa preguntas y muestra SessionSummary como estado final, no como ruta. ReadingScreen, TheoryScreen y PronunciationScreen presentan sus módulos. components/ agrupa controles comunes y componentes específicos de cada dominio; MainTabs es el contenedor de pestañas.</w:t>
       </w:r>
     </w:p>
     <w:p>
@@ -15312,7 +15337,7 @@
         <w:rPr/>
       </w:pPr>
       <w:r>
-        <w:t>Los servicios del frontend incluyen autenticación, perfil, progreso y lecciones; actividad, ruta de aprendizaje, evaluación de nivel, repetición espaciada, logros y recompensas; además de síntesis de voz y retroalimentación háptica. Los módulos data/ aportan usuarios, actividades, lecciones, lecturas y teoría. authService utiliza AsyncStorage para cuentas, sesión y datos del usuario.</w:t>
+        <w:t>Estado compartido. AppContext expone user, isLoading y acciones para autenticación, perfil, progreso de sesiones, avance de lección, intentos de palabras, lecturas/teoría/pronunciación y accesorios. Las actualizaciones del usuario se serializan antes de persistirlas. MotionPreferencesContext consulta AccessibilityInfo y expone useReduceMotion; se usa para adaptar transiciones y animaciones. El estado de una pregunta y del resumen de sesión permanece local a LessonScreen.</w:t>
       </w:r>
     </w:p>
     <w:p>
@@ -15322,7 +15347,7 @@
         <w:rPr/>
       </w:pPr>
       <w:r>
-        <w:t>services/apiService.js implementa un cliente HTTP basado en fetch y EXPO_PUBLIC_API_URL. La búsqueda en el frontend no encontró módulos que lo consuman; por tanto, se documenta como integración externa preparada, no como comunicación activa ni como dependencia necesaria para los flujos actuales.</w:t>
+        <w:t>Servicios y dependencias. La tabla de este apartado inventaría los 16 módulos de services/ y sus imports directos comprobados. authService adapta AsyncStorage y Expo Crypto al núcleo de autenticación; los servicios internos consumen catálogos o reglas compartidas. Expo Speech, Expo Haptics y AccessibilityInfo son capacidades del cliente/plataforma, no una API del servidor. No se utiliza una capa de servicios simulados en ejecución: las pruebas de lógica inyectan almacenamiento en memoria.</w:t>
       </w:r>
     </w:p>
     <w:p>
@@ -15332,7 +15357,49 @@
         <w:rPr/>
       </w:pPr>
       <w:r>
-        <w:t>La navegación, los contextos, los servicios, los módulos de contenido y la persistencia representados se contrastaron con el código fuente del frontend. El diagrama describe relaciones entre módulos; no sustituye pruebas de interacción en dispositivo. La disponibilidad de la API externa queda pendiente de configuración y verificación porque el cliente no está conectado a los flujos de la aplicación.</w:t>
+        <w:t>Almacenamiento y origen de datos. data/ contiene perfil inicial, actividades, lecciones, lecturas y teoría empaquetadas localmente. authServiceCore persiste en AsyncStorage la lista local de cuentas, la clave de sesión y el objeto del usuario actualizado, incluidos perfil, preferencias, sesiones, avance interrumpido, resultados de lecturas/teoría/pronunciación, palabras y datos de mascota. Expo Crypto genera salt y hash de contraseña; no hay sincronización remota comprobada. apiService implementa fetch configurable mediante EXPO_PUBLIC_API_URL, pero no tiene consumidores encontrados en el frontend; no se presenta como integración activa ni se simula una respuesta exitosa.</w:t>
+      </w:r>
+    </w:p>
+    <w:p>
+      <w:pPr>
+        <w:pStyle w:val="Heading2"/>
+      </w:pPr>
+      <w:r>
+        <w:t>Interacción de una lección y resumen de sesión</w:t>
+      </w:r>
+    </w:p>
+    <w:p>
+      <w:pPr/>
+      <w:r>
+        <w:t>LessonScreen obtiene la lección del catálogo local, inicializa o restaura el avance y renderiza el control correspondiente al tipo de pregunta (selección, escucha, dictado, completar, ordenar o respuesta escrita). Comprobar valida la respuesta; los aciertos reciben retroalimentación contextual y se guardan los intentos de palabras. El avance se persiste en cada cambio y cuando la app pasa a segundo plano. La última respuesta correcta construye la sesión a partir de respuestas enviadas, duración activa y pistas; completeActivity la registra en AppContext y la persistencia local. El resumen recibe aciertos, total, XP incremental, minutos reales y avisos derivados de la sesión guardada. Su acción Volver usa goBack() y retorna a la pantalla que abrió la lección.</w:t>
+      </w:r>
+    </w:p>
+    <w:p>
+      <w:pPr>
+        <w:pStyle w:val="Heading2"/>
+      </w:pPr>
+      <w:r>
+        <w:t>Tratamiento de errores y límites de integración</w:t>
+      </w:r>
+    </w:p>
+    <w:p>
+      <w:pPr/>
+      <w:r>
+        <w:t>Registro e inicio de sesión capturan errores del servicio y muestran el mensaje junto al formulario. LessonScreen muestra avisos cuando falla el guardado de avance, el guardado de palabras o la finalización, y permite reintentar esta última; una actividad sin lección presenta un estado vacío para volver. AppContext registra fallos de persistencia y, si falla restoreSession, continúa como invitado sin mostrar un aviso específico: ese caso no está cubierto por una prueba de interfaz. El cliente apiService requiere EXPO_PUBLIC_API_URL y no está conectado a los flujos actuales. Voz y háptica dependen de las capacidades del dispositivo; no se afirma su disponibilidad universal.</w:t>
+      </w:r>
+    </w:p>
+    <w:p>
+      <w:pPr>
+        <w:pStyle w:val="Heading2"/>
+      </w:pPr>
+      <w:r>
+        <w:t>Pruebas ejecutadas y alcance de verificación</w:t>
+      </w:r>
+    </w:p>
+    <w:p>
+      <w:pPr/>
+      <w:r>
+        <w:t>Las 33 pruebas Node del frontend finalizaron correctamente; verifican registro/restauración con almacenamiento de prueba, finalización y persistencia offline, resultados de ejercicios, métricas y resumen. Además, en Expo Web se completaron dos recorridos: desde Inicio mediante la actividad recomendada y desde Actividades mediante una actividad seleccionada. En el segundo recorrido, tres respuestas correctas produjeron un resumen con 3/3, 100 % y +50 XP; el botón «Volver» retornó a Actividades, pestaña que quedó seleccionada. Esto verifica esos casos web concretos, no todos los tipos de actividad ni pruebas nativas, errores, lectores de pantalla, dispositivos o disponibilidad de voz/háptica. La limitación de la API remota queda pendiente de configuración y conexión funcional.</w:t>
       </w:r>
     </w:p>
     <w:p>

</xml_diff>

<commit_message>
docs(frontend): corregir instalación y ejecución
Co-authored-by: Copilot <223556219+Copilot@users.noreply.github.com>
</commit_message>
<xml_diff>
--- a/Sprache/Informe_Frontend_Sprache_APA.docx
+++ b/Sprache/Informe_Frontend_Sprache_APA.docx
@@ -15996,10 +15996,7 @@
         <w:rPr/>
       </w:pPr>
       <w:r>
-        <w:rPr>
-          <w:sz w:val="24"/>
-        </w:rPr>
-        <w:t>Node.js versión 18 o superior, de acuerdo con el README; se recomienda confirmar la versión compatible con el Expo SDK del proyecto.</w:t>
+        <w:t>Node.js 22.22.1 y npm 9.2.0 son las versiones usadas en la verificación de este informe. package.json no declara engines y no se encontró .nvmrc; por tanto, no se establece una versión mínima oficial.</w:t>
       </w:r>
     </w:p>
     <w:p>
@@ -16015,10 +16012,7 @@
         <w:rPr/>
       </w:pPr>
       <w:r>
-        <w:rPr>
-          <w:sz w:val="24"/>
-        </w:rPr>
-        <w:t>npm o yarn. Los comandos de este documento utilizan npm.</w:t>
+        <w:t>Git para clonar el repositorio y npm, incluido con Node.js. Se usa npm porque el frontend contiene package-lock.json; Yarn no está configurado.</w:t>
       </w:r>
     </w:p>
     <w:p>
@@ -16034,10 +16028,7 @@
         <w:rPr/>
       </w:pPr>
       <w:r>
-        <w:rPr>
-          <w:sz w:val="24"/>
-        </w:rPr>
-        <w:t>Repositorio del proyecto y acceso a internet para instalar dependencias.</w:t>
+        <w:t>Acceso a Internet para clonar el repositorio e instalar paquetes desde npm. El directorio del frontend es Sprache/ dentro del repositorio.</w:t>
       </w:r>
     </w:p>
     <w:p>
@@ -16053,10 +16044,7 @@
         <w:rPr/>
       </w:pPr>
       <w:r>
-        <w:rPr>
-          <w:sz w:val="24"/>
-        </w:rPr>
-        <w:t>Dispositivo Android/iOS, emulador configurado o navegador para la ejecución web.</w:t>
+        <w:t>Para web: navegador moderno. Para Android: dispositivo con Expo Go compatible o emulador Android configurado. Para iOS: macOS con Xcode y simulador, o dispositivo compatible. En este entorno solo se verificó web; las plataformas nativas quedan pendientes.</w:t>
       </w:r>
     </w:p>
     <w:p>
@@ -16083,10 +16071,7 @@
         <w:rPr/>
       </w:pPr>
       <w:r>
-        <w:rPr>
-          <w:sz w:val="24"/>
-        </w:rPr>
-        <w:t>Clonar el repositorio con la URL del proyecto.</w:t>
+        <w:t>Clonar Marianagmn/Sprache desde GitHub.</w:t>
       </w:r>
     </w:p>
     <w:p>
@@ -16102,10 +16087,7 @@
         <w:rPr/>
       </w:pPr>
       <w:r>
-        <w:rPr>
-          <w:sz w:val="24"/>
-        </w:rPr>
-        <w:t>Entrar en la carpeta que contiene package.json. `cd Sprache`.</w:t>
+        <w:t>Desde la carpeta creada por git clone, entrar al frontend: `cd Sprache/Sprache`.</w:t>
       </w:r>
     </w:p>
     <w:p>
@@ -16121,10 +16103,7 @@
         <w:rPr/>
       </w:pPr>
       <w:r>
-        <w:rPr>
-          <w:sz w:val="24"/>
-        </w:rPr>
-        <w:t>Instalar las dependencias con `npm install`.</w:t>
+        <w:t>Instalar exactamente las dependencias del lockfile: `npm ci`.</w:t>
       </w:r>
     </w:p>
     <w:p>
@@ -16134,13 +16113,7 @@
         <w:rPr/>
       </w:pPr>
       <w:r>
-        <w:rPr>
-          <w:rFonts w:eastAsia="Times New Roman"/>
-          <w:b/>
-          <w:i w:val="false"/>
-          <w:sz w:val="24"/>
-        </w:rPr>
-        <w:t>Comandos de referencia:</w:t>
+        <w:t>Comandos desde el directorio padre del repositorio clonado:</w:t>
       </w:r>
     </w:p>
     <w:p>
@@ -16151,16 +16124,30 @@
       </w:pPr>
       <w:r>
         <w:rPr>
-          <w:rFonts w:eastAsia="Times New Roman"/>
-          <w:b w:val="false"/>
-          <w:i w:val="false"/>
-          <w:sz w:val="24"/>
-        </w:rPr>
-        <w:t>git clone https://github.com/Marianagmn/Sprache</w:t>
+          <w:rFonts w:ascii="Consolas" w:hAnsi="Consolas"/>
+          <w:sz w:val="18"/>
+        </w:rPr>
+        <w:t>git clone --depth 1 https://github.com/Marianagmn/Sprache.git</w:t>
+      </w:r>
+      <w:r>
         <w:br/>
-        <w:t>cd Sprache</w:t>
+      </w:r>
+      <w:r>
+        <w:rPr>
+          <w:rFonts w:ascii="Consolas" w:hAnsi="Consolas"/>
+          <w:sz w:val="18"/>
+        </w:rPr>
+        <w:t>cd Sprache/Sprache</w:t>
+      </w:r>
+      <w:r>
         <w:br/>
-        <w:t>npm install</w:t>
+      </w:r>
+      <w:r>
+        <w:rPr>
+          <w:rFonts w:ascii="Consolas" w:hAnsi="Consolas"/>
+          <w:sz w:val="18"/>
+        </w:rPr>
+        <w:t>npm ci</w:t>
       </w:r>
     </w:p>
     <w:p>
@@ -16181,13 +16168,7 @@
         <w:rPr/>
       </w:pPr>
       <w:r>
-        <w:rPr>
-          <w:rFonts w:eastAsia="Times New Roman"/>
-          <w:b w:val="false"/>
-          <w:i w:val="false"/>
-          <w:sz w:val="24"/>
-        </w:rPr>
-        <w:t>Ejecutar:</w:t>
+        <w:t>Los siguientes scripts están declarados en package.json y se ejecutan desde Sprache/:</w:t>
       </w:r>
     </w:p>
     <w:p>
@@ -16198,21 +16179,40 @@
       </w:pPr>
       <w:r>
         <w:rPr>
-          <w:rFonts w:eastAsia="Times New Roman"/>
-          <w:b w:val="false"/>
-          <w:i w:val="false"/>
-          <w:sz w:val="24"/>
-        </w:rPr>
-        <w:t xml:space="preserve">npm start </w:t>
-      </w:r>
-      <w:r>
-        <w:rPr>
-          <w:rFonts w:eastAsia="Times New Roman"/>
-          <w:b w:val="false"/>
-          <w:i w:val="false"/>
-          <w:sz w:val="24"/>
-        </w:rPr>
-        <w:t>o npx expo start</w:t>
+          <w:rFonts w:ascii="Consolas" w:hAnsi="Consolas"/>
+          <w:sz w:val="18"/>
+        </w:rPr>
+        <w:t>npm start          # Inicia Expo y Metro</w:t>
+      </w:r>
+      <w:r>
+        <w:br/>
+      </w:r>
+      <w:r>
+        <w:rPr>
+          <w:rFonts w:ascii="Consolas" w:hAnsi="Consolas"/>
+          <w:sz w:val="18"/>
+        </w:rPr>
+        <w:t>npm run web        # Inicia la versión web</w:t>
+      </w:r>
+      <w:r>
+        <w:br/>
+      </w:r>
+      <w:r>
+        <w:rPr>
+          <w:rFonts w:ascii="Consolas" w:hAnsi="Consolas"/>
+          <w:sz w:val="18"/>
+        </w:rPr>
+        <w:t>npm run android    # Inicia Expo y solicita abrir Android</w:t>
+      </w:r>
+      <w:r>
+        <w:br/>
+      </w:r>
+      <w:r>
+        <w:rPr>
+          <w:rFonts w:ascii="Consolas" w:hAnsi="Consolas"/>
+          <w:sz w:val="18"/>
+        </w:rPr>
+        <w:t>npm run ios        # Inicia Expo y solicita abrir iOS</w:t>
       </w:r>
     </w:p>
     <w:p>
@@ -16222,13 +16222,7 @@
         <w:rPr/>
       </w:pPr>
       <w:r>
-        <w:rPr>
-          <w:rFonts w:eastAsia="Times New Roman"/>
-          <w:b w:val="false"/>
-          <w:i w:val="false"/>
-          <w:sz w:val="24"/>
-        </w:rPr>
-        <w:t>Seguir las instrucciones que muestra Expo para abrir la aplicación en un dispositivo o emulador.</w:t>
+        <w:t>Para web, ejecute npm run web y abra la URL local que indique Expo en un navegador. Para teléfono, use npm start y escanee el QR con una versión compatible de Expo Go; el ordenador y el dispositivo deben poder comunicarse por la red. Los scripts android e ios solicitan abrir sus respectivos emuladores/dispositivos; iOS requiere macOS y Xcode. No se verificaron dispositivos ni emuladores nativos en esta revisión.</w:t>
       </w:r>
     </w:p>
     <w:p>
@@ -16249,13 +16243,7 @@
         <w:rPr/>
       </w:pPr>
       <w:r>
-        <w:rPr>
-          <w:rFonts w:eastAsia="Times New Roman"/>
-          <w:b w:val="false"/>
-          <w:i w:val="false"/>
-          <w:sz w:val="24"/>
-        </w:rPr>
-        <w:t>El README documenta el comando `npm test`. Antes de usarlo, comprobar que package.json defina el script test y que las dependencias de pruebas estén instaladas.</w:t>
+        <w:t>El script test de package.json ejecuta el test runner integrado de Node (`node --test tests/*.test.mjs`). Aunque Jest y jest-expo aparecen como dependencias de desarrollo, no son el comando configurado por el script.</w:t>
       </w:r>
     </w:p>
     <w:p>
@@ -16265,12 +16253,6 @@
         <w:rPr/>
       </w:pPr>
       <w:r>
-        <w:rPr>
-          <w:rFonts w:eastAsia="Times New Roman"/>
-          <w:b w:val="false"/>
-          <w:i w:val="false"/>
-          <w:sz w:val="24"/>
-        </w:rPr>
         <w:t>npm test</w:t>
       </w:r>
     </w:p>
@@ -16281,8 +16263,7 @@
         <w:rPr/>
       </w:pPr>
       <w:r>
-        <w:rPr/>
-        <w:t>Configuración de la API futura</w:t>
+        <w:t>Variables de entorno del frontend</w:t>
       </w:r>
     </w:p>
     <w:p>
@@ -16292,13 +16273,7 @@
         <w:rPr/>
       </w:pPr>
       <w:r>
-        <w:rPr>
-          <w:rFonts w:eastAsia="Times New Roman"/>
-          <w:b w:val="false"/>
-          <w:i w:val="false"/>
-          <w:sz w:val="24"/>
-        </w:rPr>
-        <w:t>El README menciona la variable `EXPO_PUBLIC_API_URL` para configurar el cliente HTTP. Mientras el backend Ktor no esté disponible, la aplicación puede probarse con la capa local descrita por el proyecto. Cuando exista un servidor, debe configurarse la URL accesible desde el dispositivo o emulador; `localhost` dentro de un emulador no siempre apunta al equipo anfitrión.</w:t>
+        <w:t>No se requiere ningún archivo .env ni variable de entorno para instalar, iniciar o probar los flujos locales. apiService.js lee EXPO_PUBLIC_API_URL para sus solicitudes, pero no se encontraron consumidores de ese servicio en los flujos actuales; configurar la variable no acredita por sí solo una integración funcional. No existe un .env.example en la raíz del frontend.</w:t>
       </w:r>
     </w:p>
     <w:p>
@@ -16325,10 +16300,7 @@
         <w:rPr/>
       </w:pPr>
       <w:r>
-        <w:rPr>
-          <w:sz w:val="24"/>
-        </w:rPr>
-        <w:t>Si falla la instalación, revisar la versión de Node.js, borrar node_modules y reinstalar solo si el equipo lo considera necesario, y consultar el mensaje de error completo.</w:t>
+        <w:t>Si npm ci falla, confirme que está en Sprache/ y que package.json y package-lock.json corresponden a la misma revisión. npm ci reconstruye node_modules según el lockfile; no use npm install como sustituto al buscar reproducibilidad.</w:t>
       </w:r>
     </w:p>
     <w:p>
@@ -16344,10 +16316,7 @@
         <w:rPr/>
       </w:pPr>
       <w:r>
-        <w:rPr>
-          <w:sz w:val="24"/>
-        </w:rPr>
-        <w:t>Si Expo no encuentra el proyecto, comprobar que la terminal esté ubicada en la carpeta donde se encuentra package.json.</w:t>
+        <w:t>Si aparece “Project root directory not found”, cambie a Sprache/ (la carpeta que contiene package.json) antes de ejecutar Expo; desde la raíz del repositorio el CLI no encuentra el proyecto.</w:t>
       </w:r>
     </w:p>
     <w:p>
@@ -16363,10 +16332,7 @@
         <w:rPr/>
       </w:pPr>
       <w:r>
-        <w:rPr>
-          <w:sz w:val="24"/>
-        </w:rPr>
-        <w:t>Si la app no conecta con la API, comprobar EXPO_PUBLIC_API_URL, que el servidor esté activo y que la dirección sea accesible desde el dispositivo.</w:t>
+        <w:t>Si el puerto de desarrollo está ocupado, elija otro, por ejemplo `npm run web -- --port 8082`. Si el QR no abre en el teléfono, compruebe que ambos dispositivos puedan comunicarse en la red local; esa conexión no se validó en esta ejecución.</w:t>
       </w:r>
     </w:p>
     <w:p>
@@ -16382,10 +16348,48 @@
         <w:rPr/>
       </w:pPr>
       <w:r>
-        <w:rPr>
-          <w:sz w:val="24"/>
-        </w:rPr>
-        <w:t>Si `npm run android`, `npm run ios`, `npm run web` o `npm test` no existen, revisar los scripts de package.json y actualizar estas instrucciones al estado real del repositorio.</w:t>
+        <w:t>npm ci informó de 10 vulnerabilidades en el árbol instalado (3 moderadas, 6 altas y 1 crítica), además de avisos de paquetes deprecados. Consulte npm audit para el detalle; no ejecute npm audit fix --force ni actualice dependencias como parte de una simple instalación.</w:t>
+      </w:r>
+    </w:p>
+    <w:p>
+      <w:pPr>
+        <w:pStyle w:val="Heading2"/>
+        <w:keepNext/>
+      </w:pPr>
+      <w:r>
+        <w:t>Verificación reproducible y límites</w:t>
+      </w:r>
+    </w:p>
+    <w:p>
+      <w:pPr>
+        <w:keepLines/>
+      </w:pPr>
+      <w:r>
+        <w:t>En el entorno verificado: Node.js 22.22.1, npm 9.2.0, Expo SDK 58.0.19 (resuelto por package-lock.json) y Expo CLI local 58.1.15. Las versiones relevantes resueltas incluyen React 19.3.0, React Native 0.88.0, React DOM 19.3.0, React Native Web 0.21.4, Jest 30.5.2 y jest-expo 58.0.12.</w:t>
+      </w:r>
+    </w:p>
+    <w:p>
+      <w:pPr>
+        <w:keepLines/>
+      </w:pPr>
+      <w:r>
+        <w:t>npm ci terminó correctamente desde la raíz del frontend. `npx expo install --check` informó que las dependencias están actualizadas. `npm test` finalizó con 33 pruebas aprobadas y 0 fallidas.</w:t>
+      </w:r>
+    </w:p>
+    <w:p>
+      <w:pPr>
+        <w:keepLines/>
+      </w:pPr>
+      <w:r>
+        <w:t>`npm start -- --port 8083` inició Metro y quedó esperando en http://localhost:8083. `npm run web -- --port 8082` compiló 731 módulos y mostró la pantalla Start en el navegador sin errores críticos. El comando git clone se documenta a partir del remoto configurado, pero no se volvió a clonar el repositorio ya disponible.</w:t>
+      </w:r>
+    </w:p>
+    <w:p>
+      <w:pPr>
+        <w:keepLines/>
+      </w:pPr>
+      <w:r>
+        <w:t>No se ejecutaron npm run android ni npm run ios: no hay adb/Android SDK ni Xcode disponibles en este entorno; el inicio en Android/iOS, emuladores, dispositivos, QR, voz y háptica queda pendiente de verificación. La ejecución web comprobada no acredita esas plataformas.</w:t>
       </w:r>
     </w:p>
     <w:p>

</xml_diff>

<commit_message>
feat:verificar pantallas e integrar evidencias
</commit_message>
<xml_diff>
--- a/Sprache/Informe_Frontend_Sprache_APA.docx
+++ b/Sprache/Informe_Frontend_Sprache_APA.docx
@@ -15420,13 +15420,7 @@
         <w:rPr/>
       </w:pPr>
       <w:r>
-        <w:rPr>
-          <w:rFonts w:eastAsia="Times New Roman"/>
-          <w:b w:val="false"/>
-          <w:i w:val="false"/>
-          <w:sz w:val="24"/>
-        </w:rPr>
-        <w:t>En esta sección se agregarán capturas tomadas durante la ejecución real de la aplicación. Cada evidencia debe corresponder a una versión identificable del código y mostrar el resultado ejecutado, no solamente el diseño esperado.</w:t>
+        <w:t>Las siguientes capturas se obtuvieron de la aplicación real ejecutada en Expo Web desde Sprache/. Se usó una cuenta sintética de prueba; no se incluyen credenciales reales. Las evidencias documentan acciones y resultados observados en navegador, no constituyen pruebas en dispositivos Android/iOS.</w:t>
       </w:r>
     </w:p>
     <w:p>
@@ -15442,34 +15436,57 @@
     </w:p>
     <w:p>
       <w:pPr>
-        <w:pStyle w:val="Normal"/>
+        <w:pStyle w:val="Caption"/>
+        <w:widowControl/>
+        <w:jc w:val="center"/>
+        <w:rPr/>
+      </w:pPr>
+      <w:r>
+        <w:drawing>
+          <wp:inline xmlns:a="http://schemas.openxmlformats.org/drawingml/2006/main">
+            <wp:extent cx="5715000" cy="2472497"/>
+            <wp:docPr id="15" name="Picture 15"/>
+            <wp:cNvGraphicFramePr>
+              <a:graphicFrameLocks noChangeAspect="1"/>
+            </wp:cNvGraphicFramePr>
+            <a:graphic>
+              <a:graphicData uri="http://schemas.openxmlformats.org/drawingml/2006/picture">
+                <pic:pic>
+                  <pic:nvPicPr>
+                    <pic:cNvPr id="0" name="EV-01-start.png"/>
+                    <pic:cNvPicPr/>
+                  </pic:nvPicPr>
+                  <pic:blipFill>
+                    <a:blip r:embed="rId24"/>
+                    <a:stretch>
+                      <a:fillRect/>
+                    </a:stretch>
+                  </pic:blipFill>
+                  <pic:spPr>
+                    <a:xfrm>
+                      <a:off x="0" y="0"/>
+                      <a:ext cx="5715000" cy="2472497"/>
+                    </a:xfrm>
+                    <a:prstGeom prst="rect"/>
+                  </pic:spPr>
+                </pic:pic>
+              </a:graphicData>
+            </a:graphic>
+          </wp:inline>
+        </w:drawing>
+      </w:r>
+      <w:r>
+        <w:br/>
+        <w:t>Figura. Inicio / bienvenida. Fuente: captura de la aplicación ejecutada en Expo Web, elaboración propia.</w:t>
+      </w:r>
+    </w:p>
+    <w:p>
+      <w:pPr>
         <w:widowControl/>
         <w:rPr/>
       </w:pPr>
       <w:r>
-        <w:rPr>
-          <w:rFonts w:eastAsia="Times New Roman"/>
-          <w:b w:val="false"/>
-          <w:i/>
-          <w:sz w:val="24"/>
-        </w:rPr>
-        <w:t>[INSERTAR CAPTURA DE LA APLICACIÓN EN EJECUCIÓN]</w:t>
-      </w:r>
-    </w:p>
-    <w:p>
-      <w:pPr>
-        <w:pStyle w:val="Normal"/>
-        <w:widowControl/>
-        <w:rPr/>
-      </w:pPr>
-      <w:r>
-        <w:rPr>
-          <w:rFonts w:eastAsia="Times New Roman"/>
-          <w:b w:val="false"/>
-          <w:i w:val="false"/>
-          <w:sz w:val="24"/>
-        </w:rPr>
-        <w:t>Descripción de la evidencia: [indicar qué se valida, acción realizada, resultado observado y dispositivo/emulador utilizado].</w:t>
+        <w:t>Acción y resultado: Se abrió la aplicación Expo Web desde el servidor de desarrollo. Se observó la pantalla Start con las acciones Crear cuenta e Iniciar sesión. Resultado: pantalla cargada y acciones accesibles.</w:t>
       </w:r>
     </w:p>
     <w:p>
@@ -15485,34 +15502,57 @@
     </w:p>
     <w:p>
       <w:pPr>
-        <w:pStyle w:val="Normal"/>
+        <w:pStyle w:val="Caption"/>
+        <w:widowControl/>
+        <w:jc w:val="center"/>
+        <w:rPr/>
+      </w:pPr>
+      <w:r>
+        <w:drawing>
+          <wp:inline xmlns:a="http://schemas.openxmlformats.org/drawingml/2006/main">
+            <wp:extent cx="5715000" cy="2472497"/>
+            <wp:docPr id="16" name="Picture 16"/>
+            <wp:cNvGraphicFramePr>
+              <a:graphicFrameLocks noChangeAspect="1"/>
+            </wp:cNvGraphicFramePr>
+            <a:graphic>
+              <a:graphicData uri="http://schemas.openxmlformats.org/drawingml/2006/picture">
+                <pic:pic>
+                  <pic:nvPicPr>
+                    <pic:cNvPr id="0" name="EV-02-register.png"/>
+                    <pic:cNvPicPr/>
+                  </pic:nvPicPr>
+                  <pic:blipFill>
+                    <a:blip r:embed="rId25"/>
+                    <a:stretch>
+                      <a:fillRect/>
+                    </a:stretch>
+                  </pic:blipFill>
+                  <pic:spPr>
+                    <a:xfrm>
+                      <a:off x="0" y="0"/>
+                      <a:ext cx="5715000" cy="2472497"/>
+                    </a:xfrm>
+                    <a:prstGeom prst="rect"/>
+                  </pic:spPr>
+                </pic:pic>
+              </a:graphicData>
+            </a:graphic>
+          </wp:inline>
+        </w:drawing>
+      </w:r>
+      <w:r>
+        <w:br/>
+        <w:t>Figura. Registro: datos básicos. Fuente: captura de la aplicación ejecutada en Expo Web, elaboración propia.</w:t>
+      </w:r>
+    </w:p>
+    <w:p>
+      <w:pPr>
         <w:widowControl/>
         <w:rPr/>
       </w:pPr>
       <w:r>
-        <w:rPr>
-          <w:rFonts w:eastAsia="Times New Roman"/>
-          <w:b w:val="false"/>
-          <w:i/>
-          <w:sz w:val="24"/>
-        </w:rPr>
-        <w:t>[INSERTAR CAPTURA DE LA APLICACIÓN EN EJECUCIÓN]</w:t>
-      </w:r>
-    </w:p>
-    <w:p>
-      <w:pPr>
-        <w:pStyle w:val="Normal"/>
-        <w:widowControl/>
-        <w:rPr/>
-      </w:pPr>
-      <w:r>
-        <w:rPr>
-          <w:rFonts w:eastAsia="Times New Roman"/>
-          <w:b w:val="false"/>
-          <w:i w:val="false"/>
-          <w:sz w:val="24"/>
-        </w:rPr>
-        <w:t>Descripción de la evidencia: [indicar qué se valida, acción realizada, resultado observado y dispositivo/emulador utilizado].</w:t>
+        <w:t>Acción y resultado: Se inició el flujo Crear cuenta y se completó el formulario con datos sintéticos de prueba (no pertenecen a una persona real). Se verificaron los cuatro pasos, el salto opcional de evaluación y la creación del perfil; el flujo terminó en Inicio.</w:t>
       </w:r>
     </w:p>
     <w:p>
@@ -15528,34 +15568,57 @@
     </w:p>
     <w:p>
       <w:pPr>
-        <w:pStyle w:val="Normal"/>
+        <w:pStyle w:val="Caption"/>
+        <w:widowControl/>
+        <w:jc w:val="center"/>
+        <w:rPr/>
+      </w:pPr>
+      <w:r>
+        <w:drawing>
+          <wp:inline xmlns:a="http://schemas.openxmlformats.org/drawingml/2006/main">
+            <wp:extent cx="5715000" cy="2472497"/>
+            <wp:docPr id="17" name="Picture 17"/>
+            <wp:cNvGraphicFramePr>
+              <a:graphicFrameLocks noChangeAspect="1"/>
+            </wp:cNvGraphicFramePr>
+            <a:graphic>
+              <a:graphicData uri="http://schemas.openxmlformats.org/drawingml/2006/picture">
+                <pic:pic>
+                  <pic:nvPicPr>
+                    <pic:cNvPr id="0" name="EV-03-login.png"/>
+                    <pic:cNvPicPr/>
+                  </pic:nvPicPr>
+                  <pic:blipFill>
+                    <a:blip r:embed="rId26"/>
+                    <a:stretch>
+                      <a:fillRect/>
+                    </a:stretch>
+                  </pic:blipFill>
+                  <pic:spPr>
+                    <a:xfrm>
+                      <a:off x="0" y="0"/>
+                      <a:ext cx="5715000" cy="2472497"/>
+                    </a:xfrm>
+                    <a:prstGeom prst="rect"/>
+                  </pic:spPr>
+                </pic:pic>
+              </a:graphicData>
+            </a:graphic>
+          </wp:inline>
+        </w:drawing>
+      </w:r>
+      <w:r>
+        <w:br/>
+        <w:t>Figura. Inicio de sesión. Fuente: captura de la aplicación ejecutada en Expo Web, elaboración propia.</w:t>
+      </w:r>
+    </w:p>
+    <w:p>
+      <w:pPr>
         <w:widowControl/>
         <w:rPr/>
       </w:pPr>
       <w:r>
-        <w:rPr>
-          <w:rFonts w:eastAsia="Times New Roman"/>
-          <w:b w:val="false"/>
-          <w:i/>
-          <w:sz w:val="24"/>
-        </w:rPr>
-        <w:t>[INSERTAR CAPTURA DE LA APLICACIÓN EN EJECUCIÓN]</w:t>
-      </w:r>
-    </w:p>
-    <w:p>
-      <w:pPr>
-        <w:pStyle w:val="Normal"/>
-        <w:widowControl/>
-        <w:rPr/>
-      </w:pPr>
-      <w:r>
-        <w:rPr>
-          <w:rFonts w:eastAsia="Times New Roman"/>
-          <w:b w:val="false"/>
-          <w:i w:val="false"/>
-          <w:sz w:val="24"/>
-        </w:rPr>
-        <w:t>Descripción de la evidencia: [indicar qué se valida, acción realizada, resultado observado y dispositivo/emulador utilizado].</w:t>
+        <w:t>Acción y resultado: Tras cerrar sesión, se inició de nuevo con la cuenta sintética de prueba. Resultado: autenticación local correcta y retorno a la aplicación.</w:t>
       </w:r>
     </w:p>
     <w:p>
@@ -15571,34 +15634,57 @@
     </w:p>
     <w:p>
       <w:pPr>
-        <w:pStyle w:val="Normal"/>
+        <w:pStyle w:val="Caption"/>
+        <w:widowControl/>
+        <w:jc w:val="center"/>
+        <w:rPr/>
+      </w:pPr>
+      <w:r>
+        <w:drawing>
+          <wp:inline xmlns:a="http://schemas.openxmlformats.org/drawingml/2006/main">
+            <wp:extent cx="5715000" cy="2472497"/>
+            <wp:docPr id="18" name="Picture 18"/>
+            <wp:cNvGraphicFramePr>
+              <a:graphicFrameLocks noChangeAspect="1"/>
+            </wp:cNvGraphicFramePr>
+            <a:graphic>
+              <a:graphicData uri="http://schemas.openxmlformats.org/drawingml/2006/picture">
+                <pic:pic>
+                  <pic:nvPicPr>
+                    <pic:cNvPr id="0" name="EV-04-home.png"/>
+                    <pic:cNvPicPr/>
+                  </pic:nvPicPr>
+                  <pic:blipFill>
+                    <a:blip r:embed="rId27"/>
+                    <a:stretch>
+                      <a:fillRect/>
+                    </a:stretch>
+                  </pic:blipFill>
+                  <pic:spPr>
+                    <a:xfrm>
+                      <a:off x="0" y="0"/>
+                      <a:ext cx="5715000" cy="2472497"/>
+                    </a:xfrm>
+                    <a:prstGeom prst="rect"/>
+                  </pic:spPr>
+                </pic:pic>
+              </a:graphicData>
+            </a:graphic>
+          </wp:inline>
+        </w:drawing>
+      </w:r>
+      <w:r>
+        <w:br/>
+        <w:t>Figura. Inicio. Fuente: captura de la aplicación ejecutada en Expo Web, elaboración propia.</w:t>
+      </w:r>
+    </w:p>
+    <w:p>
+      <w:pPr>
         <w:widowControl/>
         <w:rPr/>
       </w:pPr>
       <w:r>
-        <w:rPr>
-          <w:rFonts w:eastAsia="Times New Roman"/>
-          <w:b w:val="false"/>
-          <w:i/>
-          <w:sz w:val="24"/>
-        </w:rPr>
-        <w:t>[INSERTAR CAPTURA DE LA APLICACIÓN EN EJECUCIÓN]</w:t>
-      </w:r>
-    </w:p>
-    <w:p>
-      <w:pPr>
-        <w:pStyle w:val="Normal"/>
-        <w:widowControl/>
-        <w:rPr/>
-      </w:pPr>
-      <w:r>
-        <w:rPr>
-          <w:rFonts w:eastAsia="Times New Roman"/>
-          <w:b w:val="false"/>
-          <w:i w:val="false"/>
-          <w:sz w:val="24"/>
-        </w:rPr>
-        <w:t>Descripción de la evidencia: [indicar qué se valida, acción realizada, resultado observado y dispositivo/emulador utilizado].</w:t>
+        <w:t>Acción y resultado: Después del registro se observó el perfil de prueba, meta diaria, recomendación de aprendizaje, accesos a contenidos y las cuatro pestañas de navegación.</w:t>
       </w:r>
     </w:p>
     <w:p>
@@ -15614,34 +15700,57 @@
     </w:p>
     <w:p>
       <w:pPr>
-        <w:pStyle w:val="Normal"/>
+        <w:pStyle w:val="Caption"/>
+        <w:widowControl/>
+        <w:jc w:val="center"/>
+        <w:rPr/>
+      </w:pPr>
+      <w:r>
+        <w:drawing>
+          <wp:inline xmlns:a="http://schemas.openxmlformats.org/drawingml/2006/main">
+            <wp:extent cx="5715000" cy="2472497"/>
+            <wp:docPr id="19" name="Picture 19"/>
+            <wp:cNvGraphicFramePr>
+              <a:graphicFrameLocks noChangeAspect="1"/>
+            </wp:cNvGraphicFramePr>
+            <a:graphic>
+              <a:graphicData uri="http://schemas.openxmlformats.org/drawingml/2006/picture">
+                <pic:pic>
+                  <pic:nvPicPr>
+                    <pic:cNvPr id="0" name="EV-05-activities.png"/>
+                    <pic:cNvPicPr/>
+                  </pic:nvPicPr>
+                  <pic:blipFill>
+                    <a:blip r:embed="rId28"/>
+                    <a:stretch>
+                      <a:fillRect/>
+                    </a:stretch>
+                  </pic:blipFill>
+                  <pic:spPr>
+                    <a:xfrm>
+                      <a:off x="0" y="0"/>
+                      <a:ext cx="5715000" cy="2472497"/>
+                    </a:xfrm>
+                    <a:prstGeom prst="rect"/>
+                  </pic:spPr>
+                </pic:pic>
+              </a:graphicData>
+            </a:graphic>
+          </wp:inline>
+        </w:drawing>
+      </w:r>
+      <w:r>
+        <w:br/>
+        <w:t>Figura. Actividades. Fuente: captura de la aplicación ejecutada en Expo Web, elaboración propia.</w:t>
+      </w:r>
+    </w:p>
+    <w:p>
+      <w:pPr>
         <w:widowControl/>
         <w:rPr/>
       </w:pPr>
       <w:r>
-        <w:rPr>
-          <w:rFonts w:eastAsia="Times New Roman"/>
-          <w:b w:val="false"/>
-          <w:i/>
-          <w:sz w:val="24"/>
-        </w:rPr>
-        <w:t>[INSERTAR CAPTURA DE LA APLICACIÓN EN EJECUCIÓN]</w:t>
-      </w:r>
-    </w:p>
-    <w:p>
-      <w:pPr>
-        <w:pStyle w:val="Normal"/>
-        <w:widowControl/>
-        <w:rPr/>
-      </w:pPr>
-      <w:r>
-        <w:rPr>
-          <w:rFonts w:eastAsia="Times New Roman"/>
-          <w:b w:val="false"/>
-          <w:i w:val="false"/>
-          <w:sz w:val="24"/>
-        </w:rPr>
-        <w:t>Descripción de la evidencia: [indicar qué se valida, acción realizada, resultado observado y dispositivo/emulador utilizado].</w:t>
+        <w:t>Acción y resultado: Se abrieron las pestañas A1 y A2, se comprobó que cambia el catálogo y se abrió una actividad; Cerrar lección retornó a Actividades. Tras corregir el icono inválido detectado, esta pantalla volvió a abrirse sin advertencias de iconos en la consola.</w:t>
       </w:r>
     </w:p>
     <w:p>
@@ -15657,34 +15766,57 @@
     </w:p>
     <w:p>
       <w:pPr>
-        <w:pStyle w:val="Normal"/>
+        <w:pStyle w:val="Caption"/>
+        <w:widowControl/>
+        <w:jc w:val="center"/>
+        <w:rPr/>
+      </w:pPr>
+      <w:r>
+        <w:drawing>
+          <wp:inline xmlns:a="http://schemas.openxmlformats.org/drawingml/2006/main">
+            <wp:extent cx="5715000" cy="2472497"/>
+            <wp:docPr id="20" name="Picture 20"/>
+            <wp:cNvGraphicFramePr>
+              <a:graphicFrameLocks noChangeAspect="1"/>
+            </wp:cNvGraphicFramePr>
+            <a:graphic>
+              <a:graphicData uri="http://schemas.openxmlformats.org/drawingml/2006/picture">
+                <pic:pic>
+                  <pic:nvPicPr>
+                    <pic:cNvPr id="0" name="EV-06b-progress-after-learning.png"/>
+                    <pic:cNvPicPr/>
+                  </pic:nvPicPr>
+                  <pic:blipFill>
+                    <a:blip r:embed="rId29"/>
+                    <a:stretch>
+                      <a:fillRect/>
+                    </a:stretch>
+                  </pic:blipFill>
+                  <pic:spPr>
+                    <a:xfrm>
+                      <a:off x="0" y="0"/>
+                      <a:ext cx="5715000" cy="2472497"/>
+                    </a:xfrm>
+                    <a:prstGeom prst="rect"/>
+                  </pic:spPr>
+                </pic:pic>
+              </a:graphicData>
+            </a:graphic>
+          </wp:inline>
+        </w:drawing>
+      </w:r>
+      <w:r>
+        <w:br/>
+        <w:t>Figura. Progreso. Fuente: captura de la aplicación ejecutada en Expo Web, elaboración propia.</w:t>
+      </w:r>
+    </w:p>
+    <w:p>
+      <w:pPr>
         <w:widowControl/>
         <w:rPr/>
       </w:pPr>
       <w:r>
-        <w:rPr>
-          <w:rFonts w:eastAsia="Times New Roman"/>
-          <w:b w:val="false"/>
-          <w:i/>
-          <w:sz w:val="24"/>
-        </w:rPr>
-        <w:t>[INSERTAR CAPTURA DE LA APLICACIÓN EN EJECUCIÓN]</w:t>
-      </w:r>
-    </w:p>
-    <w:p>
-      <w:pPr>
-        <w:pStyle w:val="Normal"/>
-        <w:widowControl/>
-        <w:rPr/>
-      </w:pPr>
-      <w:r>
-        <w:rPr>
-          <w:rFonts w:eastAsia="Times New Roman"/>
-          <w:b w:val="false"/>
-          <w:i w:val="false"/>
-          <w:sz w:val="24"/>
-        </w:rPr>
-        <w:t>Descripción de la evidencia: [indicar qué se valida, acción realizada, resultado observado y dispositivo/emulador utilizado].</w:t>
+        <w:t>Acción y resultado: Después de practicar se comprobó que las métricas reflejan una sesión, 3 palabras, 57 segundos, una lectura y una lección teórica completadas; coincide con las acciones realizadas.</w:t>
       </w:r>
     </w:p>
     <w:p>
@@ -15700,34 +15832,57 @@
     </w:p>
     <w:p>
       <w:pPr>
-        <w:pStyle w:val="Normal"/>
+        <w:pStyle w:val="Caption"/>
+        <w:widowControl/>
+        <w:jc w:val="center"/>
+        <w:rPr/>
+      </w:pPr>
+      <w:r>
+        <w:drawing>
+          <wp:inline xmlns:a="http://schemas.openxmlformats.org/drawingml/2006/main">
+            <wp:extent cx="5715000" cy="2472497"/>
+            <wp:docPr id="21" name="Picture 21"/>
+            <wp:cNvGraphicFramePr>
+              <a:graphicFrameLocks noChangeAspect="1"/>
+            </wp:cNvGraphicFramePr>
+            <a:graphic>
+              <a:graphicData uri="http://schemas.openxmlformats.org/drawingml/2006/picture">
+                <pic:pic>
+                  <pic:nvPicPr>
+                    <pic:cNvPr id="0" name="EV-07-profile.png"/>
+                    <pic:cNvPicPr/>
+                  </pic:nvPicPr>
+                  <pic:blipFill>
+                    <a:blip r:embed="rId30"/>
+                    <a:stretch>
+                      <a:fillRect/>
+                    </a:stretch>
+                  </pic:blipFill>
+                  <pic:spPr>
+                    <a:xfrm>
+                      <a:off x="0" y="0"/>
+                      <a:ext cx="5715000" cy="2472497"/>
+                    </a:xfrm>
+                    <a:prstGeom prst="rect"/>
+                  </pic:spPr>
+                </pic:pic>
+              </a:graphicData>
+            </a:graphic>
+          </wp:inline>
+        </w:drawing>
+      </w:r>
+      <w:r>
+        <w:br/>
+        <w:t>Figura. Perfil. Fuente: captura de la aplicación ejecutada en Expo Web, elaboración propia.</w:t>
+      </w:r>
+    </w:p>
+    <w:p>
+      <w:pPr>
         <w:widowControl/>
         <w:rPr/>
       </w:pPr>
       <w:r>
-        <w:rPr>
-          <w:rFonts w:eastAsia="Times New Roman"/>
-          <w:b w:val="false"/>
-          <w:i/>
-          <w:sz w:val="24"/>
-        </w:rPr>
-        <w:t>[INSERTAR CAPTURA DE LA APLICACIÓN EN EJECUCIÓN]</w:t>
-      </w:r>
-    </w:p>
-    <w:p>
-      <w:pPr>
-        <w:pStyle w:val="Normal"/>
-        <w:widowControl/>
-        <w:rPr/>
-      </w:pPr>
-      <w:r>
-        <w:rPr>
-          <w:rFonts w:eastAsia="Times New Roman"/>
-          <w:b w:val="false"/>
-          <w:i w:val="false"/>
-          <w:sz w:val="24"/>
-        </w:rPr>
-        <w:t>Descripción de la evidencia: [indicar qué se valida, acción realizada, resultado observado y dispositivo/emulador utilizado].</w:t>
+        <w:t>Acción y resultado: Se cambió la meta diaria, se editó el nombre del perfil, se guardó y se recargó la aplicación. El nombre y la meta persistieron en el almacenamiento local; luego se probó cerrar sesión e iniciar sesión.</w:t>
       </w:r>
     </w:p>
     <w:p>
@@ -15743,34 +15898,57 @@
     </w:p>
     <w:p>
       <w:pPr>
-        <w:pStyle w:val="Normal"/>
+        <w:pStyle w:val="Caption"/>
+        <w:widowControl/>
+        <w:jc w:val="center"/>
+        <w:rPr/>
+      </w:pPr>
+      <w:r>
+        <w:drawing>
+          <wp:inline xmlns:a="http://schemas.openxmlformats.org/drawingml/2006/main">
+            <wp:extent cx="5715000" cy="2472497"/>
+            <wp:docPr id="22" name="Picture 22"/>
+            <wp:cNvGraphicFramePr>
+              <a:graphicFrameLocks noChangeAspect="1"/>
+            </wp:cNvGraphicFramePr>
+            <a:graphic>
+              <a:graphicData uri="http://schemas.openxmlformats.org/drawingml/2006/picture">
+                <pic:pic>
+                  <pic:nvPicPr>
+                    <pic:cNvPr id="0" name="EV-08-lesson.png"/>
+                    <pic:cNvPicPr/>
+                  </pic:nvPicPr>
+                  <pic:blipFill>
+                    <a:blip r:embed="rId31"/>
+                    <a:stretch>
+                      <a:fillRect/>
+                    </a:stretch>
+                  </pic:blipFill>
+                  <pic:spPr>
+                    <a:xfrm>
+                      <a:off x="0" y="0"/>
+                      <a:ext cx="5715000" cy="2472497"/>
+                    </a:xfrm>
+                    <a:prstGeom prst="rect"/>
+                  </pic:spPr>
+                </pic:pic>
+              </a:graphicData>
+            </a:graphic>
+          </wp:inline>
+        </w:drawing>
+      </w:r>
+      <w:r>
+        <w:br/>
+        <w:t>Figura. Lección. Fuente: captura de la aplicación ejecutada en Expo Web, elaboración propia.</w:t>
+      </w:r>
+    </w:p>
+    <w:p>
+      <w:pPr>
         <w:widowControl/>
         <w:rPr/>
       </w:pPr>
       <w:r>
-        <w:rPr>
-          <w:rFonts w:eastAsia="Times New Roman"/>
-          <w:b w:val="false"/>
-          <w:i/>
-          <w:sz w:val="24"/>
-        </w:rPr>
-        <w:t>[INSERTAR CAPTURA DE LA APLICACIÓN EN EJECUCIÓN]</w:t>
-      </w:r>
-    </w:p>
-    <w:p>
-      <w:pPr>
-        <w:pStyle w:val="Normal"/>
-        <w:widowControl/>
-        <w:rPr/>
-      </w:pPr>
-      <w:r>
-        <w:rPr>
-          <w:rFonts w:eastAsia="Times New Roman"/>
-          <w:b w:val="false"/>
-          <w:i w:val="false"/>
-          <w:sz w:val="24"/>
-        </w:rPr>
-        <w:t>Descripción de la evidencia: [indicar qué se valida, acción realizada, resultado observado y dispositivo/emulador utilizado].</w:t>
+        <w:t>Acción y resultado: Se abrió y reanudó Vocabulario básico desde Inicio. La pantalla presentó una pregunta de selección, progreso y control de respuesta. Se respondieron las tres preguntas correctamente.</w:t>
       </w:r>
     </w:p>
     <w:p>
@@ -15786,34 +15964,57 @@
     </w:p>
     <w:p>
       <w:pPr>
-        <w:pStyle w:val="Normal"/>
+        <w:pStyle w:val="Caption"/>
+        <w:widowControl/>
+        <w:jc w:val="center"/>
+        <w:rPr/>
+      </w:pPr>
+      <w:r>
+        <w:drawing>
+          <wp:inline xmlns:a="http://schemas.openxmlformats.org/drawingml/2006/main">
+            <wp:extent cx="5715000" cy="3489753"/>
+            <wp:docPr id="23" name="Picture 23"/>
+            <wp:cNvGraphicFramePr>
+              <a:graphicFrameLocks noChangeAspect="1"/>
+            </wp:cNvGraphicFramePr>
+            <a:graphic>
+              <a:graphicData uri="http://schemas.openxmlformats.org/drawingml/2006/picture">
+                <pic:pic>
+                  <pic:nvPicPr>
+                    <pic:cNvPr id="0" name="EV-09-session-summary.png"/>
+                    <pic:cNvPicPr/>
+                  </pic:nvPicPr>
+                  <pic:blipFill>
+                    <a:blip r:embed="rId32"/>
+                    <a:stretch>
+                      <a:fillRect/>
+                    </a:stretch>
+                  </pic:blipFill>
+                  <pic:spPr>
+                    <a:xfrm>
+                      <a:off x="0" y="0"/>
+                      <a:ext cx="5715000" cy="3489753"/>
+                    </a:xfrm>
+                    <a:prstGeom prst="rect"/>
+                  </pic:spPr>
+                </pic:pic>
+              </a:graphicData>
+            </a:graphic>
+          </wp:inline>
+        </w:drawing>
+      </w:r>
+      <w:r>
+        <w:br/>
+        <w:t>Figura. Resumen de sesión. Fuente: captura de la aplicación ejecutada en Expo Web, elaboración propia.</w:t>
+      </w:r>
+    </w:p>
+    <w:p>
+      <w:pPr>
         <w:widowControl/>
         <w:rPr/>
       </w:pPr>
       <w:r>
-        <w:rPr>
-          <w:rFonts w:eastAsia="Times New Roman"/>
-          <w:b w:val="false"/>
-          <w:i/>
-          <w:sz w:val="24"/>
-        </w:rPr>
-        <w:t>[INSERTAR CAPTURA DE LA APLICACIÓN EN EJECUCIÓN]</w:t>
-      </w:r>
-    </w:p>
-    <w:p>
-      <w:pPr>
-        <w:pStyle w:val="Normal"/>
-        <w:widowControl/>
-        <w:rPr/>
-      </w:pPr>
-      <w:r>
-        <w:rPr>
-          <w:rFonts w:eastAsia="Times New Roman"/>
-          <w:b w:val="false"/>
-          <w:i w:val="false"/>
-          <w:sz w:val="24"/>
-        </w:rPr>
-        <w:t>Descripción de la evidencia: [indicar qué se valida, acción realizada, resultado observado y dispositivo/emulador utilizado].</w:t>
+        <w:t>Acción y resultado: Al finalizar la lección se comprobó el resumen real: 3/3, 100 % y +50 XP, con avisos de insignias. Volver retornó a Inicio, origen de la lección.</w:t>
       </w:r>
     </w:p>
     <w:p>
@@ -15829,34 +16030,57 @@
     </w:p>
     <w:p>
       <w:pPr>
-        <w:pStyle w:val="Normal"/>
+        <w:pStyle w:val="Caption"/>
+        <w:widowControl/>
+        <w:jc w:val="center"/>
+        <w:rPr/>
+      </w:pPr>
+      <w:r>
+        <w:drawing>
+          <wp:inline xmlns:a="http://schemas.openxmlformats.org/drawingml/2006/main">
+            <wp:extent cx="5715000" cy="2472497"/>
+            <wp:docPr id="24" name="Picture 24"/>
+            <wp:cNvGraphicFramePr>
+              <a:graphicFrameLocks noChangeAspect="1"/>
+            </wp:cNvGraphicFramePr>
+            <a:graphic>
+              <a:graphicData uri="http://schemas.openxmlformats.org/drawingml/2006/picture">
+                <pic:pic>
+                  <pic:nvPicPr>
+                    <pic:cNvPr id="0" name="EV-10b-reading-completed.png"/>
+                    <pic:cNvPicPr/>
+                  </pic:nvPicPr>
+                  <pic:blipFill>
+                    <a:blip r:embed="rId33"/>
+                    <a:stretch>
+                      <a:fillRect/>
+                    </a:stretch>
+                  </pic:blipFill>
+                  <pic:spPr>
+                    <a:xfrm>
+                      <a:off x="0" y="0"/>
+                      <a:ext cx="5715000" cy="2472497"/>
+                    </a:xfrm>
+                    <a:prstGeom prst="rect"/>
+                  </pic:spPr>
+                </pic:pic>
+              </a:graphicData>
+            </a:graphic>
+          </wp:inline>
+        </w:drawing>
+      </w:r>
+      <w:r>
+        <w:br/>
+        <w:t>Figura. Lecturas. Fuente: captura de la aplicación ejecutada en Expo Web, elaboración propia.</w:t>
+      </w:r>
+    </w:p>
+    <w:p>
+      <w:pPr>
         <w:widowControl/>
         <w:rPr/>
       </w:pPr>
       <w:r>
-        <w:rPr>
-          <w:rFonts w:eastAsia="Times New Roman"/>
-          <w:b w:val="false"/>
-          <w:i/>
-          <w:sz w:val="24"/>
-        </w:rPr>
-        <w:t>[INSERTAR CAPTURA DE LA APLICACIÓN EN EJECUCIÓN]</w:t>
-      </w:r>
-    </w:p>
-    <w:p>
-      <w:pPr>
-        <w:pStyle w:val="Normal"/>
-        <w:widowControl/>
-        <w:rPr/>
-      </w:pPr>
-      <w:r>
-        <w:rPr>
-          <w:rFonts w:eastAsia="Times New Roman"/>
-          <w:b w:val="false"/>
-          <w:i w:val="false"/>
-          <w:sz w:val="24"/>
-        </w:rPr>
-        <w:t>Descripción de la evidencia: [indicar qué se valida, acción realizada, resultado observado y dispositivo/emulador utilizado].</w:t>
+        <w:t>Acción y resultado: Se consultó el significado de una palabra y se respondieron correctamente las tres preguntas de comprensión. Se mostró Lectura completada; al recargar, el avance siguió guardado.</w:t>
       </w:r>
     </w:p>
     <w:p>
@@ -15872,34 +16096,57 @@
     </w:p>
     <w:p>
       <w:pPr>
-        <w:pStyle w:val="Normal"/>
+        <w:pStyle w:val="Caption"/>
+        <w:widowControl/>
+        <w:jc w:val="center"/>
+        <w:rPr/>
+      </w:pPr>
+      <w:r>
+        <w:drawing>
+          <wp:inline xmlns:a="http://schemas.openxmlformats.org/drawingml/2006/main">
+            <wp:extent cx="5715000" cy="2472497"/>
+            <wp:docPr id="25" name="Picture 25"/>
+            <wp:cNvGraphicFramePr>
+              <a:graphicFrameLocks noChangeAspect="1"/>
+            </wp:cNvGraphicFramePr>
+            <a:graphic>
+              <a:graphicData uri="http://schemas.openxmlformats.org/drawingml/2006/picture">
+                <pic:pic>
+                  <pic:nvPicPr>
+                    <pic:cNvPr id="0" name="EV-11b-theory-completed.png"/>
+                    <pic:cNvPicPr/>
+                  </pic:nvPicPr>
+                  <pic:blipFill>
+                    <a:blip r:embed="rId34"/>
+                    <a:stretch>
+                      <a:fillRect/>
+                    </a:stretch>
+                  </pic:blipFill>
+                  <pic:spPr>
+                    <a:xfrm>
+                      <a:off x="0" y="0"/>
+                      <a:ext cx="5715000" cy="2472497"/>
+                    </a:xfrm>
+                    <a:prstGeom prst="rect"/>
+                  </pic:spPr>
+                </pic:pic>
+              </a:graphicData>
+            </a:graphic>
+          </wp:inline>
+        </w:drawing>
+      </w:r>
+      <w:r>
+        <w:br/>
+        <w:t>Figura. Teoría. Fuente: captura de la aplicación ejecutada en Expo Web, elaboración propia.</w:t>
+      </w:r>
+    </w:p>
+    <w:p>
+      <w:pPr>
         <w:widowControl/>
         <w:rPr/>
       </w:pPr>
       <w:r>
-        <w:rPr>
-          <w:rFonts w:eastAsia="Times New Roman"/>
-          <w:b w:val="false"/>
-          <w:i/>
-          <w:sz w:val="24"/>
-        </w:rPr>
-        <w:t>[INSERTAR CAPTURA DE LA APLICACIÓN EN EJECUCIÓN]</w:t>
-      </w:r>
-    </w:p>
-    <w:p>
-      <w:pPr>
-        <w:pStyle w:val="Normal"/>
-        <w:widowControl/>
-        <w:rPr/>
-      </w:pPr>
-      <w:r>
-        <w:rPr>
-          <w:rFonts w:eastAsia="Times New Roman"/>
-          <w:b w:val="false"/>
-          <w:i w:val="false"/>
-          <w:sz w:val="24"/>
-        </w:rPr>
-        <w:t>Descripción de la evidencia: [indicar qué se valida, acción realizada, resultado observado y dispositivo/emulador utilizado].</w:t>
+        <w:t>Acción y resultado: Se contestaron correctamente los dos ejercicios de Alfabeto y sonidos. La interfaz mostró la lección completada y conservó el estado tras recargar.</w:t>
       </w:r>
     </w:p>
     <w:p>
@@ -15915,34 +16162,57 @@
     </w:p>
     <w:p>
       <w:pPr>
-        <w:pStyle w:val="Normal"/>
+        <w:pStyle w:val="Caption"/>
+        <w:widowControl/>
+        <w:jc w:val="center"/>
+        <w:rPr/>
+      </w:pPr>
+      <w:r>
+        <w:drawing>
+          <wp:inline xmlns:a="http://schemas.openxmlformats.org/drawingml/2006/main">
+            <wp:extent cx="5715000" cy="2472497"/>
+            <wp:docPr id="26" name="Picture 26"/>
+            <wp:cNvGraphicFramePr>
+              <a:graphicFrameLocks noChangeAspect="1"/>
+            </wp:cNvGraphicFramePr>
+            <a:graphic>
+              <a:graphicData uri="http://schemas.openxmlformats.org/drawingml/2006/picture">
+                <pic:pic>
+                  <pic:nvPicPr>
+                    <pic:cNvPr id="0" name="EV-12-pronunciation.png"/>
+                    <pic:cNvPicPr/>
+                  </pic:nvPicPr>
+                  <pic:blipFill>
+                    <a:blip r:embed="rId35"/>
+                    <a:stretch>
+                      <a:fillRect/>
+                    </a:stretch>
+                  </pic:blipFill>
+                  <pic:spPr>
+                    <a:xfrm>
+                      <a:off x="0" y="0"/>
+                      <a:ext cx="5715000" cy="2472497"/>
+                    </a:xfrm>
+                    <a:prstGeom prst="rect"/>
+                  </pic:spPr>
+                </pic:pic>
+              </a:graphicData>
+            </a:graphic>
+          </wp:inline>
+        </w:drawing>
+      </w:r>
+      <w:r>
+        <w:br/>
+        <w:t>Figura. Pronunciación. Fuente: captura de la aplicación ejecutada en Expo Web, elaboración propia.</w:t>
+      </w:r>
+    </w:p>
+    <w:p>
+      <w:pPr>
         <w:widowControl/>
         <w:rPr/>
       </w:pPr>
       <w:r>
-        <w:rPr>
-          <w:rFonts w:eastAsia="Times New Roman"/>
-          <w:b w:val="false"/>
-          <w:i/>
-          <w:sz w:val="24"/>
-        </w:rPr>
-        <w:t>[INSERTAR CAPTURA DE LA APLICACIÓN EN EJECUCIÓN]</w:t>
-      </w:r>
-    </w:p>
-    <w:p>
-      <w:pPr>
-        <w:pStyle w:val="Normal"/>
-        <w:widowControl/>
-        <w:rPr/>
-      </w:pPr>
-      <w:r>
-        <w:rPr>
-          <w:rFonts w:eastAsia="Times New Roman"/>
-          <w:b w:val="false"/>
-          <w:i w:val="false"/>
-          <w:sz w:val="24"/>
-        </w:rPr>
-        <w:t>Descripción de la evidencia: [indicar qué se valida, acción realizada, resultado observado y dispositivo/emulador utilizado].</w:t>
+        <w:t>Acción y resultado: Se abrió la pantalla, se cambió de nivel y se volvió a A1. La interfaz indicó que requiere una voz alemana instalada; no se mostraron controles de audio en este entorno y la reproducción queda pendiente de verificación.</w:t>
       </w:r>
     </w:p>
     <w:p>
@@ -15959,6 +16229,21 @@
           <w:sz w:val="24"/>
         </w:rPr>
         <w:t>Se recomienda que las capturas incluyan al menos: pantalla inicial, registro o inicio de sesión, navegación principal, una actividad en curso, resumen de sesión, progreso, perfil y cualquier flujo adicional que esté implementado. Si alguna pantalla aún no está desarrollada o no puede ejecutarse, debe indicarse expresamente en lugar de insertar una imagen de diseño como si fuera evidencia.</w:t>
+      </w:r>
+    </w:p>
+    <w:p>
+      <w:pPr>
+        <w:pStyle w:val="Heading2"/>
+        <w:keepNext/>
+      </w:pPr>
+      <w:r>
+        <w:t>Matriz de pruebas funcionales y verificaciones</w:t>
+      </w:r>
+    </w:p>
+    <w:p>
+      <w:pPr/>
+      <w:r>
+        <w:t>Pruebas manuales ejecutadas en Expo Web con viewport de navegador; los datos corresponden a una cuenta local sintética. “Aprobada” se limita al flujo y entorno descritos.</w:t>
       </w:r>
     </w:p>
     <w:p>
@@ -16438,6 +16723,1074 @@
         <w:t>La separación en pantallas, componentes, contextos, servicios y datos busca facilitar el mantenimiento y la integración futura con un backend Ktor. Para que este documento funcione también como soporte de auditoría, el equipo debe completar las imágenes de wireframes y mockups, adjuntar evidencias de ejecución y comprobar los requerimientos contra el código real. Las funcionalidades descritas como planificadas o previstas no deben presentarse como terminadas sin evidencia.</w:t>
       </w:r>
     </w:p>
+    <w:tbl>
+      <w:tblPr>
+        <w:tblStyle w:val="TableGrid"/>
+        <w:tblW w:type="auto" w:w="0"/>
+        <w:jc w:val="center"/>
+        <w:tblLook w:firstColumn="1" w:firstRow="1" w:lastColumn="0" w:lastRow="0" w:noHBand="0" w:noVBand="1" w:val="04A0"/>
+      </w:tblPr>
+      <w:tblGrid>
+        <w:gridCol w:w="2340"/>
+        <w:gridCol w:w="2340"/>
+        <w:gridCol w:w="2340"/>
+        <w:gridCol w:w="2340"/>
+      </w:tblGrid>
+      <w:tr>
+        <w:tc>
+          <w:tcPr>
+            <w:tcW w:type="dxa" w:w="2340"/>
+            <w:vAlign w:val="center"/>
+          </w:tcPr>
+          <w:p>
+            <w:pPr>
+              <w:spacing w:after="40"/>
+            </w:pPr>
+            <w:r>
+              <w:rPr>
+                <w:b/>
+                <w:sz w:val="16"/>
+              </w:rPr>
+              <w:t>ID</w:t>
+            </w:r>
+          </w:p>
+        </w:tc>
+        <w:tc>
+          <w:tcPr>
+            <w:tcW w:type="dxa" w:w="2340"/>
+            <w:vAlign w:val="center"/>
+          </w:tcPr>
+          <w:p>
+            <w:pPr>
+              <w:spacing w:after="40"/>
+            </w:pPr>
+            <w:r>
+              <w:rPr>
+                <w:b/>
+                <w:sz w:val="16"/>
+              </w:rPr>
+              <w:t>Prueba / acción</w:t>
+            </w:r>
+          </w:p>
+        </w:tc>
+        <w:tc>
+          <w:tcPr>
+            <w:tcW w:type="dxa" w:w="2340"/>
+            <w:vAlign w:val="center"/>
+          </w:tcPr>
+          <w:p>
+            <w:pPr>
+              <w:spacing w:after="40"/>
+            </w:pPr>
+            <w:r>
+              <w:rPr>
+                <w:b/>
+                <w:sz w:val="16"/>
+              </w:rPr>
+              <w:t>Resultado observado</w:t>
+            </w:r>
+          </w:p>
+        </w:tc>
+        <w:tc>
+          <w:tcPr>
+            <w:tcW w:type="dxa" w:w="2340"/>
+            <w:vAlign w:val="center"/>
+          </w:tcPr>
+          <w:p>
+            <w:pPr>
+              <w:spacing w:after="40"/>
+            </w:pPr>
+            <w:r>
+              <w:rPr>
+                <w:b/>
+                <w:sz w:val="16"/>
+              </w:rPr>
+              <w:t>Estado</w:t>
+            </w:r>
+          </w:p>
+        </w:tc>
+      </w:tr>
+      <w:tr>
+        <w:tc>
+          <w:tcPr>
+            <w:tcW w:type="dxa" w:w="2340"/>
+            <w:vAlign w:val="center"/>
+          </w:tcPr>
+          <w:p>
+            <w:pPr>
+              <w:spacing w:after="40"/>
+            </w:pPr>
+            <w:r>
+              <w:rPr>
+                <w:sz w:val="16"/>
+              </w:rPr>
+              <w:t>PF-01</w:t>
+            </w:r>
+          </w:p>
+        </w:tc>
+        <w:tc>
+          <w:tcPr>
+            <w:tcW w:type="dxa" w:w="2340"/>
+            <w:vAlign w:val="center"/>
+          </w:tcPr>
+          <w:p>
+            <w:pPr>
+              <w:spacing w:after="40"/>
+            </w:pPr>
+            <w:r>
+              <w:rPr>
+                <w:sz w:val="16"/>
+              </w:rPr>
+              <w:t>Inicio, registro y validación del formulario; avanzar pasos, omitir evaluación e ingresar a la aplicación.</w:t>
+            </w:r>
+          </w:p>
+        </w:tc>
+        <w:tc>
+          <w:tcPr>
+            <w:tcW w:type="dxa" w:w="2340"/>
+            <w:vAlign w:val="center"/>
+          </w:tcPr>
+          <w:p>
+            <w:pPr>
+              <w:spacing w:after="40"/>
+            </w:pPr>
+            <w:r>
+              <w:rPr>
+                <w:sz w:val="16"/>
+              </w:rPr>
+              <w:t>Perfil de prueba creado localmente; navegación a Inicio.</w:t>
+            </w:r>
+          </w:p>
+        </w:tc>
+        <w:tc>
+          <w:tcPr>
+            <w:tcW w:type="dxa" w:w="2340"/>
+            <w:vAlign w:val="center"/>
+          </w:tcPr>
+          <w:p>
+            <w:pPr>
+              <w:spacing w:after="40"/>
+            </w:pPr>
+            <w:r>
+              <w:rPr>
+                <w:sz w:val="16"/>
+              </w:rPr>
+              <w:t>Aprobada</w:t>
+            </w:r>
+          </w:p>
+        </w:tc>
+      </w:tr>
+      <w:tr>
+        <w:tc>
+          <w:tcPr>
+            <w:tcW w:type="dxa" w:w="2340"/>
+            <w:vAlign w:val="center"/>
+          </w:tcPr>
+          <w:p>
+            <w:pPr>
+              <w:spacing w:after="40"/>
+            </w:pPr>
+            <w:r>
+              <w:rPr>
+                <w:sz w:val="16"/>
+              </w:rPr>
+              <w:t>PF-02</w:t>
+            </w:r>
+          </w:p>
+        </w:tc>
+        <w:tc>
+          <w:tcPr>
+            <w:tcW w:type="dxa" w:w="2340"/>
+            <w:vAlign w:val="center"/>
+          </w:tcPr>
+          <w:p>
+            <w:pPr>
+              <w:spacing w:after="40"/>
+            </w:pPr>
+            <w:r>
+              <w:rPr>
+                <w:sz w:val="16"/>
+              </w:rPr>
+              <w:t>Cerrar sesión e iniciar sesión con la cuenta sintética.</w:t>
+            </w:r>
+          </w:p>
+        </w:tc>
+        <w:tc>
+          <w:tcPr>
+            <w:tcW w:type="dxa" w:w="2340"/>
+            <w:vAlign w:val="center"/>
+          </w:tcPr>
+          <w:p>
+            <w:pPr>
+              <w:spacing w:after="40"/>
+            </w:pPr>
+            <w:r>
+              <w:rPr>
+                <w:sz w:val="16"/>
+              </w:rPr>
+              <w:t>Regreso a la aplicación con el mismo perfil local.</w:t>
+            </w:r>
+          </w:p>
+        </w:tc>
+        <w:tc>
+          <w:tcPr>
+            <w:tcW w:type="dxa" w:w="2340"/>
+            <w:vAlign w:val="center"/>
+          </w:tcPr>
+          <w:p>
+            <w:pPr>
+              <w:spacing w:after="40"/>
+            </w:pPr>
+            <w:r>
+              <w:rPr>
+                <w:sz w:val="16"/>
+              </w:rPr>
+              <w:t>Aprobada</w:t>
+            </w:r>
+          </w:p>
+        </w:tc>
+      </w:tr>
+      <w:tr>
+        <w:tc>
+          <w:tcPr>
+            <w:tcW w:type="dxa" w:w="2340"/>
+            <w:vAlign w:val="center"/>
+          </w:tcPr>
+          <w:p>
+            <w:pPr>
+              <w:spacing w:after="40"/>
+            </w:pPr>
+            <w:r>
+              <w:rPr>
+                <w:sz w:val="16"/>
+              </w:rPr>
+              <w:t>PF-03</w:t>
+            </w:r>
+          </w:p>
+        </w:tc>
+        <w:tc>
+          <w:tcPr>
+            <w:tcW w:type="dxa" w:w="2340"/>
+            <w:vAlign w:val="center"/>
+          </w:tcPr>
+          <w:p>
+            <w:pPr>
+              <w:spacing w:after="40"/>
+            </w:pPr>
+            <w:r>
+              <w:rPr>
+                <w:sz w:val="16"/>
+              </w:rPr>
+              <w:t>Navegación por Inicio, Actividades, Progreso y Perfil.</w:t>
+            </w:r>
+          </w:p>
+        </w:tc>
+        <w:tc>
+          <w:tcPr>
+            <w:tcW w:type="dxa" w:w="2340"/>
+            <w:vAlign w:val="center"/>
+          </w:tcPr>
+          <w:p>
+            <w:pPr>
+              <w:spacing w:after="40"/>
+            </w:pPr>
+            <w:r>
+              <w:rPr>
+                <w:sz w:val="16"/>
+              </w:rPr>
+              <w:t>Las cuatro pestañas abren su pantalla correspondiente.</w:t>
+            </w:r>
+          </w:p>
+        </w:tc>
+        <w:tc>
+          <w:tcPr>
+            <w:tcW w:type="dxa" w:w="2340"/>
+            <w:vAlign w:val="center"/>
+          </w:tcPr>
+          <w:p>
+            <w:pPr>
+              <w:spacing w:after="40"/>
+            </w:pPr>
+            <w:r>
+              <w:rPr>
+                <w:sz w:val="16"/>
+              </w:rPr>
+              <w:t>Aprobada</w:t>
+            </w:r>
+          </w:p>
+        </w:tc>
+      </w:tr>
+      <w:tr>
+        <w:tc>
+          <w:tcPr>
+            <w:tcW w:type="dxa" w:w="2340"/>
+            <w:vAlign w:val="center"/>
+          </w:tcPr>
+          <w:p>
+            <w:pPr>
+              <w:spacing w:after="40"/>
+            </w:pPr>
+            <w:r>
+              <w:rPr>
+                <w:sz w:val="16"/>
+              </w:rPr>
+              <w:t>PF-04</w:t>
+            </w:r>
+          </w:p>
+        </w:tc>
+        <w:tc>
+          <w:tcPr>
+            <w:tcW w:type="dxa" w:w="2340"/>
+            <w:vAlign w:val="center"/>
+          </w:tcPr>
+          <w:p>
+            <w:pPr>
+              <w:spacing w:after="40"/>
+            </w:pPr>
+            <w:r>
+              <w:rPr>
+                <w:sz w:val="16"/>
+              </w:rPr>
+              <w:t>Filtrar Actividades por A1/A2, abrir lección y cerrar.</w:t>
+            </w:r>
+          </w:p>
+        </w:tc>
+        <w:tc>
+          <w:tcPr>
+            <w:tcW w:type="dxa" w:w="2340"/>
+            <w:vAlign w:val="center"/>
+          </w:tcPr>
+          <w:p>
+            <w:pPr>
+              <w:spacing w:after="40"/>
+            </w:pPr>
+            <w:r>
+              <w:rPr>
+                <w:sz w:val="16"/>
+              </w:rPr>
+              <w:t>Catálogo cambia por nivel; cerrar retorna a Actividades.</w:t>
+            </w:r>
+          </w:p>
+        </w:tc>
+        <w:tc>
+          <w:tcPr>
+            <w:tcW w:type="dxa" w:w="2340"/>
+            <w:vAlign w:val="center"/>
+          </w:tcPr>
+          <w:p>
+            <w:pPr>
+              <w:spacing w:after="40"/>
+            </w:pPr>
+            <w:r>
+              <w:rPr>
+                <w:sz w:val="16"/>
+              </w:rPr>
+              <w:t>Aprobada</w:t>
+            </w:r>
+          </w:p>
+        </w:tc>
+      </w:tr>
+      <w:tr>
+        <w:tc>
+          <w:tcPr>
+            <w:tcW w:type="dxa" w:w="2340"/>
+            <w:vAlign w:val="center"/>
+          </w:tcPr>
+          <w:p>
+            <w:pPr>
+              <w:spacing w:after="40"/>
+            </w:pPr>
+            <w:r>
+              <w:rPr>
+                <w:sz w:val="16"/>
+              </w:rPr>
+              <w:t>PF-05</w:t>
+            </w:r>
+          </w:p>
+        </w:tc>
+        <w:tc>
+          <w:tcPr>
+            <w:tcW w:type="dxa" w:w="2340"/>
+            <w:vAlign w:val="center"/>
+          </w:tcPr>
+          <w:p>
+            <w:pPr>
+              <w:spacing w:after="40"/>
+            </w:pPr>
+            <w:r>
+              <w:rPr>
+                <w:sz w:val="16"/>
+              </w:rPr>
+              <w:t>Completar tres preguntas de Vocabulario básico y abrir resumen.</w:t>
+            </w:r>
+          </w:p>
+        </w:tc>
+        <w:tc>
+          <w:tcPr>
+            <w:tcW w:type="dxa" w:w="2340"/>
+            <w:vAlign w:val="center"/>
+          </w:tcPr>
+          <w:p>
+            <w:pPr>
+              <w:spacing w:after="40"/>
+            </w:pPr>
+            <w:r>
+              <w:rPr>
+                <w:sz w:val="16"/>
+              </w:rPr>
+              <w:t>Resumen 3/3, 100 %, +50 XP; Volver retorna al origen.</w:t>
+            </w:r>
+          </w:p>
+        </w:tc>
+        <w:tc>
+          <w:tcPr>
+            <w:tcW w:type="dxa" w:w="2340"/>
+            <w:vAlign w:val="center"/>
+          </w:tcPr>
+          <w:p>
+            <w:pPr>
+              <w:spacing w:after="40"/>
+            </w:pPr>
+            <w:r>
+              <w:rPr>
+                <w:sz w:val="16"/>
+              </w:rPr>
+              <w:t>Aprobada</w:t>
+            </w:r>
+          </w:p>
+        </w:tc>
+      </w:tr>
+      <w:tr>
+        <w:tc>
+          <w:tcPr>
+            <w:tcW w:type="dxa" w:w="2340"/>
+            <w:vAlign w:val="center"/>
+          </w:tcPr>
+          <w:p>
+            <w:pPr>
+              <w:spacing w:after="40"/>
+            </w:pPr>
+            <w:r>
+              <w:rPr>
+                <w:sz w:val="16"/>
+              </w:rPr>
+              <w:t>PF-06</w:t>
+            </w:r>
+          </w:p>
+        </w:tc>
+        <w:tc>
+          <w:tcPr>
+            <w:tcW w:type="dxa" w:w="2340"/>
+            <w:vAlign w:val="center"/>
+          </w:tcPr>
+          <w:p>
+            <w:pPr>
+              <w:spacing w:after="40"/>
+            </w:pPr>
+            <w:r>
+              <w:rPr>
+                <w:sz w:val="16"/>
+              </w:rPr>
+              <w:t>Consultar vocabulario y responder las tres preguntas de Lecturas.</w:t>
+            </w:r>
+          </w:p>
+        </w:tc>
+        <w:tc>
+          <w:tcPr>
+            <w:tcW w:type="dxa" w:w="2340"/>
+            <w:vAlign w:val="center"/>
+          </w:tcPr>
+          <w:p>
+            <w:pPr>
+              <w:spacing w:after="40"/>
+            </w:pPr>
+            <w:r>
+              <w:rPr>
+                <w:sz w:val="16"/>
+              </w:rPr>
+              <w:t>Retroalimentación correcta y progreso de lectura guardado tras recarga.</w:t>
+            </w:r>
+          </w:p>
+        </w:tc>
+        <w:tc>
+          <w:tcPr>
+            <w:tcW w:type="dxa" w:w="2340"/>
+            <w:vAlign w:val="center"/>
+          </w:tcPr>
+          <w:p>
+            <w:pPr>
+              <w:spacing w:after="40"/>
+            </w:pPr>
+            <w:r>
+              <w:rPr>
+                <w:sz w:val="16"/>
+              </w:rPr>
+              <w:t>Aprobada</w:t>
+            </w:r>
+          </w:p>
+        </w:tc>
+      </w:tr>
+      <w:tr>
+        <w:tc>
+          <w:tcPr>
+            <w:tcW w:type="dxa" w:w="2340"/>
+            <w:vAlign w:val="center"/>
+          </w:tcPr>
+          <w:p>
+            <w:pPr>
+              <w:spacing w:after="40"/>
+            </w:pPr>
+            <w:r>
+              <w:rPr>
+                <w:sz w:val="16"/>
+              </w:rPr>
+              <w:t>PF-07</w:t>
+            </w:r>
+          </w:p>
+        </w:tc>
+        <w:tc>
+          <w:tcPr>
+            <w:tcW w:type="dxa" w:w="2340"/>
+            <w:vAlign w:val="center"/>
+          </w:tcPr>
+          <w:p>
+            <w:pPr>
+              <w:spacing w:after="40"/>
+            </w:pPr>
+            <w:r>
+              <w:rPr>
+                <w:sz w:val="16"/>
+              </w:rPr>
+              <w:t>Responder los dos ejercicios de Alfabeto y sonidos.</w:t>
+            </w:r>
+          </w:p>
+        </w:tc>
+        <w:tc>
+          <w:tcPr>
+            <w:tcW w:type="dxa" w:w="2340"/>
+            <w:vAlign w:val="center"/>
+          </w:tcPr>
+          <w:p>
+            <w:pPr>
+              <w:spacing w:after="40"/>
+            </w:pPr>
+            <w:r>
+              <w:rPr>
+                <w:sz w:val="16"/>
+              </w:rPr>
+              <w:t>La interfaz marca la lección completada; estado presente tras recarga.</w:t>
+            </w:r>
+          </w:p>
+        </w:tc>
+        <w:tc>
+          <w:tcPr>
+            <w:tcW w:type="dxa" w:w="2340"/>
+            <w:vAlign w:val="center"/>
+          </w:tcPr>
+          <w:p>
+            <w:pPr>
+              <w:spacing w:after="40"/>
+            </w:pPr>
+            <w:r>
+              <w:rPr>
+                <w:sz w:val="16"/>
+              </w:rPr>
+              <w:t>Aprobada</w:t>
+            </w:r>
+          </w:p>
+        </w:tc>
+      </w:tr>
+      <w:tr>
+        <w:tc>
+          <w:tcPr>
+            <w:tcW w:type="dxa" w:w="2340"/>
+            <w:vAlign w:val="center"/>
+          </w:tcPr>
+          <w:p>
+            <w:pPr>
+              <w:spacing w:after="40"/>
+            </w:pPr>
+            <w:r>
+              <w:rPr>
+                <w:sz w:val="16"/>
+              </w:rPr>
+              <w:t>PF-08</w:t>
+            </w:r>
+          </w:p>
+        </w:tc>
+        <w:tc>
+          <w:tcPr>
+            <w:tcW w:type="dxa" w:w="2340"/>
+            <w:vAlign w:val="center"/>
+          </w:tcPr>
+          <w:p>
+            <w:pPr>
+              <w:spacing w:after="40"/>
+            </w:pPr>
+            <w:r>
+              <w:rPr>
+                <w:sz w:val="16"/>
+              </w:rPr>
+              <w:t>Cambiar meta y nombre en Perfil; guardar y recargar.</w:t>
+            </w:r>
+          </w:p>
+        </w:tc>
+        <w:tc>
+          <w:tcPr>
+            <w:tcW w:type="dxa" w:w="2340"/>
+            <w:vAlign w:val="center"/>
+          </w:tcPr>
+          <w:p>
+            <w:pPr>
+              <w:spacing w:after="40"/>
+            </w:pPr>
+            <w:r>
+              <w:rPr>
+                <w:sz w:val="16"/>
+              </w:rPr>
+              <w:t>Ambos cambios persisten en almacenamiento local.</w:t>
+            </w:r>
+          </w:p>
+        </w:tc>
+        <w:tc>
+          <w:tcPr>
+            <w:tcW w:type="dxa" w:w="2340"/>
+            <w:vAlign w:val="center"/>
+          </w:tcPr>
+          <w:p>
+            <w:pPr>
+              <w:spacing w:after="40"/>
+            </w:pPr>
+            <w:r>
+              <w:rPr>
+                <w:sz w:val="16"/>
+              </w:rPr>
+              <w:t>Aprobada</w:t>
+            </w:r>
+          </w:p>
+        </w:tc>
+      </w:tr>
+      <w:tr>
+        <w:tc>
+          <w:tcPr>
+            <w:tcW w:type="dxa" w:w="2340"/>
+            <w:vAlign w:val="center"/>
+          </w:tcPr>
+          <w:p>
+            <w:pPr>
+              <w:spacing w:after="40"/>
+            </w:pPr>
+            <w:r>
+              <w:rPr>
+                <w:sz w:val="16"/>
+              </w:rPr>
+              <w:t>PF-09</w:t>
+            </w:r>
+          </w:p>
+        </w:tc>
+        <w:tc>
+          <w:tcPr>
+            <w:tcW w:type="dxa" w:w="2340"/>
+            <w:vAlign w:val="center"/>
+          </w:tcPr>
+          <w:p>
+            <w:pPr>
+              <w:spacing w:after="40"/>
+            </w:pPr>
+            <w:r>
+              <w:rPr>
+                <w:sz w:val="16"/>
+              </w:rPr>
+              <w:t>Abrir Pronunciación y cambiar de nivel.</w:t>
+            </w:r>
+          </w:p>
+        </w:tc>
+        <w:tc>
+          <w:tcPr>
+            <w:tcW w:type="dxa" w:w="2340"/>
+            <w:vAlign w:val="center"/>
+          </w:tcPr>
+          <w:p>
+            <w:pPr>
+              <w:spacing w:after="40"/>
+            </w:pPr>
+            <w:r>
+              <w:rPr>
+                <w:sz w:val="16"/>
+              </w:rPr>
+              <w:t>Pantalla y selección de nivel disponibles; no se detectó voz alemana/control de audio.</w:t>
+            </w:r>
+          </w:p>
+        </w:tc>
+        <w:tc>
+          <w:tcPr>
+            <w:tcW w:type="dxa" w:w="2340"/>
+            <w:vAlign w:val="center"/>
+          </w:tcPr>
+          <w:p>
+            <w:pPr>
+              <w:spacing w:after="40"/>
+            </w:pPr>
+            <w:r>
+              <w:rPr>
+                <w:sz w:val="16"/>
+              </w:rPr>
+              <w:t>Parcial; audio bloqueado por voz ausente</w:t>
+            </w:r>
+          </w:p>
+        </w:tc>
+      </w:tr>
+      <w:tr>
+        <w:tc>
+          <w:tcPr>
+            <w:tcW w:type="dxa" w:w="2340"/>
+            <w:vAlign w:val="center"/>
+          </w:tcPr>
+          <w:p>
+            <w:pPr>
+              <w:spacing w:after="40"/>
+            </w:pPr>
+            <w:r>
+              <w:rPr>
+                <w:sz w:val="16"/>
+              </w:rPr>
+              <w:t>PF-10</w:t>
+            </w:r>
+          </w:p>
+        </w:tc>
+        <w:tc>
+          <w:tcPr>
+            <w:tcW w:type="dxa" w:w="2340"/>
+            <w:vAlign w:val="center"/>
+          </w:tcPr>
+          <w:p>
+            <w:pPr>
+              <w:spacing w:after="40"/>
+            </w:pPr>
+            <w:r>
+              <w:rPr>
+                <w:sz w:val="16"/>
+              </w:rPr>
+              <w:t>Recargar la aplicación después de completar los flujos.</w:t>
+            </w:r>
+          </w:p>
+        </w:tc>
+        <w:tc>
+          <w:tcPr>
+            <w:tcW w:type="dxa" w:w="2340"/>
+            <w:vAlign w:val="center"/>
+          </w:tcPr>
+          <w:p>
+            <w:pPr>
+              <w:spacing w:after="40"/>
+            </w:pPr>
+            <w:r>
+              <w:rPr>
+                <w:sz w:val="16"/>
+              </w:rPr>
+              <w:t>Se restaura la sesión y se conservan perfil y avances comprobados.</w:t>
+            </w:r>
+          </w:p>
+        </w:tc>
+        <w:tc>
+          <w:tcPr>
+            <w:tcW w:type="dxa" w:w="2340"/>
+            <w:vAlign w:val="center"/>
+          </w:tcPr>
+          <w:p>
+            <w:pPr>
+              <w:spacing w:after="40"/>
+            </w:pPr>
+            <w:r>
+              <w:rPr>
+                <w:sz w:val="16"/>
+              </w:rPr>
+              <w:t>Aprobada</w:t>
+            </w:r>
+          </w:p>
+        </w:tc>
+      </w:tr>
+      <w:tr>
+        <w:tc>
+          <w:tcPr>
+            <w:tcW w:type="dxa" w:w="2340"/>
+            <w:vAlign w:val="center"/>
+          </w:tcPr>
+          <w:p>
+            <w:pPr>
+              <w:spacing w:after="40"/>
+            </w:pPr>
+            <w:r>
+              <w:rPr>
+                <w:sz w:val="16"/>
+              </w:rPr>
+              <w:t>PA-01</w:t>
+            </w:r>
+          </w:p>
+        </w:tc>
+        <w:tc>
+          <w:tcPr>
+            <w:tcW w:type="dxa" w:w="2340"/>
+            <w:vAlign w:val="center"/>
+          </w:tcPr>
+          <w:p>
+            <w:pPr>
+              <w:spacing w:after="40"/>
+            </w:pPr>
+            <w:r>
+              <w:rPr>
+                <w:sz w:val="16"/>
+              </w:rPr>
+              <w:t>Suite automatizada `npm test`.</w:t>
+            </w:r>
+          </w:p>
+        </w:tc>
+        <w:tc>
+          <w:tcPr>
+            <w:tcW w:type="dxa" w:w="2340"/>
+            <w:vAlign w:val="center"/>
+          </w:tcPr>
+          <w:p>
+            <w:pPr>
+              <w:spacing w:after="40"/>
+            </w:pPr>
+            <w:r>
+              <w:rPr>
+                <w:sz w:val="16"/>
+              </w:rPr>
+              <w:t>33 pruebas aprobadas, 0 fallidas.</w:t>
+            </w:r>
+          </w:p>
+        </w:tc>
+        <w:tc>
+          <w:tcPr>
+            <w:tcW w:type="dxa" w:w="2340"/>
+            <w:vAlign w:val="center"/>
+          </w:tcPr>
+          <w:p>
+            <w:pPr>
+              <w:spacing w:after="40"/>
+            </w:pPr>
+            <w:r>
+              <w:rPr>
+                <w:sz w:val="16"/>
+              </w:rPr>
+              <w:t>Aprobada</w:t>
+            </w:r>
+          </w:p>
+        </w:tc>
+      </w:tr>
+      <w:tr>
+        <w:tc>
+          <w:tcPr>
+            <w:tcW w:type="dxa" w:w="2340"/>
+            <w:vAlign w:val="center"/>
+          </w:tcPr>
+          <w:p>
+            <w:pPr>
+              <w:spacing w:after="40"/>
+            </w:pPr>
+            <w:r>
+              <w:rPr>
+                <w:sz w:val="16"/>
+              </w:rPr>
+              <w:t>PA-02</w:t>
+            </w:r>
+          </w:p>
+        </w:tc>
+        <w:tc>
+          <w:tcPr>
+            <w:tcW w:type="dxa" w:w="2340"/>
+            <w:vAlign w:val="center"/>
+          </w:tcPr>
+          <w:p>
+            <w:pPr>
+              <w:spacing w:after="40"/>
+            </w:pPr>
+            <w:r>
+              <w:rPr>
+                <w:sz w:val="16"/>
+              </w:rPr>
+              <w:t>Consola y compilación de Expo Web.</w:t>
+            </w:r>
+          </w:p>
+        </w:tc>
+        <w:tc>
+          <w:tcPr>
+            <w:tcW w:type="dxa" w:w="2340"/>
+            <w:vAlign w:val="center"/>
+          </w:tcPr>
+          <w:p>
+            <w:pPr>
+              <w:spacing w:after="40"/>
+            </w:pPr>
+            <w:r>
+              <w:rPr>
+                <w:sz w:val="16"/>
+              </w:rPr>
+              <w:t>Bundle web compilado (731 módulos); aviso de icono inválido corregido y la pantalla Actividades posterior cargó sin advertencias de iconos.</w:t>
+            </w:r>
+          </w:p>
+        </w:tc>
+        <w:tc>
+          <w:tcPr>
+            <w:tcW w:type="dxa" w:w="2340"/>
+            <w:vAlign w:val="center"/>
+          </w:tcPr>
+          <w:p>
+            <w:pPr>
+              <w:spacing w:after="40"/>
+            </w:pPr>
+            <w:r>
+              <w:rPr>
+                <w:sz w:val="16"/>
+              </w:rPr>
+              <w:t>Aprobada tras corrección</w:t>
+            </w:r>
+          </w:p>
+        </w:tc>
+      </w:tr>
+      <w:tr>
+        <w:tc>
+          <w:tcPr>
+            <w:tcW w:type="dxa" w:w="2340"/>
+            <w:vAlign w:val="center"/>
+          </w:tcPr>
+          <w:p>
+            <w:pPr>
+              <w:spacing w:after="40"/>
+            </w:pPr>
+            <w:r>
+              <w:rPr>
+                <w:sz w:val="16"/>
+              </w:rPr>
+              <w:t>PA-03</w:t>
+            </w:r>
+          </w:p>
+        </w:tc>
+        <w:tc>
+          <w:tcPr>
+            <w:tcW w:type="dxa" w:w="2340"/>
+            <w:vAlign w:val="center"/>
+          </w:tcPr>
+          <w:p>
+            <w:pPr>
+              <w:spacing w:after="40"/>
+            </w:pPr>
+            <w:r>
+              <w:rPr>
+                <w:sz w:val="16"/>
+              </w:rPr>
+              <w:t>Audio de voz alemana en navegador/dispositivo.</w:t>
+            </w:r>
+          </w:p>
+        </w:tc>
+        <w:tc>
+          <w:tcPr>
+            <w:tcW w:type="dxa" w:w="2340"/>
+            <w:vAlign w:val="center"/>
+          </w:tcPr>
+          <w:p>
+            <w:pPr>
+              <w:spacing w:after="40"/>
+            </w:pPr>
+            <w:r>
+              <w:rPr>
+                <w:sz w:val="16"/>
+              </w:rPr>
+              <w:t>No había voz disponible; no se pudo ejecutar reproducción real.</w:t>
+            </w:r>
+          </w:p>
+        </w:tc>
+        <w:tc>
+          <w:tcPr>
+            <w:tcW w:type="dxa" w:w="2340"/>
+            <w:vAlign w:val="center"/>
+          </w:tcPr>
+          <w:p>
+            <w:pPr>
+              <w:spacing w:after="40"/>
+            </w:pPr>
+            <w:r>
+              <w:rPr>
+                <w:sz w:val="16"/>
+              </w:rPr>
+              <w:t>Bloqueada</w:t>
+            </w:r>
+          </w:p>
+        </w:tc>
+      </w:tr>
+      <w:tr>
+        <w:tc>
+          <w:tcPr>
+            <w:tcW w:type="dxa" w:w="2340"/>
+            <w:vAlign w:val="center"/>
+          </w:tcPr>
+          <w:p>
+            <w:pPr>
+              <w:spacing w:after="40"/>
+            </w:pPr>
+            <w:r>
+              <w:rPr>
+                <w:sz w:val="16"/>
+              </w:rPr>
+              <w:t>PA-04</w:t>
+            </w:r>
+          </w:p>
+        </w:tc>
+        <w:tc>
+          <w:tcPr>
+            <w:tcW w:type="dxa" w:w="2340"/>
+            <w:vAlign w:val="center"/>
+          </w:tcPr>
+          <w:p>
+            <w:pPr>
+              <w:spacing w:after="40"/>
+            </w:pPr>
+            <w:r>
+              <w:rPr>
+                <w:sz w:val="16"/>
+              </w:rPr>
+              <w:t>Ejecución en Android/iOS, emuladores y lectores de pantalla.</w:t>
+            </w:r>
+          </w:p>
+        </w:tc>
+        <w:tc>
+          <w:tcPr>
+            <w:tcW w:type="dxa" w:w="2340"/>
+            <w:vAlign w:val="center"/>
+          </w:tcPr>
+          <w:p>
+            <w:pPr>
+              <w:spacing w:after="40"/>
+            </w:pPr>
+            <w:r>
+              <w:rPr>
+                <w:sz w:val="16"/>
+              </w:rPr>
+              <w:t>Sin adb/Android SDK ni Xcode en el entorno.</w:t>
+            </w:r>
+          </w:p>
+        </w:tc>
+        <w:tc>
+          <w:tcPr>
+            <w:tcW w:type="dxa" w:w="2340"/>
+            <w:vAlign w:val="center"/>
+          </w:tcPr>
+          <w:p>
+            <w:pPr>
+              <w:spacing w:after="40"/>
+            </w:pPr>
+            <w:r>
+              <w:rPr>
+                <w:sz w:val="16"/>
+              </w:rPr>
+              <w:t>No ejecutada</w:t>
+            </w:r>
+          </w:p>
+        </w:tc>
+      </w:tr>
+    </w:tbl>
     <w:sectPr>
       <w:headerReference w:type="even" r:id="rId2"/>
       <w:headerReference w:type="default" r:id="rId3"/>

</xml_diff>